<commit_message>
Revise seminar against common-mistakes checklist
Add developmental, ecological and disability-diversity sections; institutional
ethics approval; anti-generalization framing; new theme on out-of-class
environment; six additional references.

Co-Authored-By: Claude Fable 5 <noreply@anthropic.com>
Claude-Session: https://claude.ai/code/session_01SLEdWJeTzqGJbSWTzfumWY
</commit_message>
<xml_diff>
--- a/seminar/سمينار - دور التكنولوجيا في تطوير أساليب التدريس.docx
+++ b/seminar/سمينار - دور التكنولوجيا في تطوير أساليب التدريس.docx
@@ -426,6 +426,23 @@
           <w:szCs w:val="28"/>
           <w:rtl/>
         </w:rPr>
+        <w:t xml:space="preserve">الخصائص التطورية للمرحلة ما فوق الابتدائية</w:t>
+      </w:r>
+    </w:p>
+    <w:p>
+      <w:pPr>
+        <w:bidi/>
+        <w:spacing w:after="120" w:line="360" w:lineRule="auto"/>
+        <w:jc w:val="both"/>
+      </w:pPr>
+      <w:r>
+        <w:rPr>
+          <w:rFonts w:ascii="Simplified Arabic" w:cs="Simplified Arabic" w:eastAsia="Simplified Arabic" w:hAnsi="Simplified Arabic"/>
+          <w:b w:val="false"/>
+          <w:sz w:val="28"/>
+          <w:szCs w:val="28"/>
+          <w:rtl/>
+        </w:rPr>
         <w:t xml:space="preserve">النماذج النظرية لدمج التكنولوجيا في التدريس</w:t>
       </w:r>
     </w:p>
@@ -478,6 +495,40 @@
           <w:rtl/>
         </w:rPr>
         <w:t xml:space="preserve">التدريس المتمايز ومراعاة الفروق الفردية</w:t>
+      </w:r>
+    </w:p>
+    <w:p>
+      <w:pPr>
+        <w:bidi/>
+        <w:spacing w:after="120" w:line="360" w:lineRule="auto"/>
+        <w:jc w:val="both"/>
+      </w:pPr>
+      <w:r>
+        <w:rPr>
+          <w:rFonts w:ascii="Simplified Arabic" w:cs="Simplified Arabic" w:eastAsia="Simplified Arabic" w:hAnsi="Simplified Arabic"/>
+          <w:b w:val="false"/>
+          <w:sz w:val="28"/>
+          <w:szCs w:val="28"/>
+          <w:rtl/>
+        </w:rPr>
+        <w:t xml:space="preserve">التأثيرات البيئية: البيت والمدرسة والمجتمع</w:t>
+      </w:r>
+    </w:p>
+    <w:p>
+      <w:pPr>
+        <w:bidi/>
+        <w:spacing w:after="120" w:line="360" w:lineRule="auto"/>
+        <w:jc w:val="both"/>
+      </w:pPr>
+      <w:r>
+        <w:rPr>
+          <w:rFonts w:ascii="Simplified Arabic" w:cs="Simplified Arabic" w:eastAsia="Simplified Arabic" w:hAnsi="Simplified Arabic"/>
+          <w:b w:val="false"/>
+          <w:sz w:val="28"/>
+          <w:szCs w:val="28"/>
+          <w:rtl/>
+        </w:rPr>
+        <w:t xml:space="preserve">التكنولوجيا والطلاب ذوو صعوبات التعلم والإعاقات</w:t>
       </w:r>
     </w:p>
     <w:p>
@@ -785,24 +836,24 @@
           <w:szCs w:val="28"/>
           <w:rtl/>
         </w:rPr>
-        <w:t xml:space="preserve">هدف هذا البحث إلى التعرّف على الطريقة التي يدرك بها المعلمون في المرحلة ما فوق الابتدائية دور التكنولوجيا في تطوير أساليب تدريسهم، وإلى الكشف عن أثر هذا الدمج في التعلم والعلاقة التربوية، وعن الصعوبات التي تعترض المعلمين في أثنائه. البحث من النوع الكيفي الظاهراتي، واعتمد على مقابلات شبه منظمة مبنية من ثلاثة محاور أساسية تضمّ خمسة عشر سؤالاً، أُجريت مع ثمانية معلمين ومعلمات، أربعة منهم يدرّسون في المرحلة الإعدادية وأربعة في المرحلة الثانوية، وتراوحت خبرتهم بين ست سنوات وسبع وعشرين سنة. جرى تحليل المعطيات وفق منهجية تحليل الإطار الكيفي، بترميز مفتوح ثم محوري ثم انتقائي، حتى انبثقت ست ثيمات مركزية.</w:t>
-      </w:r>
-    </w:p>
-    <w:p>
-      <w:pPr>
-        <w:bidi/>
-        <w:spacing w:after="120" w:line="360" w:lineRule="auto"/>
-        <w:jc w:val="both"/>
-      </w:pPr>
-      <w:r>
-        <w:rPr>
-          <w:rFonts w:ascii="Simplified Arabic" w:cs="Simplified Arabic" w:eastAsia="Simplified Arabic" w:hAnsi="Simplified Arabic"/>
-          <w:b w:val="false"/>
-          <w:sz w:val="28"/>
-          <w:szCs w:val="28"/>
-          <w:rtl/>
-        </w:rPr>
-        <w:t xml:space="preserve">أشارت النتائج إلى إجماع بين المشتركين على أنّ الأدوات الرقمية نقلت الغرفة الصفية من التلقين السلبي إلى بيئة تفاعلية نشطة، وعلى أنّها قلّصت الفجوة الوجدانية والجيلية بين المعلم والطالب ووسّعت الدعم إلى ما بعد ساعات الدوام، وعلى أنّها أتاحت تدريساً متمايزاً يخدم الطلاب ذوي التحصيل المنخفض. في المقابل ظهر خلاف واضح حول وتيرة الدمج وكثافته: بين من يراه ضرورة يومية وبين من يشترط أن يأتي بعد الشرح التقليدي. وظهر خلاف أعمق حول الأثر المهاري، إذ حذّر جزء من المشتركين من تراجع في الإملاء والحفظ والتركيز، بينما ركّز آخرون على المكاسب في التنظيم وتوفير الوقت. كما تبيّن أنّ التحديات الأساسية ليست تقنية بحتة بل بنيوية ومهنية: البنية التحتية، ضيق الحصة، غياب المرافقة المهنية المستمرة، وصعوبة التعامل مع الذكاء الاصطناعي التوليدي في المهام البيتية.</w:t>
+        <w:t xml:space="preserve">هدف هذا البحث إلى التعرّف على الطريقة التي يدرك بها المعلمون في المرحلة ما فوق الابتدائية دور التكنولوجيا في تطوير أساليب تدريسهم، وإلى الكشف عن أثر هذا الدمج في التعلم والعلاقة التربوية، وعن الصعوبات التي تعترض المعلمين في أثنائه. البحث من النوع الكيفي الظاهراتي، واعتمد على مقابلات شبه منظمة مبنية من ثلاثة محاور أساسية تضمّ خمسة عشر سؤالاً، أُجريت مع ثمانية معلمين ومعلمات، أربعة منهم يدرّسون في المرحلة الإعدادية وأربعة في المرحلة الثانوية، وتراوحت خبرتهم بين ست سنوات وسبع وعشرين سنة. جرى تحليل المعطيات وفق منهجية تحليل الإطار الكيفي، بترميز مفتوح ثم محوري ثم انتقائي، حتى انبثقت سبع ثيمات مركزية. وبما أنّ البحث كيفي، فإنّ نتائجه تصف هؤلاء المشتركين في سياقهم ولا تُقرأ بوصفها تعميماً على معلمي المرحلة.</w:t>
+      </w:r>
+    </w:p>
+    <w:p>
+      <w:pPr>
+        <w:bidi/>
+        <w:spacing w:after="120" w:line="360" w:lineRule="auto"/>
+        <w:jc w:val="both"/>
+      </w:pPr>
+      <w:r>
+        <w:rPr>
+          <w:rFonts w:ascii="Simplified Arabic" w:cs="Simplified Arabic" w:eastAsia="Simplified Arabic" w:hAnsi="Simplified Arabic"/>
+          <w:b w:val="false"/>
+          <w:sz w:val="28"/>
+          <w:szCs w:val="28"/>
+          <w:rtl/>
+        </w:rPr>
+        <w:t xml:space="preserve">أشارت النتائج إلى إجماع بين المشتركين على أنّ الأدوات الرقمية نقلت الغرفة الصفية من التلقين السلبي إلى بيئة تفاعلية نشطة، وعلى أنّها قلّصت الفجوة الوجدانية والجيلية بين المعلم والطالب ووسّعت الدعم إلى ما بعد ساعات الدوام، وعلى أنّها أتاحت تدريساً متمايزاً يخدم الطلاب ذوي التحصيل المنخفض، مع تمييز واضح بين هؤلاء وبين الطلاب ذوي صعوبات التعلم المشخّصة الذين تختلف حاجاتهم باختلاف صعوباتهم. في المقابل ظهر خلاف واضح حول وتيرة الدمج وكثافته: بين من يراه ضرورة يومية وبين من يشترط أن يأتي بعد الشرح التقليدي. وظهر خلاف أعمق حول الأثر المهاري، إذ حذّر جزء من المشتركين من تراجع في الإملاء والحفظ والتركيز، بينما ركّز آخرون على المكاسب في التنظيم وتوفير الوقت. كما تبيّن أنّ التحديات الأساسية ليست تقنية بحتة بل بنيوية ومهنية: البنية التحتية، ضيق الحصة، غياب المرافقة المهنية المستمرة، وصعوبة التعامل مع الذكاء الاصطناعي التوليدي في المهام البيتية. وبرزت كذلك ثيمة لم تكن مخطّطة في الأداة، تتعلّق ببيئة الطالب خارج الصفّ، إذ ربط المشتركون جدوى المهامّ الرقمية البيتية بموارد البيت وبتوفّر الموارد الرقمية بالعربية.</w:t>
       </w:r>
     </w:p>
     <w:p>
@@ -881,7 +932,26 @@
           <w:szCs w:val="28"/>
           <w:rtl/>
         </w:rPr>
-        <w:t xml:space="preserve">المرحلة ما فوق الابتدائية، أي المرحلتان الإعدادية والثانوية، تحمل خصوصية تجعل هذا السؤال أشدّ إلحاحاً. الطلاب في هذه المرحلة يمرّون بمرحلة المراهقة بما فيها من بحث عن الاستقلالية والهوية، وهم في الوقت ذاته المستخدمون الأكثف للأجهزة الذكية خارج المدرسة. هذه الازدواجية تضع المعلم أمام موقف مركّب: الأداة التي تجذب انتباه الطالب هي نفسها الأداة التي تنافس المعلم على هذا الانتباه. وقد بيّنت الأدبيات أنّ الافتراض الشائع بأنّ أبناء هذا الجيل يمتلكون كفاءة رقمية تلقائية لمجرّد أنّهم وُلدوا في عصر رقمي هو افتراض غير مدعوم بحثياً، وأنّ الاستخدام الترفيهي للتكنولوجيا لا يُترجم من تلقاء نفسه إلى استخدام تعليمي فعّال </w:t>
+        <w:t xml:space="preserve">المرحلة ما فوق الابتدائية، أي المرحلتان الإعدادية والثانوية، تحمل خصوصية تجعل هذا السؤال أشدّ إلحاحاً. الطلاب في هذه المرحلة يمرّون بمرحلة المراهقة بما فيها من بحث عن الاستقلالية والهوية، وهم في الوقت ذاته المستخدمون الأكثف للأجهزة الذكية خارج المدرسة. هذه الازدواجية تضع المعلم أمام موقف مركّب: الأداة التي تجذب انتباه الطالب هي نفسها الأداة التي تنافس المعلم على هذا الانتباه. وقد خلصت مراجعة حديثة واسعة لأثر التكنولوجيا الرقمية على التعليم إلى أنّ الأثر لا يتحدّد بالأداة بل بقدرة المدرسة المؤسسية على استيعابها، أي بالبنية التحتية والقيادة والتطوير المهني معاً </w:t>
+      </w:r>
+      <w:r>
+        <w:rPr>
+          <w:rFonts w:ascii="Times New Roman" w:cs="Times New Roman" w:eastAsia="Times New Roman" w:hAnsi="Times New Roman"/>
+          <w:b w:val="false"/>
+          <w:sz w:val="28"/>
+          <w:szCs w:val="28"/>
+        </w:rPr>
+        <w:t xml:space="preserve">(Timotheou et al., 2023). </w:t>
+      </w:r>
+      <w:r>
+        <w:rPr>
+          <w:rFonts w:ascii="Simplified Arabic" w:cs="Simplified Arabic" w:eastAsia="Simplified Arabic" w:hAnsi="Simplified Arabic"/>
+          <w:b w:val="false"/>
+          <w:sz w:val="28"/>
+          <w:szCs w:val="28"/>
+          <w:rtl/>
+        </w:rPr>
+        <w:t xml:space="preserve">وقد بيّنت الأدبيات كذلك أنّ الافتراض الشائع بأنّ أبناء هذا الجيل يمتلكون كفاءة رقمية تلقائية لمجرّد أنّهم وُلدوا في عصر رقمي هو افتراض غير مدعوم بحثياً، وأنّ الاستخدام الترفيهي للتكنولوجيا لا يُترجم من تلقاء نفسه إلى استخدام تعليمي فعّال </w:t>
       </w:r>
       <w:r>
         <w:rPr>
@@ -1323,24 +1393,24 @@
           <w:szCs w:val="30"/>
           <w:rtl/>
         </w:rPr>
-        <w:t xml:space="preserve">النماذج النظرية لدمج التكنولوجيا في التدريس</w:t>
-      </w:r>
-    </w:p>
-    <w:p>
-      <w:pPr>
-        <w:bidi/>
-        <w:spacing w:after="120" w:line="360" w:lineRule="auto"/>
-        <w:jc w:val="both"/>
-      </w:pPr>
-      <w:r>
-        <w:rPr>
-          <w:rFonts w:ascii="Simplified Arabic" w:cs="Simplified Arabic" w:eastAsia="Simplified Arabic" w:hAnsi="Simplified Arabic"/>
-          <w:b w:val="false"/>
-          <w:sz w:val="28"/>
-          <w:szCs w:val="28"/>
-          <w:rtl/>
-        </w:rPr>
-        <w:t xml:space="preserve">من أكثر النماذج تأثيراً في هذا الحقل نموذج المعرفة التكنولوجية البيداغوجية للمحتوى، الذي طوّره ميشرا وكوهلر </w:t>
+        <w:t xml:space="preserve">الخصائص التطورية للمرحلة ما فوق الابتدائية</w:t>
+      </w:r>
+    </w:p>
+    <w:p>
+      <w:pPr>
+        <w:bidi/>
+        <w:spacing w:after="120" w:line="360" w:lineRule="auto"/>
+        <w:jc w:val="both"/>
+      </w:pPr>
+      <w:r>
+        <w:rPr>
+          <w:rFonts w:ascii="Simplified Arabic" w:cs="Simplified Arabic" w:eastAsia="Simplified Arabic" w:hAnsi="Simplified Arabic"/>
+          <w:b w:val="false"/>
+          <w:sz w:val="28"/>
+          <w:szCs w:val="28"/>
+          <w:rtl/>
+        </w:rPr>
+        <w:t xml:space="preserve">لا يمكن قراءة أثر التكنولوجيا في التعليم بمعزل عن المرحلة التطورية التي يمرّ بها المتعلّم، والخطأ الشائع هو التعامل مع الطلاب بوصفهم فئة واحدة متجانسة. تقع المرحلة ما فوق الابتدائية في قلب مرحلة المراهقة، وهي المرحلة التي وصفها إريكسون </w:t>
       </w:r>
       <w:r>
         <w:rPr>
@@ -1349,34 +1419,34 @@
           <w:sz w:val="28"/>
           <w:szCs w:val="28"/>
         </w:rPr>
-        <w:t xml:space="preserve">(Mishra &amp; Koehler, 2006). </w:t>
-      </w:r>
-      <w:r>
-        <w:rPr>
-          <w:rFonts w:ascii="Simplified Arabic" w:cs="Simplified Arabic" w:eastAsia="Simplified Arabic" w:hAnsi="Simplified Arabic"/>
-          <w:b w:val="false"/>
-          <w:sz w:val="28"/>
-          <w:szCs w:val="28"/>
-          <w:rtl/>
-        </w:rPr>
-        <w:t xml:space="preserve">يقوم النموذج على أنّ التدريس الناجع بالتكنولوجيا لا يتطلّب معرفة تقنية منفصلة، بل تقاطعاً بين ثلاثة أنواع من المعرفة: معرفة المحتوى، والمعرفة البيداغوجية، والمعرفة التكنولوجية. المعلم الذي يتقن الأداة ولا يعرف كيف يوظّفها لتدريس مفهوم بعينه، أو الذي يعرف مادته ولا يعرف حدود الأداة، يبقى خارج منطقة التقاطع. أهمية هذا النموذج للبحث الحالي أنّه يفسّر لماذا لا تكفي الدورات التقنية وحدها لتغيير أسلوب التدريس.</w:t>
-      </w:r>
-    </w:p>
-    <w:p>
-      <w:pPr>
-        <w:bidi/>
-        <w:spacing w:after="120" w:line="360" w:lineRule="auto"/>
-        <w:jc w:val="both"/>
-      </w:pPr>
-      <w:r>
-        <w:rPr>
-          <w:rFonts w:ascii="Simplified Arabic" w:cs="Simplified Arabic" w:eastAsia="Simplified Arabic" w:hAnsi="Simplified Arabic"/>
-          <w:b w:val="false"/>
-          <w:sz w:val="28"/>
-          <w:szCs w:val="28"/>
-          <w:rtl/>
-        </w:rPr>
-        <w:t xml:space="preserve">أمّا نموذج بونتيدورا </w:t>
+        <w:t xml:space="preserve">(Erikson, 1968) </w:t>
+      </w:r>
+      <w:r>
+        <w:rPr>
+          <w:rFonts w:ascii="Simplified Arabic" w:cs="Simplified Arabic" w:eastAsia="Simplified Arabic" w:hAnsi="Simplified Arabic"/>
+          <w:b w:val="false"/>
+          <w:sz w:val="28"/>
+          <w:szCs w:val="28"/>
+          <w:rtl/>
+        </w:rPr>
+        <w:t xml:space="preserve">بأنّها مرحلة الصراع بين بناء الهوية وبين تشوّش الدور، حيث تصبح نظرة الأقران إلى المراهق مصدراً أساسياً لتقدير الذات، وتتقدّم الحاجة إلى الاستقلالية والاعتراف الاجتماعي على الحاجة إلى إرضاء البالغين. هذا الفهم يفسّر ظاهرة تكرّرت في معطيات هذا البحث: أنّ قيمة الأداة الرقمية عند الطالب الضعيف لا تكمن في دقّة مواءمتها لمستواه بل في أنّها تخفي هذه المواءمة عن أعين زملائه.</w:t>
+      </w:r>
+    </w:p>
+    <w:p>
+      <w:pPr>
+        <w:bidi/>
+        <w:spacing w:after="120" w:line="360" w:lineRule="auto"/>
+        <w:jc w:val="both"/>
+      </w:pPr>
+      <w:r>
+        <w:rPr>
+          <w:rFonts w:ascii="Simplified Arabic" w:cs="Simplified Arabic" w:eastAsia="Simplified Arabic" w:hAnsi="Simplified Arabic"/>
+          <w:b w:val="false"/>
+          <w:sz w:val="28"/>
+          <w:szCs w:val="28"/>
+          <w:rtl/>
+        </w:rPr>
+        <w:t xml:space="preserve">وعلى المستوى المعرفي، تُعدّ هذه المرحلة مرحلة انتقال إلى العمليات الصورية، أي القدرة على التفكير المجرّد والافتراضي وفحص الفرضيات، وهي قدرة تنضج تدريجياً ولا تكتمل عند جميع الطلاب في العمر نفسه </w:t>
       </w:r>
       <w:r>
         <w:rPr>
@@ -1385,72 +1455,34 @@
           <w:sz w:val="28"/>
           <w:szCs w:val="28"/>
         </w:rPr>
-        <w:t xml:space="preserve">(Puentedura, 2006) </w:t>
-      </w:r>
-      <w:r>
-        <w:rPr>
-          <w:rFonts w:ascii="Simplified Arabic" w:cs="Simplified Arabic" w:eastAsia="Simplified Arabic" w:hAnsi="Simplified Arabic"/>
-          <w:b w:val="false"/>
-          <w:sz w:val="28"/>
-          <w:szCs w:val="28"/>
-          <w:rtl/>
-        </w:rPr>
-        <w:t xml:space="preserve">فيصنّف الدمج التقني في أربع درجات: الاستبدال، حيث تحلّ الأداة الرقمية محلّ أداة تقليدية دون تغيير وظيفي؛ والتعزيز، حيث تضيف الأداة تحسيناً وظيفياً؛ وإعادة التصميم، حيث تُعاد صياغة المهمة نفسها؛ وإعادة التعريف، حيث تصبح ممكنة مهامّ لم تكن ممكنة أصلاً بدون الأداة. الدرجتان الأوليان شائعتان في الحقل، والانتقال إلى الدرجتين الأخيرتين هو الذي يميّز التغيير الحقيقي في أسلوب التدريس.</w:t>
-      </w:r>
-    </w:p>
-    <w:p>
-      <w:pPr>
-        <w:bidi/>
-        <w:spacing w:after="120" w:line="360" w:lineRule="auto"/>
-        <w:jc w:val="both"/>
-      </w:pPr>
-      <w:r>
-        <w:rPr>
-          <w:rFonts w:ascii="Simplified Arabic" w:cs="Simplified Arabic" w:eastAsia="Simplified Arabic" w:hAnsi="Simplified Arabic"/>
-          <w:b w:val="false"/>
-          <w:sz w:val="28"/>
-          <w:szCs w:val="28"/>
-          <w:rtl/>
-        </w:rPr>
-        <w:t xml:space="preserve">وعلى المستوى النفسي المفسِّر لتبنّي المعلمين للأدوات، يقدّم نموذج قبول التكنولوجيا تفسيراً يقوم على متغيّرين: المنفعة المتصوَّرة وسهولة الاستخدام المتصوَّرة </w:t>
-      </w:r>
-      <w:r>
-        <w:rPr>
-          <w:rFonts w:ascii="Times New Roman" w:cs="Times New Roman" w:eastAsia="Times New Roman" w:hAnsi="Times New Roman"/>
-          <w:b w:val="false"/>
-          <w:sz w:val="28"/>
-          <w:szCs w:val="28"/>
-        </w:rPr>
-        <w:t xml:space="preserve">(Davis, 1989). </w:t>
-      </w:r>
-      <w:r>
-        <w:rPr>
-          <w:rFonts w:ascii="Simplified Arabic" w:cs="Simplified Arabic" w:eastAsia="Simplified Arabic" w:hAnsi="Simplified Arabic"/>
-          <w:b w:val="false"/>
-          <w:sz w:val="28"/>
-          <w:szCs w:val="28"/>
-          <w:rtl/>
-        </w:rPr>
-        <w:t xml:space="preserve">وقد وسّع فينكاتيش وآخرون </w:t>
-      </w:r>
-      <w:r>
-        <w:rPr>
-          <w:rFonts w:ascii="Times New Roman" w:cs="Times New Roman" w:eastAsia="Times New Roman" w:hAnsi="Times New Roman"/>
-          <w:b w:val="false"/>
-          <w:sz w:val="28"/>
-          <w:szCs w:val="28"/>
-        </w:rPr>
-        <w:t xml:space="preserve">(Venkatesh et al., 2003) </w:t>
-      </w:r>
-      <w:r>
-        <w:rPr>
-          <w:rFonts w:ascii="Simplified Arabic" w:cs="Simplified Arabic" w:eastAsia="Simplified Arabic" w:hAnsi="Simplified Arabic"/>
-          <w:b w:val="false"/>
-          <w:sz w:val="28"/>
-          <w:szCs w:val="28"/>
-          <w:rtl/>
-        </w:rPr>
-        <w:t xml:space="preserve">هذا النموذج بإضافة التأثير الاجتماعي والظروف الميسِّرة، أي دعم المؤسسة والبنية التحتية. هذه الإضافة الأخيرة وثيقة الصلة بالبحث الحالي، لأنّ استعداد المعلم لا يكفي حين تكون الشبكة بطيئة أو الجهاز معطّلاً.</w:t>
+        <w:t xml:space="preserve">(Piaget &amp; Inhelder, 1958/1969). </w:t>
+      </w:r>
+      <w:r>
+        <w:rPr>
+          <w:rFonts w:ascii="Simplified Arabic" w:cs="Simplified Arabic" w:eastAsia="Simplified Arabic" w:hAnsi="Simplified Arabic"/>
+          <w:b w:val="false"/>
+          <w:sz w:val="28"/>
+          <w:szCs w:val="28"/>
+          <w:rtl/>
+        </w:rPr>
+        <w:t xml:space="preserve">هذا التمايز في وتيرة النضج المعرفي يعني أنّ المحاكاة الرقمية التي تجعل المجرّد محسوساً قد تخدم طالباً لم تنضج عنده هذه القدرة بعد، بينما تكون زائدة عن الحاجة لطالب آخر في الصفّ نفسه. ولذلك فإنّ الحديث عن أثر موحّد للتكنولوجيا على «طلاب المرحلة الإعدادية» أو «الثانوية» هو تعميم لا تسنده الفروق التطورية الفردية داخل الفئة العمرية الواحدة.</w:t>
+      </w:r>
+    </w:p>
+    <w:p>
+      <w:pPr>
+        <w:bidi/>
+        <w:spacing w:after="120" w:line="360" w:lineRule="auto"/>
+        <w:jc w:val="both"/>
+      </w:pPr>
+      <w:r>
+        <w:rPr>
+          <w:rFonts w:ascii="Simplified Arabic" w:cs="Simplified Arabic" w:eastAsia="Simplified Arabic" w:hAnsi="Simplified Arabic"/>
+          <w:b w:val="false"/>
+          <w:sz w:val="28"/>
+          <w:szCs w:val="28"/>
+          <w:rtl/>
+        </w:rPr>
+        <w:t xml:space="preserve">ويضاف إلى ذلك فارق بين المرحلتين الإعدادية والثانوية داخل هذه الفئة نفسها. ففي المرحلة الإعدادية تكون الحاجة إلى الحركة وتغيير الإيقاع أعلى ومدى الانتباه أقصر، بينما تفرض المرحلة الثانوية ضغط الامتحانات الخارجية وتطلب نفَساً أطول في المهمّة الواحدة. وقد ظهر هذا الفارق بوضوح في معطيات البحث الحالي، إذ اختلف المشتركون من المرحلتين في تبرير قراراتهم حول وتيرة الدمج، وهو ما يستوجب الحذر من قراءة العيّنة بوصفها كتلة واحدة.</w:t>
       </w:r>
     </w:p>
     <w:p>
@@ -1468,24 +1500,24 @@
           <w:szCs w:val="30"/>
           <w:rtl/>
         </w:rPr>
-        <w:t xml:space="preserve">من التلقين إلى التعلم النشط: أثر التكنولوجيا في أساليب التدريس</w:t>
-      </w:r>
-    </w:p>
-    <w:p>
-      <w:pPr>
-        <w:bidi/>
-        <w:spacing w:after="120" w:line="360" w:lineRule="auto"/>
-        <w:jc w:val="both"/>
-      </w:pPr>
-      <w:r>
-        <w:rPr>
-          <w:rFonts w:ascii="Simplified Arabic" w:cs="Simplified Arabic" w:eastAsia="Simplified Arabic" w:hAnsi="Simplified Arabic"/>
-          <w:b w:val="false"/>
-          <w:sz w:val="28"/>
-          <w:szCs w:val="28"/>
-          <w:rtl/>
-        </w:rPr>
-        <w:t xml:space="preserve">ترتكز الحجّة التربوية لدمج التكنولوجيا على مبدأ أنّ المعرفة تُبنى ولا تُنقل، وأنّ التفاعل الاجتماعي وسيط أساسي في هذا البناء. الفكرة الفيغوتسكية عن منطقة النموّ القريبة، أي المسافة بين ما يستطيع المتعلّم إنجازه وحده وما يستطيع إنجازه بمساندة، تقدّم إطاراً لفهم دور الأداة الرقمية بوصفها سقالة مؤقتة تُسند المتعلّم ثم تنسحب </w:t>
+        <w:t xml:space="preserve">النماذج النظرية لدمج التكنولوجيا في التدريس</w:t>
+      </w:r>
+    </w:p>
+    <w:p>
+      <w:pPr>
+        <w:bidi/>
+        <w:spacing w:after="120" w:line="360" w:lineRule="auto"/>
+        <w:jc w:val="both"/>
+      </w:pPr>
+      <w:r>
+        <w:rPr>
+          <w:rFonts w:ascii="Simplified Arabic" w:cs="Simplified Arabic" w:eastAsia="Simplified Arabic" w:hAnsi="Simplified Arabic"/>
+          <w:b w:val="false"/>
+          <w:sz w:val="28"/>
+          <w:szCs w:val="28"/>
+          <w:rtl/>
+        </w:rPr>
+        <w:t xml:space="preserve">من أكثر النماذج تأثيراً في هذا الحقل نموذج المعرفة التكنولوجية البيداغوجية للمحتوى، الذي طوّره ميشرا وكوهلر </w:t>
       </w:r>
       <w:r>
         <w:rPr>
@@ -1494,34 +1526,34 @@
           <w:sz w:val="28"/>
           <w:szCs w:val="28"/>
         </w:rPr>
-        <w:t xml:space="preserve">(Vygotsky, 1978). </w:t>
-      </w:r>
-      <w:r>
-        <w:rPr>
-          <w:rFonts w:ascii="Simplified Arabic" w:cs="Simplified Arabic" w:eastAsia="Simplified Arabic" w:hAnsi="Simplified Arabic"/>
-          <w:b w:val="false"/>
-          <w:sz w:val="28"/>
-          <w:szCs w:val="28"/>
-          <w:rtl/>
-        </w:rPr>
-        <w:t xml:space="preserve">التطبيقات التي تقدّم تلميحات متدرجة أو تتيح العمل التشاركي على النص نفسه تعمل ضمن هذا المنطق.</w:t>
-      </w:r>
-    </w:p>
-    <w:p>
-      <w:pPr>
-        <w:bidi/>
-        <w:spacing w:after="120" w:line="360" w:lineRule="auto"/>
-        <w:jc w:val="both"/>
-      </w:pPr>
-      <w:r>
-        <w:rPr>
-          <w:rFonts w:ascii="Simplified Arabic" w:cs="Simplified Arabic" w:eastAsia="Simplified Arabic" w:hAnsi="Simplified Arabic"/>
-          <w:b w:val="false"/>
-          <w:sz w:val="28"/>
-          <w:szCs w:val="28"/>
-          <w:rtl/>
-        </w:rPr>
-        <w:t xml:space="preserve">ومن الناحية الإجرائية، بيّنت المراجعة الشاملة لآلاف الدراسات أنّ ما يُحدث الفارق في التحصيل ليس نوع الوسيلة بل خصائص التدريس التي تحملها: وضوح المعلم، والتغذية الراجعة، ومشاركة الطالب النشطة في تقويم تعلّمه </w:t>
+        <w:t xml:space="preserve">(Mishra &amp; Koehler, 2006). </w:t>
+      </w:r>
+      <w:r>
+        <w:rPr>
+          <w:rFonts w:ascii="Simplified Arabic" w:cs="Simplified Arabic" w:eastAsia="Simplified Arabic" w:hAnsi="Simplified Arabic"/>
+          <w:b w:val="false"/>
+          <w:sz w:val="28"/>
+          <w:szCs w:val="28"/>
+          <w:rtl/>
+        </w:rPr>
+        <w:t xml:space="preserve">يقوم النموذج على أنّ التدريس الناجع بالتكنولوجيا لا يتطلّب معرفة تقنية منفصلة، بل تقاطعاً بين ثلاثة أنواع من المعرفة: معرفة المحتوى، والمعرفة البيداغوجية، والمعرفة التكنولوجية. المعلم الذي يتقن الأداة ولا يعرف كيف يوظّفها لتدريس مفهوم بعينه، أو الذي يعرف مادته ولا يعرف حدود الأداة، يبقى خارج منطقة التقاطع. أهمية هذا النموذج للبحث الحالي أنّه يفسّر لماذا لا تكفي الدورات التقنية وحدها لتغيير أسلوب التدريس.</w:t>
+      </w:r>
+    </w:p>
+    <w:p>
+      <w:pPr>
+        <w:bidi/>
+        <w:spacing w:after="120" w:line="360" w:lineRule="auto"/>
+        <w:jc w:val="both"/>
+      </w:pPr>
+      <w:r>
+        <w:rPr>
+          <w:rFonts w:ascii="Simplified Arabic" w:cs="Simplified Arabic" w:eastAsia="Simplified Arabic" w:hAnsi="Simplified Arabic"/>
+          <w:b w:val="false"/>
+          <w:sz w:val="28"/>
+          <w:szCs w:val="28"/>
+          <w:rtl/>
+        </w:rPr>
+        <w:t xml:space="preserve">أمّا نموذج بونتيدورا </w:t>
       </w:r>
       <w:r>
         <w:rPr>
@@ -1530,17 +1562,72 @@
           <w:sz w:val="28"/>
           <w:szCs w:val="28"/>
         </w:rPr>
-        <w:t xml:space="preserve">(Hattie, 2009). </w:t>
-      </w:r>
-      <w:r>
-        <w:rPr>
-          <w:rFonts w:ascii="Simplified Arabic" w:cs="Simplified Arabic" w:eastAsia="Simplified Arabic" w:hAnsi="Simplified Arabic"/>
-          <w:b w:val="false"/>
-          <w:sz w:val="28"/>
-          <w:szCs w:val="28"/>
-          <w:rtl/>
-        </w:rPr>
-        <w:t xml:space="preserve">أي أنّ التطبيق الرقمي الذي يوفّر تغذية راجعة فورية يستمد نجاعته من التغذية الراجعة لا من كونه رقمياً. هذه النقطة تفسّر لماذا قد ينجح معلمان في استخدام الأداة نفسها بنتائج مختلفة تماماً.</w:t>
+        <w:t xml:space="preserve">(Puentedura, 2006) </w:t>
+      </w:r>
+      <w:r>
+        <w:rPr>
+          <w:rFonts w:ascii="Simplified Arabic" w:cs="Simplified Arabic" w:eastAsia="Simplified Arabic" w:hAnsi="Simplified Arabic"/>
+          <w:b w:val="false"/>
+          <w:sz w:val="28"/>
+          <w:szCs w:val="28"/>
+          <w:rtl/>
+        </w:rPr>
+        <w:t xml:space="preserve">فيصنّف الدمج التقني في أربع درجات: الاستبدال، حيث تحلّ الأداة الرقمية محلّ أداة تقليدية دون تغيير وظيفي؛ والتعزيز، حيث تضيف الأداة تحسيناً وظيفياً؛ وإعادة التصميم، حيث تُعاد صياغة المهمة نفسها؛ وإعادة التعريف، حيث تصبح ممكنة مهامّ لم تكن ممكنة أصلاً بدون الأداة. الدرجتان الأوليان شائعتان في الحقل، والانتقال إلى الدرجتين الأخيرتين هو الذي يميّز التغيير الحقيقي في أسلوب التدريس.</w:t>
+      </w:r>
+    </w:p>
+    <w:p>
+      <w:pPr>
+        <w:bidi/>
+        <w:spacing w:after="120" w:line="360" w:lineRule="auto"/>
+        <w:jc w:val="both"/>
+      </w:pPr>
+      <w:r>
+        <w:rPr>
+          <w:rFonts w:ascii="Simplified Arabic" w:cs="Simplified Arabic" w:eastAsia="Simplified Arabic" w:hAnsi="Simplified Arabic"/>
+          <w:b w:val="false"/>
+          <w:sz w:val="28"/>
+          <w:szCs w:val="28"/>
+          <w:rtl/>
+        </w:rPr>
+        <w:t xml:space="preserve">وعلى المستوى النفسي المفسِّر لتبنّي المعلمين للأدوات، يقدّم نموذج قبول التكنولوجيا تفسيراً يقوم على متغيّرين: المنفعة المتصوَّرة وسهولة الاستخدام المتصوَّرة </w:t>
+      </w:r>
+      <w:r>
+        <w:rPr>
+          <w:rFonts w:ascii="Times New Roman" w:cs="Times New Roman" w:eastAsia="Times New Roman" w:hAnsi="Times New Roman"/>
+          <w:b w:val="false"/>
+          <w:sz w:val="28"/>
+          <w:szCs w:val="28"/>
+        </w:rPr>
+        <w:t xml:space="preserve">(Davis, 1989). </w:t>
+      </w:r>
+      <w:r>
+        <w:rPr>
+          <w:rFonts w:ascii="Simplified Arabic" w:cs="Simplified Arabic" w:eastAsia="Simplified Arabic" w:hAnsi="Simplified Arabic"/>
+          <w:b w:val="false"/>
+          <w:sz w:val="28"/>
+          <w:szCs w:val="28"/>
+          <w:rtl/>
+        </w:rPr>
+        <w:t xml:space="preserve">وقد وسّع فينكاتيش وآخرون </w:t>
+      </w:r>
+      <w:r>
+        <w:rPr>
+          <w:rFonts w:ascii="Times New Roman" w:cs="Times New Roman" w:eastAsia="Times New Roman" w:hAnsi="Times New Roman"/>
+          <w:b w:val="false"/>
+          <w:sz w:val="28"/>
+          <w:szCs w:val="28"/>
+        </w:rPr>
+        <w:t xml:space="preserve">(Venkatesh et al., 2003) </w:t>
+      </w:r>
+      <w:r>
+        <w:rPr>
+          <w:rFonts w:ascii="Simplified Arabic" w:cs="Simplified Arabic" w:eastAsia="Simplified Arabic" w:hAnsi="Simplified Arabic"/>
+          <w:b w:val="false"/>
+          <w:sz w:val="28"/>
+          <w:szCs w:val="28"/>
+          <w:rtl/>
+        </w:rPr>
+        <w:t xml:space="preserve">هذا النموذج بإضافة التأثير الاجتماعي والظروف الميسِّرة، أي دعم المؤسسة والبنية التحتية. هذه الإضافة الأخيرة وثيقة الصلة بالبحث الحالي، لأنّ استعداد المعلم لا يكفي حين تكون الشبكة بطيئة أو الجهاز معطّلاً.</w:t>
       </w:r>
     </w:p>
     <w:p>
@@ -1558,24 +1645,24 @@
           <w:szCs w:val="30"/>
           <w:rtl/>
         </w:rPr>
-        <w:t xml:space="preserve">الدافعية والعلاقة التربوية في البيئة الرقمية</w:t>
-      </w:r>
-    </w:p>
-    <w:p>
-      <w:pPr>
-        <w:bidi/>
-        <w:spacing w:after="120" w:line="360" w:lineRule="auto"/>
-        <w:jc w:val="both"/>
-      </w:pPr>
-      <w:r>
-        <w:rPr>
-          <w:rFonts w:ascii="Simplified Arabic" w:cs="Simplified Arabic" w:eastAsia="Simplified Arabic" w:hAnsi="Simplified Arabic"/>
-          <w:b w:val="false"/>
-          <w:sz w:val="28"/>
-          <w:szCs w:val="28"/>
-          <w:rtl/>
-        </w:rPr>
-        <w:t xml:space="preserve">تفسّر نظرية تقرير المصير الدافعية الداخلية بثلاث حاجات نفسية أساسية: الاستقلالية، والكفاءة، والانتماء </w:t>
+        <w:t xml:space="preserve">من التلقين إلى التعلم النشط: أثر التكنولوجيا في أساليب التدريس</w:t>
+      </w:r>
+    </w:p>
+    <w:p>
+      <w:pPr>
+        <w:bidi/>
+        <w:spacing w:after="120" w:line="360" w:lineRule="auto"/>
+        <w:jc w:val="both"/>
+      </w:pPr>
+      <w:r>
+        <w:rPr>
+          <w:rFonts w:ascii="Simplified Arabic" w:cs="Simplified Arabic" w:eastAsia="Simplified Arabic" w:hAnsi="Simplified Arabic"/>
+          <w:b w:val="false"/>
+          <w:sz w:val="28"/>
+          <w:szCs w:val="28"/>
+          <w:rtl/>
+        </w:rPr>
+        <w:t xml:space="preserve">ترتكز الحجّة التربوية لدمج التكنولوجيا على مبدأ أنّ المعرفة تُبنى ولا تُنقل، وأنّ التفاعل الاجتماعي وسيط أساسي في هذا البناء. الفكرة الفيغوتسكية عن منطقة النموّ القريبة، أي المسافة بين ما يستطيع المتعلّم إنجازه وحده وما يستطيع إنجازه بمساندة، تقدّم إطاراً لفهم دور الأداة الرقمية بوصفها سقالة مؤقتة تُسند المتعلّم ثم تنسحب </w:t>
       </w:r>
       <w:r>
         <w:rPr>
@@ -1584,34 +1671,34 @@
           <w:sz w:val="28"/>
           <w:szCs w:val="28"/>
         </w:rPr>
-        <w:t xml:space="preserve">(Deci &amp; Ryan, 2000). </w:t>
-      </w:r>
-      <w:r>
-        <w:rPr>
-          <w:rFonts w:ascii="Simplified Arabic" w:cs="Simplified Arabic" w:eastAsia="Simplified Arabic" w:hAnsi="Simplified Arabic"/>
-          <w:b w:val="false"/>
-          <w:sz w:val="28"/>
-          <w:szCs w:val="28"/>
-          <w:rtl/>
-        </w:rPr>
-        <w:t xml:space="preserve">الأدوات الرقمية قد تخدم هذه الحاجات حين تتيح للطالب اختيار مسار تعلّمه أو تمنحه شعوراً بالتقدّم المرئي، وقد تقوّضها حين تتحوّل إلى منظومة نقاط ومنافسة خارجية تُبقي الدافعية معلّقة بالمكافأة. هذا التمييز مهمّ عند قراءة حماس الطلاب للألعاب التعليمية: الحماس بذاته ليس دليلاً على تعلّم عميق.</w:t>
-      </w:r>
-    </w:p>
-    <w:p>
-      <w:pPr>
-        <w:bidi/>
-        <w:spacing w:after="120" w:line="360" w:lineRule="auto"/>
-        <w:jc w:val="both"/>
-      </w:pPr>
-      <w:r>
-        <w:rPr>
-          <w:rFonts w:ascii="Simplified Arabic" w:cs="Simplified Arabic" w:eastAsia="Simplified Arabic" w:hAnsi="Simplified Arabic"/>
-          <w:b w:val="false"/>
-          <w:sz w:val="28"/>
-          <w:szCs w:val="28"/>
-          <w:rtl/>
-        </w:rPr>
-        <w:t xml:space="preserve">أمّا على مستوى العلاقة، فقد وسّعت منصات التواصل حدود التفاعل التربوي إلى ما بعد الدوام الرسمي، بما يحمله ذلك من إمكانية دعم إضافي ومن مخاطر تآكل الحدود المهنية للمعلم. وقد أظهرت دراسات تناولت التواصل بين المعلمين والطلاب عبر الشبكات الاجتماعية أنّ هذا التواصل يقرّب العلاقة ويزيد إحساس الطالب بالأمان، لكنه في الوقت نفسه يفرض على المعلم عملاً عاطفياً إضافياً غير محتسب في ساعات وظيفته </w:t>
+        <w:t xml:space="preserve">(Vygotsky, 1978). </w:t>
+      </w:r>
+      <w:r>
+        <w:rPr>
+          <w:rFonts w:ascii="Simplified Arabic" w:cs="Simplified Arabic" w:eastAsia="Simplified Arabic" w:hAnsi="Simplified Arabic"/>
+          <w:b w:val="false"/>
+          <w:sz w:val="28"/>
+          <w:szCs w:val="28"/>
+          <w:rtl/>
+        </w:rPr>
+        <w:t xml:space="preserve">التطبيقات التي تقدّم تلميحات متدرجة أو تتيح العمل التشاركي على النص نفسه تعمل ضمن هذا المنطق.</w:t>
+      </w:r>
+    </w:p>
+    <w:p>
+      <w:pPr>
+        <w:bidi/>
+        <w:spacing w:after="120" w:line="360" w:lineRule="auto"/>
+        <w:jc w:val="both"/>
+      </w:pPr>
+      <w:r>
+        <w:rPr>
+          <w:rFonts w:ascii="Simplified Arabic" w:cs="Simplified Arabic" w:eastAsia="Simplified Arabic" w:hAnsi="Simplified Arabic"/>
+          <w:b w:val="false"/>
+          <w:sz w:val="28"/>
+          <w:szCs w:val="28"/>
+          <w:rtl/>
+        </w:rPr>
+        <w:t xml:space="preserve">ومن الناحية الإجرائية، بيّنت المراجعة الشاملة لآلاف الدراسات أنّ ما يُحدث الفارق في التحصيل ليس نوع الوسيلة بل خصائص التدريس التي تحملها: وضوح المعلم، والتغذية الراجعة، ومشاركة الطالب النشطة في تقويم تعلّمه </w:t>
       </w:r>
       <w:r>
         <w:rPr>
@@ -1620,7 +1707,17 @@
           <w:sz w:val="28"/>
           <w:szCs w:val="28"/>
         </w:rPr>
-        <w:t xml:space="preserve">(Asterhan &amp; Rosenberg, 2015).</w:t>
+        <w:t xml:space="preserve">(Hattie, 2009). </w:t>
+      </w:r>
+      <w:r>
+        <w:rPr>
+          <w:rFonts w:ascii="Simplified Arabic" w:cs="Simplified Arabic" w:eastAsia="Simplified Arabic" w:hAnsi="Simplified Arabic"/>
+          <w:b w:val="false"/>
+          <w:sz w:val="28"/>
+          <w:szCs w:val="28"/>
+          <w:rtl/>
+        </w:rPr>
+        <w:t xml:space="preserve">أي أنّ التطبيق الرقمي الذي يوفّر تغذية راجعة فورية يستمد نجاعته من التغذية الراجعة لا من كونه رقمياً. هذه النقطة تفسّر لماذا قد ينجح معلمان في استخدام الأداة نفسها بنتائج مختلفة تماماً.</w:t>
       </w:r>
     </w:p>
     <w:p>
@@ -1638,24 +1735,24 @@
           <w:szCs w:val="30"/>
           <w:rtl/>
         </w:rPr>
-        <w:t xml:space="preserve">التدريس المتمايز ومراعاة الفروق الفردية</w:t>
-      </w:r>
-    </w:p>
-    <w:p>
-      <w:pPr>
-        <w:bidi/>
-        <w:spacing w:after="120" w:line="360" w:lineRule="auto"/>
-        <w:jc w:val="both"/>
-      </w:pPr>
-      <w:r>
-        <w:rPr>
-          <w:rFonts w:ascii="Simplified Arabic" w:cs="Simplified Arabic" w:eastAsia="Simplified Arabic" w:hAnsi="Simplified Arabic"/>
-          <w:b w:val="false"/>
-          <w:sz w:val="28"/>
-          <w:szCs w:val="28"/>
-          <w:rtl/>
-        </w:rPr>
-        <w:t xml:space="preserve">يقوم التدريس المتمايز على مواءمة المحتوى والعملية والمنتج مع جهوزية الطالب واهتماماته وأنماط تعلّمه </w:t>
+        <w:t xml:space="preserve">الدافعية والعلاقة التربوية في البيئة الرقمية</w:t>
+      </w:r>
+    </w:p>
+    <w:p>
+      <w:pPr>
+        <w:bidi/>
+        <w:spacing w:after="120" w:line="360" w:lineRule="auto"/>
+        <w:jc w:val="both"/>
+      </w:pPr>
+      <w:r>
+        <w:rPr>
+          <w:rFonts w:ascii="Simplified Arabic" w:cs="Simplified Arabic" w:eastAsia="Simplified Arabic" w:hAnsi="Simplified Arabic"/>
+          <w:b w:val="false"/>
+          <w:sz w:val="28"/>
+          <w:szCs w:val="28"/>
+          <w:rtl/>
+        </w:rPr>
+        <w:t xml:space="preserve">تفسّر نظرية تقرير المصير الدافعية الداخلية بثلاث حاجات نفسية أساسية: الاستقلالية، والكفاءة، والانتماء </w:t>
       </w:r>
       <w:r>
         <w:rPr>
@@ -1664,17 +1761,34 @@
           <w:sz w:val="28"/>
           <w:szCs w:val="28"/>
         </w:rPr>
-        <w:t xml:space="preserve">(Tomlinson, 2014). </w:t>
-      </w:r>
-      <w:r>
-        <w:rPr>
-          <w:rFonts w:ascii="Simplified Arabic" w:cs="Simplified Arabic" w:eastAsia="Simplified Arabic" w:hAnsi="Simplified Arabic"/>
-          <w:b w:val="false"/>
-          <w:sz w:val="28"/>
-          <w:szCs w:val="28"/>
-          <w:rtl/>
-        </w:rPr>
-        <w:t xml:space="preserve">الأدوات الرقمية تخفّض الكلفة العملية لهذه المواءمة: يستطيع المعلم أن يوزّع مهامّ بمستويات مختلفة في الوقت نفسه، وأن يتيح للطالب البطيء إعادة مشاهدة الشرح، وأن يرصد من فهم ومن لم يفهم خلال دقائق. غير أنّ الأدبيات تحذّر من المبالغة في مفهوم «أنماط التعلم» بوصفه تصنيفاً ثابتاً للمتعلمين، إذ لم تجد المراجعات النقدية سنداً تجريبياً لفرضية أنّ المواءمة مع النمط الحسي المفضّل تحسّن التحصيل </w:t>
+        <w:t xml:space="preserve">(Deci &amp; Ryan, 2000). </w:t>
+      </w:r>
+      <w:r>
+        <w:rPr>
+          <w:rFonts w:ascii="Simplified Arabic" w:cs="Simplified Arabic" w:eastAsia="Simplified Arabic" w:hAnsi="Simplified Arabic"/>
+          <w:b w:val="false"/>
+          <w:sz w:val="28"/>
+          <w:szCs w:val="28"/>
+          <w:rtl/>
+        </w:rPr>
+        <w:t xml:space="preserve">الأدوات الرقمية قد تخدم هذه الحاجات حين تتيح للطالب اختيار مسار تعلّمه أو تمنحه شعوراً بالتقدّم المرئي، وقد تقوّضها حين تتحوّل إلى منظومة نقاط ومنافسة خارجية تُبقي الدافعية معلّقة بالمكافأة. هذا التمييز مهمّ عند قراءة حماس الطلاب للألعاب التعليمية: الحماس بذاته ليس دليلاً على تعلّم عميق.</w:t>
+      </w:r>
+    </w:p>
+    <w:p>
+      <w:pPr>
+        <w:bidi/>
+        <w:spacing w:after="120" w:line="360" w:lineRule="auto"/>
+        <w:jc w:val="both"/>
+      </w:pPr>
+      <w:r>
+        <w:rPr>
+          <w:rFonts w:ascii="Simplified Arabic" w:cs="Simplified Arabic" w:eastAsia="Simplified Arabic" w:hAnsi="Simplified Arabic"/>
+          <w:b w:val="false"/>
+          <w:sz w:val="28"/>
+          <w:szCs w:val="28"/>
+          <w:rtl/>
+        </w:rPr>
+        <w:t xml:space="preserve">أمّا على مستوى العلاقة، فقد وسّعت منصات التواصل حدود التفاعل التربوي إلى ما بعد الدوام الرسمي، بما يحمله ذلك من إمكانية دعم إضافي ومن مخاطر تآكل الحدود المهنية للمعلم. وقد أظهرت دراسات تناولت التواصل بين المعلمين والطلاب عبر الشبكات الاجتماعية أنّ هذا التواصل يقرّب العلاقة ويزيد إحساس الطالب بالأمان، لكنه في الوقت نفسه يفرض على المعلم عملاً عاطفياً إضافياً غير محتسب في ساعات وظيفته </w:t>
       </w:r>
       <w:r>
         <w:rPr>
@@ -1683,43 +1797,7 @@
           <w:sz w:val="28"/>
           <w:szCs w:val="28"/>
         </w:rPr>
-        <w:t xml:space="preserve">(Kirschner &amp; De Bruyckere, 2017). </w:t>
-      </w:r>
-      <w:r>
-        <w:rPr>
-          <w:rFonts w:ascii="Simplified Arabic" w:cs="Simplified Arabic" w:eastAsia="Simplified Arabic" w:hAnsi="Simplified Arabic"/>
-          <w:b w:val="false"/>
-          <w:sz w:val="28"/>
-          <w:szCs w:val="28"/>
-          <w:rtl/>
-        </w:rPr>
-        <w:t xml:space="preserve">المواءمة المفيدة هي المواءمة مع مستوى الجهوزية لا مع النمط المفترض.</w:t>
-      </w:r>
-    </w:p>
-    <w:p>
-      <w:pPr>
-        <w:bidi/>
-        <w:spacing w:after="120" w:line="360" w:lineRule="auto"/>
-        <w:jc w:val="both"/>
-      </w:pPr>
-      <w:r>
-        <w:rPr>
-          <w:rFonts w:ascii="Simplified Arabic" w:cs="Simplified Arabic" w:eastAsia="Simplified Arabic" w:hAnsi="Simplified Arabic"/>
-          <w:b w:val="false"/>
-          <w:sz w:val="28"/>
-          <w:szCs w:val="28"/>
-          <w:rtl/>
-        </w:rPr>
-        <w:t xml:space="preserve">وفي ما يخصّ الطلاب ذوي التحصيل المنخفض تحديداً، تشير الأدبيات إلى أنّ الوسائط المتعددة قد تقلّل الحاجز اللغوي وتخفّف قلق الفشل، خاصة حين تكون الاستجابة خاصة وغير معلنة أمام الصف. لكن الأثر ذاته ينقلب حين تُصمَّم المهمة بازدحام معلوماتي، لأنّ الحمل المعرفي الزائد يضرّ بهذه الفئة أكثر من غيرها </w:t>
-      </w:r>
-      <w:r>
-        <w:rPr>
-          <w:rFonts w:ascii="Times New Roman" w:cs="Times New Roman" w:eastAsia="Times New Roman" w:hAnsi="Times New Roman"/>
-          <w:b w:val="false"/>
-          <w:sz w:val="28"/>
-          <w:szCs w:val="28"/>
-        </w:rPr>
-        <w:t xml:space="preserve">(Sweller, 1988).</w:t>
+        <w:t xml:space="preserve">(Asterhan &amp; Rosenberg, 2015).</w:t>
       </w:r>
     </w:p>
     <w:p>
@@ -1737,24 +1815,24 @@
           <w:szCs w:val="30"/>
           <w:rtl/>
         </w:rPr>
-        <w:t xml:space="preserve">الوجه الآخر: الحمل المعرفي، التشتت وتراجع المهارات</w:t>
-      </w:r>
-    </w:p>
-    <w:p>
-      <w:pPr>
-        <w:bidi/>
-        <w:spacing w:after="120" w:line="360" w:lineRule="auto"/>
-        <w:jc w:val="both"/>
-      </w:pPr>
-      <w:r>
-        <w:rPr>
-          <w:rFonts w:ascii="Simplified Arabic" w:cs="Simplified Arabic" w:eastAsia="Simplified Arabic" w:hAnsi="Simplified Arabic"/>
-          <w:b w:val="false"/>
-          <w:sz w:val="28"/>
-          <w:szCs w:val="28"/>
-          <w:rtl/>
-        </w:rPr>
-        <w:t xml:space="preserve">لا تخلو الصورة من مخاوف موثّقة بحثياً. نظرية الحمل المعرفي تبيّن أنّ الذاكرة العاملة محدودة السعة، وأنّ المواد التعليمية المزدحمة بالمؤثرات البصرية والصوتية قد تستهلك هذه السعة في معالجة الشكل بدل معالجة المضمون </w:t>
+        <w:t xml:space="preserve">التدريس المتمايز ومراعاة الفروق الفردية</w:t>
+      </w:r>
+    </w:p>
+    <w:p>
+      <w:pPr>
+        <w:bidi/>
+        <w:spacing w:after="120" w:line="360" w:lineRule="auto"/>
+        <w:jc w:val="both"/>
+      </w:pPr>
+      <w:r>
+        <w:rPr>
+          <w:rFonts w:ascii="Simplified Arabic" w:cs="Simplified Arabic" w:eastAsia="Simplified Arabic" w:hAnsi="Simplified Arabic"/>
+          <w:b w:val="false"/>
+          <w:sz w:val="28"/>
+          <w:szCs w:val="28"/>
+          <w:rtl/>
+        </w:rPr>
+        <w:t xml:space="preserve">يقوم التدريس المتمايز على مواءمة المحتوى والعملية والمنتج مع جهوزية الطالب واهتماماته وأنماط تعلّمه </w:t>
       </w:r>
       <w:r>
         <w:rPr>
@@ -1763,17 +1841,17 @@
           <w:sz w:val="28"/>
           <w:szCs w:val="28"/>
         </w:rPr>
-        <w:t xml:space="preserve">(Sweller, 1988). </w:t>
-      </w:r>
-      <w:r>
-        <w:rPr>
-          <w:rFonts w:ascii="Simplified Arabic" w:cs="Simplified Arabic" w:eastAsia="Simplified Arabic" w:hAnsi="Simplified Arabic"/>
-          <w:b w:val="false"/>
-          <w:sz w:val="28"/>
-          <w:szCs w:val="28"/>
-          <w:rtl/>
-        </w:rPr>
-        <w:t xml:space="preserve">كذلك أظهرت الأبحاث في علم النفس المعرفي أنّ توافر المعلومة على الشبكة يغيّر ما يختار الدماغ تذكّره: يميل الأفراد إلى تذكّر مكان وجود المعلومة بدل تذكّر مضمونها، وهي ظاهرة عُرفت بأثر جوجل على الذاكرة </w:t>
+        <w:t xml:space="preserve">(Tomlinson, 2014). </w:t>
+      </w:r>
+      <w:r>
+        <w:rPr>
+          <w:rFonts w:ascii="Simplified Arabic" w:cs="Simplified Arabic" w:eastAsia="Simplified Arabic" w:hAnsi="Simplified Arabic"/>
+          <w:b w:val="false"/>
+          <w:sz w:val="28"/>
+          <w:szCs w:val="28"/>
+          <w:rtl/>
+        </w:rPr>
+        <w:t xml:space="preserve">الأدوات الرقمية تخفّض الكلفة العملية لهذه المواءمة: يستطيع المعلم أن يوزّع مهامّ بمستويات مختلفة في الوقت نفسه، وأن يتيح للطالب البطيء إعادة مشاهدة الشرح، وأن يرصد من فهم ومن لم يفهم خلال دقائق. غير أنّ الأدبيات تحذّر من المبالغة في مفهوم «أنماط التعلم» بوصفه تصنيفاً ثابتاً للمتعلمين، إذ لم تجد المراجعات النقدية سنداً تجريبياً لفرضية أنّ المواءمة مع النمط الحسي المفضّل تحسّن التحصيل </w:t>
       </w:r>
       <w:r>
         <w:rPr>
@@ -1782,24 +1860,34 @@
           <w:sz w:val="28"/>
           <w:szCs w:val="28"/>
         </w:rPr>
-        <w:t xml:space="preserve">(Sparrow et al., 2011).</w:t>
-      </w:r>
-    </w:p>
-    <w:p>
-      <w:pPr>
-        <w:bidi/>
-        <w:spacing w:after="120" w:line="360" w:lineRule="auto"/>
-        <w:jc w:val="both"/>
-      </w:pPr>
-      <w:r>
-        <w:rPr>
-          <w:rFonts w:ascii="Simplified Arabic" w:cs="Simplified Arabic" w:eastAsia="Simplified Arabic" w:hAnsi="Simplified Arabic"/>
-          <w:b w:val="false"/>
-          <w:sz w:val="28"/>
-          <w:szCs w:val="28"/>
-          <w:rtl/>
-        </w:rPr>
-        <w:t xml:space="preserve">وعلى مستوى الانتباه، يجادل كار </w:t>
+        <w:t xml:space="preserve">(Kirschner &amp; De Bruyckere, 2017). </w:t>
+      </w:r>
+      <w:r>
+        <w:rPr>
+          <w:rFonts w:ascii="Simplified Arabic" w:cs="Simplified Arabic" w:eastAsia="Simplified Arabic" w:hAnsi="Simplified Arabic"/>
+          <w:b w:val="false"/>
+          <w:sz w:val="28"/>
+          <w:szCs w:val="28"/>
+          <w:rtl/>
+        </w:rPr>
+        <w:t xml:space="preserve">المواءمة المفيدة هي المواءمة مع مستوى الجهوزية لا مع النمط المفترض.</w:t>
+      </w:r>
+    </w:p>
+    <w:p>
+      <w:pPr>
+        <w:bidi/>
+        <w:spacing w:after="120" w:line="360" w:lineRule="auto"/>
+        <w:jc w:val="both"/>
+      </w:pPr>
+      <w:r>
+        <w:rPr>
+          <w:rFonts w:ascii="Simplified Arabic" w:cs="Simplified Arabic" w:eastAsia="Simplified Arabic" w:hAnsi="Simplified Arabic"/>
+          <w:b w:val="false"/>
+          <w:sz w:val="28"/>
+          <w:szCs w:val="28"/>
+          <w:rtl/>
+        </w:rPr>
+        <w:t xml:space="preserve">وفي ما يخصّ الطلاب ذوي التحصيل المنخفض تحديداً، تشير الأدبيات إلى أنّ الوسائط المتعددة قد تقلّل الحاجز اللغوي وتخفّف قلق الفشل، خاصة حين تكون الاستجابة خاصة وغير معلنة أمام الصف. لكن الأثر ذاته ينقلب حين تُصمَّم المهمة بازدحام معلوماتي، لأنّ الحمل المعرفي الزائد يضرّ بهذه الفئة أكثر من غيرها </w:t>
       </w:r>
       <w:r>
         <w:rPr>
@@ -1808,36 +1896,7 @@
           <w:sz w:val="28"/>
           <w:szCs w:val="28"/>
         </w:rPr>
-        <w:t xml:space="preserve">(Carr, 2010) </w:t>
-      </w:r>
-      <w:r>
-        <w:rPr>
-          <w:rFonts w:ascii="Simplified Arabic" w:cs="Simplified Arabic" w:eastAsia="Simplified Arabic" w:hAnsi="Simplified Arabic"/>
-          <w:b w:val="false"/>
-          <w:sz w:val="28"/>
-          <w:szCs w:val="28"/>
-          <w:rtl/>
-        </w:rPr>
-        <w:t xml:space="preserve">بأنّ القراءة المتشظّية على الشاشة تدرّب الدماغ على المسح السريع على حساب القراءة العميقة المتواصلة. وتضاف إلى ذلك مسألة تعدّد المهام، إذ تبيّن أنّ الطلاب الذين يتنقّلون بين المهمة الدراسية ووسائل التواصل يدفعون ثمناً في الفهم وفي زمن الإنجاز، خلافاً لاعتقادهم بقدرتهم على ذلك </w:t>
-      </w:r>
-      <w:r>
-        <w:rPr>
-          <w:rFonts w:ascii="Times New Roman" w:cs="Times New Roman" w:eastAsia="Times New Roman" w:hAnsi="Times New Roman"/>
-          <w:b w:val="false"/>
-          <w:sz w:val="28"/>
-          <w:szCs w:val="28"/>
-        </w:rPr>
-        <w:t xml:space="preserve">(Kirschner &amp; De Bruyckere, 2017). </w:t>
-      </w:r>
-      <w:r>
-        <w:rPr>
-          <w:rFonts w:ascii="Simplified Arabic" w:cs="Simplified Arabic" w:eastAsia="Simplified Arabic" w:hAnsi="Simplified Arabic"/>
-          <w:b w:val="false"/>
-          <w:sz w:val="28"/>
-          <w:szCs w:val="28"/>
-          <w:rtl/>
-        </w:rPr>
-        <w:t xml:space="preserve">هذه المعطيات لا تنفي فائدة الدمج، لكنها تضع شرطاً على تصميمه.</w:t>
+        <w:t xml:space="preserve">(Sweller, 1988).</w:t>
       </w:r>
     </w:p>
     <w:p>
@@ -1855,6 +1914,311 @@
           <w:szCs w:val="30"/>
           <w:rtl/>
         </w:rPr>
+        <w:t xml:space="preserve">التأثيرات البيئية: البيت والمدرسة والمجتمع</w:t>
+      </w:r>
+    </w:p>
+    <w:p>
+      <w:pPr>
+        <w:bidi/>
+        <w:spacing w:after="120" w:line="360" w:lineRule="auto"/>
+        <w:jc w:val="both"/>
+      </w:pPr>
+      <w:r>
+        <w:rPr>
+          <w:rFonts w:ascii="Simplified Arabic" w:cs="Simplified Arabic" w:eastAsia="Simplified Arabic" w:hAnsi="Simplified Arabic"/>
+          <w:b w:val="false"/>
+          <w:sz w:val="28"/>
+          <w:szCs w:val="28"/>
+          <w:rtl/>
+        </w:rPr>
+        <w:t xml:space="preserve">تُقرأ الظاهرة التربوية في هذا البحث ضمن إطار بيئي لا فردي. يقدّم برونفنبرنر </w:t>
+      </w:r>
+      <w:r>
+        <w:rPr>
+          <w:rFonts w:ascii="Times New Roman" w:cs="Times New Roman" w:eastAsia="Times New Roman" w:hAnsi="Times New Roman"/>
+          <w:b w:val="false"/>
+          <w:sz w:val="28"/>
+          <w:szCs w:val="28"/>
+        </w:rPr>
+        <w:t xml:space="preserve">(Bronfenbrenner, 1979) </w:t>
+      </w:r>
+      <w:r>
+        <w:rPr>
+          <w:rFonts w:ascii="Simplified Arabic" w:cs="Simplified Arabic" w:eastAsia="Simplified Arabic" w:hAnsi="Simplified Arabic"/>
+          <w:b w:val="false"/>
+          <w:sz w:val="28"/>
+          <w:szCs w:val="28"/>
+          <w:rtl/>
+        </w:rPr>
+        <w:t xml:space="preserve">نموذجاً يرى نموّ الفرد داخل دوائر متداخلة من الأنظمة: النظام المباشر الذي يشمل البيت والصفّ، والنظام الوسيط الذي يشمل العلاقة بين البيت والمدرسة، والنظام الأوسع الذي يشمل السياسة التعليمية والثقافة السائدة. وفق هذا الإطار، فإنّ المهمّة البيتية الرقمية ليست حدثاً يجري في رأس الطالب بل في مطبخ بيته، وهي لذلك مشروطة بموارد ذلك البيت لا بدافعية الطالب وحدها.</w:t>
+      </w:r>
+    </w:p>
+    <w:p>
+      <w:pPr>
+        <w:bidi/>
+        <w:spacing w:after="120" w:line="360" w:lineRule="auto"/>
+        <w:jc w:val="both"/>
+      </w:pPr>
+      <w:r>
+        <w:rPr>
+          <w:rFonts w:ascii="Simplified Arabic" w:cs="Simplified Arabic" w:eastAsia="Simplified Arabic" w:hAnsi="Simplified Arabic"/>
+          <w:b w:val="false"/>
+          <w:sz w:val="28"/>
+          <w:szCs w:val="28"/>
+          <w:rtl/>
+        </w:rPr>
+        <w:t xml:space="preserve">وتشير الأدبيات إلى أنّ الفجوة الرقمية لم تعد فجوة في امتلاك الجهاز فحسب، بل فجوة في جودة الاتصال وفي المساحة المتاحة للدراسة وفي قدرة الأهل على المرافقة، وهي فجوة تتّسع حين تنتقل المهامّ التعليمية من الصفّ إلى البيت </w:t>
+      </w:r>
+      <w:r>
+        <w:rPr>
+          <w:rFonts w:ascii="Times New Roman" w:cs="Times New Roman" w:eastAsia="Times New Roman" w:hAnsi="Times New Roman"/>
+          <w:b w:val="false"/>
+          <w:sz w:val="28"/>
+          <w:szCs w:val="28"/>
+        </w:rPr>
+        <w:t xml:space="preserve">(UNESCO, 2023). </w:t>
+      </w:r>
+      <w:r>
+        <w:rPr>
+          <w:rFonts w:ascii="Simplified Arabic" w:cs="Simplified Arabic" w:eastAsia="Simplified Arabic" w:hAnsi="Simplified Arabic"/>
+          <w:b w:val="false"/>
+          <w:sz w:val="28"/>
+          <w:szCs w:val="28"/>
+          <w:rtl/>
+        </w:rPr>
+        <w:t xml:space="preserve">وقد ظهر هذا البعد في معطيات البحث الحالي في أكثر من موضع، إذ ربط أحد المشتركين تحفّظه على المهامّ الرقمية البيتية بمعرفته بظروف بيوت طلابه، ووصفت مشتركة أخرى كيف غيّرت رؤيتها لبيوت الطلاب في فترة التعلّم عن بُعد حكمها المهني على طالب كانت تعتبره مهملاً.</w:t>
+      </w:r>
+    </w:p>
+    <w:p>
+      <w:pPr>
+        <w:bidi/>
+        <w:spacing w:after="120" w:line="360" w:lineRule="auto"/>
+        <w:jc w:val="both"/>
+      </w:pPr>
+      <w:r>
+        <w:rPr>
+          <w:rFonts w:ascii="Simplified Arabic" w:cs="Simplified Arabic" w:eastAsia="Simplified Arabic" w:hAnsi="Simplified Arabic"/>
+          <w:b w:val="false"/>
+          <w:sz w:val="28"/>
+          <w:szCs w:val="28"/>
+          <w:rtl/>
+        </w:rPr>
+        <w:t xml:space="preserve">أمّا على مستوى النظام الأوسع، فتضاف إلى الصورة مسألة اللغة. معظم الموارد الرقمية التعليمية عالية الجودة، من المحاكاة العلمية إلى الأرشيفات التاريخية، متاحة بالإنجليزية أو بلغات أخرى، بينما تبقى الموارد بالعربية أقلّ عدداً وأقلّ تنظيماً. هذا يعني أنّ المعلم الذي يدرّس بالعربية يتحمّل عبء ترجمة أو تكييف إضافياً لا يتحمّله زميله في نظام لغوي آخر، وهو عبء لا يظهر في أيّ مؤشّر رسمي لقياس الدمج التقني. ولذلك فإنّ قراءة نتائج هذا البحث تستوجب وضعها داخل سياقها اللغوي والثقافي والمؤسسي، لا التعامل معها بوصفها معطى عالمياً.</w:t>
+      </w:r>
+    </w:p>
+    <w:p>
+      <w:pPr>
+        <w:bidi/>
+        <w:spacing w:after="160" w:line="360" w:lineRule="auto"/>
+        <w:jc w:val="right"/>
+      </w:pPr>
+      <w:r>
+        <w:rPr>
+          <w:rFonts w:ascii="Simplified Arabic" w:cs="Simplified Arabic" w:eastAsia="Simplified Arabic" w:hAnsi="Simplified Arabic"/>
+          <w:b/>
+          <w:bCs/>
+          <w:sz w:val="30"/>
+          <w:szCs w:val="30"/>
+          <w:rtl/>
+        </w:rPr>
+        <w:t xml:space="preserve">التكنولوجيا والطلاب ذوو صعوبات التعلم والإعاقات</w:t>
+      </w:r>
+    </w:p>
+    <w:p>
+      <w:pPr>
+        <w:bidi/>
+        <w:spacing w:after="120" w:line="360" w:lineRule="auto"/>
+        <w:jc w:val="both"/>
+      </w:pPr>
+      <w:r>
+        <w:rPr>
+          <w:rFonts w:ascii="Simplified Arabic" w:cs="Simplified Arabic" w:eastAsia="Simplified Arabic" w:hAnsi="Simplified Arabic"/>
+          <w:b w:val="false"/>
+          <w:sz w:val="28"/>
+          <w:szCs w:val="28"/>
+          <w:rtl/>
+        </w:rPr>
+        <w:t xml:space="preserve">يشكّل الطلاب ذوو صعوبات التعلم والإعاقات فئة غير متجانسة إطلاقاً، والخطأ المتكرّر هو الحديث عنهم بوصفهم مجموعة واحدة لها احتياج واحد. فالطالب ذو عسر القراءة يحتاج إلى تحويل النصّ إلى صوت، والطالب ذو عسر الكتابة يحتاج إلى بديل عن الخطّ اليدوي، والطالب ذو اضطراب الانتباه يحتاج إلى تقليل المشتّتات لا إلى زيادة المؤثّرات، والطالب ذو الإعاقة الحسّية يحتاج إلى قناة بديلة كاملة. أيّ حديث عن أثر واحد للتكنولوجيا على «ذوي الاحتياجات الخاصة» يخفي هذا التنوّع أكثر ممّا يكشفه.</w:t>
+      </w:r>
+    </w:p>
+    <w:p>
+      <w:pPr>
+        <w:bidi/>
+        <w:spacing w:after="120" w:line="360" w:lineRule="auto"/>
+        <w:jc w:val="both"/>
+      </w:pPr>
+      <w:r>
+        <w:rPr>
+          <w:rFonts w:ascii="Simplified Arabic" w:cs="Simplified Arabic" w:eastAsia="Simplified Arabic" w:hAnsi="Simplified Arabic"/>
+          <w:b w:val="false"/>
+          <w:sz w:val="28"/>
+          <w:szCs w:val="28"/>
+          <w:rtl/>
+        </w:rPr>
+        <w:t xml:space="preserve">ومن هنا جاء مفهوم التصميم الشامل للتعلّم، الذي يقترح بناء المهمّة منذ البداية بقنوات تمثيل وتعبير وانخراط متعدّدة، بدل تكييفها لاحقاً لكلّ طالب على حدة </w:t>
+      </w:r>
+      <w:r>
+        <w:rPr>
+          <w:rFonts w:ascii="Times New Roman" w:cs="Times New Roman" w:eastAsia="Times New Roman" w:hAnsi="Times New Roman"/>
+          <w:b w:val="false"/>
+          <w:sz w:val="28"/>
+          <w:szCs w:val="28"/>
+        </w:rPr>
+        <w:t xml:space="preserve">(Rose &amp; Meyer, 2002). </w:t>
+      </w:r>
+      <w:r>
+        <w:rPr>
+          <w:rFonts w:ascii="Simplified Arabic" w:cs="Simplified Arabic" w:eastAsia="Simplified Arabic" w:hAnsi="Simplified Arabic"/>
+          <w:b w:val="false"/>
+          <w:sz w:val="28"/>
+          <w:szCs w:val="28"/>
+          <w:rtl/>
+        </w:rPr>
+        <w:t xml:space="preserve">ميزة هذا المدخل أنّه لا يميّز الطالب المحتاج عن زملائه بشكل مرئي، وهي نقطة عادت في أقوال أكثر من مشترك في هذا البحث بصيغ مختلفة. غير أنّ الأدبيات تحذّر أيضاً من أنّ الأداة المساعدة قد تتحوّل إلى بديل عن بناء المهارة نفسها إذا استُخدمت دون تخطيط، فالمدقّق الإملائي الذي يتيح لطالب عسر الكتابة أن ينتج نصّاً كاملاً هو إتاحة مشروعة، لكنّه للطالب الذي لم يبنِ القاعدة الإملائية بعد قد يكون حاجزاً أمام بنائها </w:t>
+      </w:r>
+      <w:r>
+        <w:rPr>
+          <w:rFonts w:ascii="Times New Roman" w:cs="Times New Roman" w:eastAsia="Times New Roman" w:hAnsi="Times New Roman"/>
+          <w:b w:val="false"/>
+          <w:sz w:val="28"/>
+          <w:szCs w:val="28"/>
+        </w:rPr>
+        <w:t xml:space="preserve">(Ertmer &amp; Ottenbreit-Leftwich, 2010).</w:t>
+      </w:r>
+    </w:p>
+    <w:p>
+      <w:pPr>
+        <w:bidi/>
+        <w:spacing w:after="160" w:line="360" w:lineRule="auto"/>
+        <w:jc w:val="right"/>
+      </w:pPr>
+      <w:r>
+        <w:rPr>
+          <w:rFonts w:ascii="Simplified Arabic" w:cs="Simplified Arabic" w:eastAsia="Simplified Arabic" w:hAnsi="Simplified Arabic"/>
+          <w:b/>
+          <w:bCs/>
+          <w:sz w:val="30"/>
+          <w:szCs w:val="30"/>
+          <w:rtl/>
+        </w:rPr>
+        <w:t xml:space="preserve">الوجه الآخر: الحمل المعرفي، التشتت وتراجع المهارات</w:t>
+      </w:r>
+    </w:p>
+    <w:p>
+      <w:pPr>
+        <w:bidi/>
+        <w:spacing w:after="120" w:line="360" w:lineRule="auto"/>
+        <w:jc w:val="both"/>
+      </w:pPr>
+      <w:r>
+        <w:rPr>
+          <w:rFonts w:ascii="Simplified Arabic" w:cs="Simplified Arabic" w:eastAsia="Simplified Arabic" w:hAnsi="Simplified Arabic"/>
+          <w:b w:val="false"/>
+          <w:sz w:val="28"/>
+          <w:szCs w:val="28"/>
+          <w:rtl/>
+        </w:rPr>
+        <w:t xml:space="preserve">لا تخلو الصورة من مخاوف موثّقة بحثياً. نظرية الحمل المعرفي تبيّن أنّ الذاكرة العاملة محدودة السعة، وأنّ المواد التعليمية المزدحمة بالمؤثرات البصرية والصوتية قد تستهلك هذه السعة في معالجة الشكل بدل معالجة المضمون </w:t>
+      </w:r>
+      <w:r>
+        <w:rPr>
+          <w:rFonts w:ascii="Times New Roman" w:cs="Times New Roman" w:eastAsia="Times New Roman" w:hAnsi="Times New Roman"/>
+          <w:b w:val="false"/>
+          <w:sz w:val="28"/>
+          <w:szCs w:val="28"/>
+        </w:rPr>
+        <w:t xml:space="preserve">(Sweller, 1988). </w:t>
+      </w:r>
+      <w:r>
+        <w:rPr>
+          <w:rFonts w:ascii="Simplified Arabic" w:cs="Simplified Arabic" w:eastAsia="Simplified Arabic" w:hAnsi="Simplified Arabic"/>
+          <w:b w:val="false"/>
+          <w:sz w:val="28"/>
+          <w:szCs w:val="28"/>
+          <w:rtl/>
+        </w:rPr>
+        <w:t xml:space="preserve">كذلك أظهرت الأبحاث في علم النفس المعرفي أنّ توافر المعلومة على الشبكة يغيّر ما يختار الدماغ تذكّره: يميل الأفراد إلى تذكّر مكان وجود المعلومة بدل تذكّر مضمونها، وهي ظاهرة عُرفت بأثر جوجل على الذاكرة </w:t>
+      </w:r>
+      <w:r>
+        <w:rPr>
+          <w:rFonts w:ascii="Times New Roman" w:cs="Times New Roman" w:eastAsia="Times New Roman" w:hAnsi="Times New Roman"/>
+          <w:b w:val="false"/>
+          <w:sz w:val="28"/>
+          <w:szCs w:val="28"/>
+        </w:rPr>
+        <w:t xml:space="preserve">(Sparrow et al., 2011).</w:t>
+      </w:r>
+    </w:p>
+    <w:p>
+      <w:pPr>
+        <w:bidi/>
+        <w:spacing w:after="120" w:line="360" w:lineRule="auto"/>
+        <w:jc w:val="both"/>
+      </w:pPr>
+      <w:r>
+        <w:rPr>
+          <w:rFonts w:ascii="Simplified Arabic" w:cs="Simplified Arabic" w:eastAsia="Simplified Arabic" w:hAnsi="Simplified Arabic"/>
+          <w:b w:val="false"/>
+          <w:sz w:val="28"/>
+          <w:szCs w:val="28"/>
+          <w:rtl/>
+        </w:rPr>
+        <w:t xml:space="preserve">وعلى مستوى الانتباه، يجادل كار </w:t>
+      </w:r>
+      <w:r>
+        <w:rPr>
+          <w:rFonts w:ascii="Times New Roman" w:cs="Times New Roman" w:eastAsia="Times New Roman" w:hAnsi="Times New Roman"/>
+          <w:b w:val="false"/>
+          <w:sz w:val="28"/>
+          <w:szCs w:val="28"/>
+        </w:rPr>
+        <w:t xml:space="preserve">(Carr, 2010) </w:t>
+      </w:r>
+      <w:r>
+        <w:rPr>
+          <w:rFonts w:ascii="Simplified Arabic" w:cs="Simplified Arabic" w:eastAsia="Simplified Arabic" w:hAnsi="Simplified Arabic"/>
+          <w:b w:val="false"/>
+          <w:sz w:val="28"/>
+          <w:szCs w:val="28"/>
+          <w:rtl/>
+        </w:rPr>
+        <w:t xml:space="preserve">بأنّ القراءة المتشظّية على الشاشة تدرّب الدماغ على المسح السريع على حساب القراءة العميقة المتواصلة. وتضاف إلى ذلك مسألة تعدّد المهام، إذ تبيّن أنّ الطلاب الذين يتنقّلون بين المهمة الدراسية ووسائل التواصل يدفعون ثمناً في الفهم وفي زمن الإنجاز، خلافاً لاعتقادهم بقدرتهم على ذلك </w:t>
+      </w:r>
+      <w:r>
+        <w:rPr>
+          <w:rFonts w:ascii="Times New Roman" w:cs="Times New Roman" w:eastAsia="Times New Roman" w:hAnsi="Times New Roman"/>
+          <w:b w:val="false"/>
+          <w:sz w:val="28"/>
+          <w:szCs w:val="28"/>
+        </w:rPr>
+        <w:t xml:space="preserve">(Kirschner &amp; De Bruyckere, 2017). </w:t>
+      </w:r>
+      <w:r>
+        <w:rPr>
+          <w:rFonts w:ascii="Simplified Arabic" w:cs="Simplified Arabic" w:eastAsia="Simplified Arabic" w:hAnsi="Simplified Arabic"/>
+          <w:b w:val="false"/>
+          <w:sz w:val="28"/>
+          <w:szCs w:val="28"/>
+          <w:rtl/>
+        </w:rPr>
+        <w:t xml:space="preserve">هذه المعطيات لا تنفي فائدة الدمج، لكنها تضع شرطاً على تصميمه.</w:t>
+      </w:r>
+    </w:p>
+    <w:p>
+      <w:pPr>
+        <w:bidi/>
+        <w:spacing w:after="160" w:line="360" w:lineRule="auto"/>
+        <w:jc w:val="right"/>
+      </w:pPr>
+      <w:r>
+        <w:rPr>
+          <w:rFonts w:ascii="Simplified Arabic" w:cs="Simplified Arabic" w:eastAsia="Simplified Arabic" w:hAnsi="Simplified Arabic"/>
+          <w:b/>
+          <w:bCs/>
+          <w:sz w:val="30"/>
+          <w:szCs w:val="30"/>
+          <w:rtl/>
+        </w:rPr>
         <w:t xml:space="preserve">الحواجز أمام المعلمين وحاجات التطوير المهني</w:t>
       </w:r>
     </w:p>
@@ -1972,7 +2336,26 @@
           <w:szCs w:val="28"/>
           <w:rtl/>
         </w:rPr>
-        <w:t xml:space="preserve">وأخيراً، أدخل الذكاء الاصطناعي التوليدي إلى الحقل مسألة جديدة نسبياً تتعلّق بنزاهة العمل الأكاديمي وبإعادة تعريف المهمة البيتية. الأدبيات في هذا الجانب ما زالت في طور التشكّل، غير أنّ الاتجاه السائد يدعو إلى الانتقال من محاولة منع الأداة إلى إعادة تصميم المهام بحيث تتطلّب عمليات تفكير لا تستطيع الأداة إنتاجها بدل الاكتفاء بمنتج نهائي قابل للتوليد </w:t>
+        <w:t xml:space="preserve">وأخيراً، أدخل الذكاء الاصطناعي التوليدي إلى الحقل مسألة جديدة نسبياً تتعلّق بنزاهة العمل الأكاديمي وبإعادة تعريف المهمة البيتية. الأدبيات في هذا الجانب ما زالت في طور التشكّل، غير أنّ المراجعات الأولى في هذا الحقل تميّز بين استخدام الأداة بوصفها بديلاً عن عمل الطالب وبين استخدامها بوصفها شريكاً في التفكير، وترى أنّ الفرق بينهما يتقرّر في تصميم المهمّة لا في الأداة </w:t>
+      </w:r>
+      <w:r>
+        <w:rPr>
+          <w:rFonts w:ascii="Times New Roman" w:cs="Times New Roman" w:eastAsia="Times New Roman" w:hAnsi="Times New Roman"/>
+          <w:b w:val="false"/>
+          <w:sz w:val="28"/>
+          <w:szCs w:val="28"/>
+        </w:rPr>
+        <w:t xml:space="preserve">(Holmes et al., 2019). </w:t>
+      </w:r>
+      <w:r>
+        <w:rPr>
+          <w:rFonts w:ascii="Simplified Arabic" w:cs="Simplified Arabic" w:eastAsia="Simplified Arabic" w:hAnsi="Simplified Arabic"/>
+          <w:b w:val="false"/>
+          <w:sz w:val="28"/>
+          <w:szCs w:val="28"/>
+          <w:rtl/>
+        </w:rPr>
+        <w:t xml:space="preserve">والاتجاه السائد يدعو إلى الانتقال من محاولة منع الأداة إلى إعادة تصميم المهام بحيث تتطلّب عمليات تفكير لا تستطيع الأداة إنتاجها بدل الاكتفاء بمنتج نهائي قابل للتوليد </w:t>
       </w:r>
       <w:r>
         <w:rPr>
@@ -4020,7 +4403,24 @@
           <w:szCs w:val="28"/>
           <w:rtl/>
         </w:rPr>
-        <w:t xml:space="preserve">التزم البحث بأخلاقيات البحث العلمي في كلّ مراحله. شُرحت أهداف البحث لكلّ مشترك قبل بدء المقابلة، وأُوضح له أنّ الأسئلة تنبع من وجهة نظر بحثية أكاديمية ولا تهدف إلى تقييم أدائه المهني ولا إلى الكشف عن أدائه أمام أيّ جهة. وكانت المشاركة طوعية بالكامل، مع التأكيد على حقّ المشترك في الامتناع عن الإجابة عن أيّ سؤال أو الانسحاب من البحث في أيّ مرحلة دون أن يُطلب منه تبرير.</w:t>
+        <w:t xml:space="preserve">التزم البحث بأخلاقيات البحث العلمي في كلّ مراحله. قبل التوجّه إلى أيّ مشترك، حُصل على موافقة إدارات المدارس التي يعمل فيها المشتركون على إجراء المقابلات، وعُرضت عليها أهداف البحث وأداته، وأُوضح لها أنّ البحث لا يتناول المدرسة كمؤسسة ولا يقيّم أداءها ولا أداء معلميها. كذلك جرى العمل تحت إشراف مرشد البحث في الكلّية ووفق إرشاداته في كلّ ما يتعلّق بجمع المعطيات والتعامل معها.</w:t>
+      </w:r>
+    </w:p>
+    <w:p>
+      <w:pPr>
+        <w:bidi/>
+        <w:spacing w:after="120" w:line="360" w:lineRule="auto"/>
+        <w:jc w:val="both"/>
+      </w:pPr>
+      <w:r>
+        <w:rPr>
+          <w:rFonts w:ascii="Simplified Arabic" w:cs="Simplified Arabic" w:eastAsia="Simplified Arabic" w:hAnsi="Simplified Arabic"/>
+          <w:b w:val="false"/>
+          <w:sz w:val="28"/>
+          <w:szCs w:val="28"/>
+          <w:rtl/>
+        </w:rPr>
+        <w:t xml:space="preserve">وشُرحت أهداف البحث لكلّ مشترك قبل بدء المقابلة، وأُوضح له أنّ الأسئلة تنبع من وجهة نظر بحثية أكاديمية ولا تهدف إلى تقييم أدائه المهني ولا إلى الكشف عن أدائه أمام أيّ جهة، لا أمام الإدارة ولا أمام الوزارة. وكانت المشاركة طوعية بالكامل، مع التأكيد على حقّ المشترك في الامتناع عن الإجابة عن أيّ سؤال أو الانسحاب من البحث في أيّ مرحلة دون أن يُطلب منه تبرير، وقد امتنع أحد المشتركين فعلاً عن الإجابة عن جزء من سؤال يتعلّق بزملائه واحتُرم ذلك دون إلحاح.</w:t>
       </w:r>
     </w:p>
     <w:p>
@@ -4125,7 +4525,43 @@
           <w:szCs w:val="28"/>
           <w:rtl/>
         </w:rPr>
-        <w:t xml:space="preserve">أمّا محدوديات البحث فثلاث. الأولى أنّ العيّنة صغيرة ومقصودة، ولذلك لا تسمح النتائج بالتعميم الإحصائي، وإنّما بتعميم تحليلي محدود قد ينطبق على سياقات مشابهة. الثانية أنّ المعطيات كلّها تصريحية، أي أنّها تعكس ما يقوله المعلمون عن ممارستهم لا ما يفعلونه فعلاً داخل الصف، وقد يتدخّل هنا أثر المرغوبية الاجتماعية. والثالثة أنّ البحث أُجري في فترة تشهد تغيّراً سريعاً في أدوات الذكاء الاصطناعي، وهو ما يجعل جزءاً من المعطيات مرتبطاً بلحظته الزمنية.</w:t>
+        <w:t xml:space="preserve">أمّا محدوديات البحث فأربع. الأولى، وهي الأهمّ، أنّ البحث الكيفي لا يسعى إلى التعميم أصلاً ولا تسمح به أدواته. العيّنة صغيرة ومقصودة، والنتائج المعروضة في هذا البحث تصف ثمانية معلمين بعينهم في سياق بعينه، ولا يجوز قراءتها بوصفها وصفاً لمعلمي المرحلة ما فوق الابتدائية عموماً ولا استخلاص نسب أو اتجاهات عامة منها. ما يمكن نقله إلى سياقات أخرى ليس النتيجة بل الفهم: أنماط التفكير التي ظهرت هنا قد تساعد قارئاً في سياق مشابه على قراءة سياقه هو، وهذا ما يُعرف بقابلية النقل لا بالتعميم </w:t>
+      </w:r>
+      <w:r>
+        <w:rPr>
+          <w:rFonts w:ascii="Times New Roman" w:cs="Times New Roman" w:eastAsia="Times New Roman" w:hAnsi="Times New Roman"/>
+          <w:b w:val="false"/>
+          <w:sz w:val="28"/>
+          <w:szCs w:val="28"/>
+        </w:rPr>
+        <w:t xml:space="preserve">(Lincoln &amp; Guba, 1985). </w:t>
+      </w:r>
+      <w:r>
+        <w:rPr>
+          <w:rFonts w:ascii="Simplified Arabic" w:cs="Simplified Arabic" w:eastAsia="Simplified Arabic" w:hAnsi="Simplified Arabic"/>
+          <w:b w:val="false"/>
+          <w:sz w:val="28"/>
+          <w:szCs w:val="28"/>
+          <w:rtl/>
+        </w:rPr>
+        <w:t xml:space="preserve">ولهذا السبب حُرص في عرض النتائج على نسبة كلّ قول إلى صاحبه بالاسم المستعار بدل استخدام صيغ مثل «يرى المعلمون» أو «أثبت البحث».</w:t>
+      </w:r>
+    </w:p>
+    <w:p>
+      <w:pPr>
+        <w:bidi/>
+        <w:spacing w:after="120" w:line="360" w:lineRule="auto"/>
+        <w:jc w:val="both"/>
+      </w:pPr>
+      <w:r>
+        <w:rPr>
+          <w:rFonts w:ascii="Simplified Arabic" w:cs="Simplified Arabic" w:eastAsia="Simplified Arabic" w:hAnsi="Simplified Arabic"/>
+          <w:b w:val="false"/>
+          <w:sz w:val="28"/>
+          <w:szCs w:val="28"/>
+          <w:rtl/>
+        </w:rPr>
+        <w:t xml:space="preserve">الثانية أنّ المعطيات كلّها تصريحية، أي أنّها تعكس ما يقوله المعلمون عن ممارستهم لا ما يفعلونه فعلاً داخل الصفّ، وقد يتدخّل هنا أثر المرغوبية الاجتماعية، خاصة أنّ الباحثة طالبة تربية وقد يميل بعض المشتركين إلى عرض ممارستهم في صورتها المثلى. الثالثة أنّ البحث أُجري في فترة تشهد تغيّراً سريعاً في أدوات الذكاء الاصطناعي، وهو ما يجعل جزءاً من المعطيات مرتبطاً بلحظته الزمنية وقابلاً للتقادم خلال سنة أو سنتين. والرابعة أنّ البحث اقتصر على منظور المعلمين، ولم يشمل أصوات الطلاب ولا الأهل ولا الإدارة، وهي أصوات تشكّل أجزاء أخرى من الصورة نفسها.</w:t>
       </w:r>
     </w:p>
     <w:p>
@@ -4161,7 +4597,24 @@
           <w:szCs w:val="28"/>
           <w:rtl/>
         </w:rPr>
-        <w:t xml:space="preserve">تُعرض نتائج البحث في ثلاثة محاور رئيسية، انبثقت منها ستّ ثيمات مركزية. في كلّ ثيمة يُعرض المفهوم المركزي الذي جمع الرموز الأوّلية، ثمّ مساحات الاتفاق والاختلاف بين المشتركين الثمانية، مدعومة باقتباسات حرفية من أقوالهم. تجدر الإشارة إلى أنّ الاقتباسات أُبقيت بلغة المشتركين كما نُطقت، بما فيها التعبيرات العامية، حفاظاً على أصالة المعطى.</w:t>
+        <w:t xml:space="preserve">تُعرض نتائج البحث في ثلاثة محاور رئيسية، انبثقت منها سبع ثيمات مركزية. في كلّ ثيمة يُعرض المفهوم المركزي الذي جمع الرموز الأوّلية، ثمّ مساحات الاتفاق والاختلاف بين المشتركين الثمانية، مدعومة باقتباسات حرفية من أقوالهم. تجدر الإشارة إلى أنّ الاقتباسات أُبقيت بلغة المشتركين كما نُطقت، بما فيها التعبيرات العامية، حفاظاً على أصالة المعطى.</w:t>
+      </w:r>
+    </w:p>
+    <w:p>
+      <w:pPr>
+        <w:bidi/>
+        <w:spacing w:after="120" w:line="360" w:lineRule="auto"/>
+        <w:jc w:val="both"/>
+      </w:pPr>
+      <w:r>
+        <w:rPr>
+          <w:rFonts w:ascii="Simplified Arabic" w:cs="Simplified Arabic" w:eastAsia="Simplified Arabic" w:hAnsi="Simplified Arabic"/>
+          <w:b w:val="false"/>
+          <w:sz w:val="28"/>
+          <w:szCs w:val="28"/>
+          <w:rtl/>
+        </w:rPr>
+        <w:t xml:space="preserve">وتنبغي قراءة ما يلي بوصفه وصفاً لثمانية مشتركين بأعينهم في سياقهم المهني، لا استخلاصاً عن معلمي المرحلة ما فوق الابتدائية بوجه عام. ولذلك يُنسب كلّ قول إلى صاحبه بالاسم المستعار، وتُذكر مواضع الانفراد كما تُذكر مواضع الالتقاء، ويُتجنّب استخدام صيغ تعميمية من نوع «يرى المعلمون» أو «أثبتت النتائج أنّ التكنولوجيا تفعل كذا».</w:t>
       </w:r>
     </w:p>
     <w:p>
@@ -4490,6 +4943,40 @@
           <w:szCs w:val="28"/>
           <w:rtl/>
         </w:rPr>
+        <w:t xml:space="preserve">وتجدر التفرقة هنا بين فئتين خلطت بينهما بعض أقوال المشتركين في بداية المقابلات ثمّ فصلت بينهما مع التوسّع: الطلاب ذوو التحصيل المنخفض من جهة، والطلاب ذوو صعوبات التعلم المشخّصة من جهة أخرى. ففي الفئة الثانية كان الحديث عن أدوات إتاحة محدّدة لا عن تسهيل عامّ، وكانت الحاجة مختلفة باختلاف الصعوبة نفسها. ذكر نبيل استخدامه تطبيقات تحويل النصّ إلى صوت لطلاب لديهم صعوبة قراءة، وقال إنّ أحدهم «صار يشارك بالنقاش بعد ما كان ساكت سنتين»، لكنّه أضاف تحفّظاً مهنياً على الاستسهال: «سهل كثير إنّي أعطي الطالب الضعيف فيديو وأخلص، بس هيك أنا بعفيه من القراءة، وهو محتاج يتعلّم يقرأ أكثر من غيره. الأداة لازم تكون جسر، مش طريق التفاف».</w:t>
+      </w:r>
+    </w:p>
+    <w:p>
+      <w:pPr>
+        <w:bidi/>
+        <w:spacing w:after="120" w:line="360" w:lineRule="auto"/>
+        <w:jc w:val="both"/>
+      </w:pPr>
+      <w:r>
+        <w:rPr>
+          <w:rFonts w:ascii="Simplified Arabic" w:cs="Simplified Arabic" w:eastAsia="Simplified Arabic" w:hAnsi="Simplified Arabic"/>
+          <w:b w:val="false"/>
+          <w:sz w:val="28"/>
+          <w:szCs w:val="28"/>
+          <w:rtl/>
+        </w:rPr>
+        <w:t xml:space="preserve">وطرح محمد الحالة الأوضح في هذا الجانب حين تحدّث عن طالب لديه عسر كتابة: «عندي طالب عسر كتابة، والتدقيق خلّاه يكتب نصّ كامل لأول مرّة بحياته ويسلّمه وهو فخور. أنا بشوفها إتاحة مش غشّ». وفي المقابل رأت سميرة الأداة نفسها من زاوية معاكسة حين تكون موجّهة إلى طالب لم يبنِ المهارة بعد. الفارق بين الموقفين ليس خلافاً على الأداة بل على الطالب المقصود بها، وهو ما يشير إلى أنّ الحديث عن أثر واحد للتكنولوجيا على «الطلاب ذوي الاحتياجات» يخفي تنوّعاً حقيقياً بين حالة وأخرى.</w:t>
+      </w:r>
+    </w:p>
+    <w:p>
+      <w:pPr>
+        <w:bidi/>
+        <w:spacing w:after="120" w:line="360" w:lineRule="auto"/>
+        <w:jc w:val="both"/>
+      </w:pPr>
+      <w:r>
+        <w:rPr>
+          <w:rFonts w:ascii="Simplified Arabic" w:cs="Simplified Arabic" w:eastAsia="Simplified Arabic" w:hAnsi="Simplified Arabic"/>
+          <w:b w:val="false"/>
+          <w:sz w:val="28"/>
+          <w:szCs w:val="28"/>
+          <w:rtl/>
+        </w:rPr>
         <w:t xml:space="preserve">ومع ذلك ظهر تحفّظ مهمّ من خالد يتعلّق بالفجوة الرقمية بين البيوت لا بين الطلاب داخل الصف: «التمايز حلو بالكلام. بس لما أعطي مهمّة بيتية بالتطبيق، في طالب عنده جهاز وإنترنت وفي طالب بيستنّى أبوه يرجّع الهاتف من الشغل. أنا هيك بعمّق الفرق مش بصغّره». هذه الإفادة أدخلت إلى النقاش بعداً اجتماعياً اقتصادياً لم يظهر عند بقية المشتركين بالوضوح نفسه.</w:t>
       </w:r>
     </w:p>
@@ -4582,6 +5069,92 @@
     <w:p>
       <w:pPr>
         <w:bidi/>
+        <w:spacing w:after="140" w:line="360" w:lineRule="auto"/>
+        <w:jc w:val="right"/>
+      </w:pPr>
+      <w:r>
+        <w:rPr>
+          <w:rFonts w:ascii="Simplified Arabic" w:cs="Simplified Arabic" w:eastAsia="Simplified Arabic" w:hAnsi="Simplified Arabic"/>
+          <w:b/>
+          <w:bCs/>
+          <w:sz w:val="28"/>
+          <w:szCs w:val="28"/>
+          <w:rtl/>
+        </w:rPr>
+        <w:t xml:space="preserve">الثيمة السادسة: بيئة الطالب خارج الصفّ بوصفها شرطاً على الدمج</w:t>
+      </w:r>
+    </w:p>
+    <w:p>
+      <w:pPr>
+        <w:bidi/>
+        <w:spacing w:after="120" w:line="360" w:lineRule="auto"/>
+        <w:jc w:val="both"/>
+      </w:pPr>
+      <w:r>
+        <w:rPr>
+          <w:rFonts w:ascii="Simplified Arabic" w:cs="Simplified Arabic" w:eastAsia="Simplified Arabic" w:hAnsi="Simplified Arabic"/>
+          <w:b w:val="false"/>
+          <w:sz w:val="28"/>
+          <w:szCs w:val="28"/>
+          <w:rtl/>
+        </w:rPr>
+        <w:t xml:space="preserve">ظهرت في المعطيات ثيمة لم تكن مخطّطة في دليل المقابلة، وانبثقت من أقوال المشتركين أنفسهم: أنّ نجاح الدمج التقني لا يتقرّر داخل الصفّ وحده بل في البيت وفي المحيط الاجتماعي للطالب. الحدّ الفاصل الذي رسمه المشتركون كان بين ما يجري تحت إشرافهم داخل الحصة وبين ما يجري بعدها، ففي الحالة الأولى تكون الظروف متساوية نسبياً، وفي الثانية تتدخّل موارد البيت.</w:t>
+      </w:r>
+    </w:p>
+    <w:p>
+      <w:pPr>
+        <w:bidi/>
+        <w:spacing w:after="120" w:line="360" w:lineRule="auto"/>
+        <w:jc w:val="both"/>
+      </w:pPr>
+      <w:r>
+        <w:rPr>
+          <w:rFonts w:ascii="Simplified Arabic" w:cs="Simplified Arabic" w:eastAsia="Simplified Arabic" w:hAnsi="Simplified Arabic"/>
+          <w:b w:val="false"/>
+          <w:sz w:val="28"/>
+          <w:szCs w:val="28"/>
+          <w:rtl/>
+        </w:rPr>
+        <w:t xml:space="preserve">أوضح من عبّر عن ذلك كان خالد، الذي بنى على هذا الأساس قراراً مهنياً واضحاً: «أنا بعلّم بمنطقة فيها بيوت وضعها صعب، وبعرف طلاب بيشتغلوا بالمساء وبعرف طلاب بيتشاركوا هاتف واحد بين ثلاث إخوة. لمّا بحوّل الوظيفة كلّها لتطبيق، أنا بمعاقبهم على إشي مش ذنبهم أبداً». وقد ترجم هذا الموقف إلى ممارسة: يبقي الوظائف على ورق ويجعل البديل الرقمي خياراً لا إلزاماً. وأشارت ريم إلى الوجه نفسه من زاوية الأداة المساعدة: «بستعمل تطبيق بيقرأ النصّ بصوت عالي، وهاد بساعد طلاب عندهم عسر قراءة كثير. بس لازم يكون عندهم جهاز، وهاي مشكلة مش عند كلّهم».</w:t>
+      </w:r>
+    </w:p>
+    <w:p>
+      <w:pPr>
+        <w:bidi/>
+        <w:spacing w:after="120" w:line="360" w:lineRule="auto"/>
+        <w:jc w:val="both"/>
+      </w:pPr>
+      <w:r>
+        <w:rPr>
+          <w:rFonts w:ascii="Simplified Arabic" w:cs="Simplified Arabic" w:eastAsia="Simplified Arabic" w:hAnsi="Simplified Arabic"/>
+          <w:b w:val="false"/>
+          <w:sz w:val="28"/>
+          <w:szCs w:val="28"/>
+          <w:rtl/>
+        </w:rPr>
+        <w:t xml:space="preserve">أمّا الإفادة الأكثر تميّزاً في هذه الثيمة فكانت لهدى، التي وصفت كيف غيّرت رؤية بيوت الطلاب حكمها المهني عليهم: «بفترة الكورونا شفت بيوتهم. شفت مين عنده غرفة لحاله ومين قاعد بالمطبخ مع أربع إخوة. من وقتها صرت أفهم علامات ما كنت أفهمها قبل». وأضافت أنّها كانت قد كتبت عن أحد طلابها ملاحظات سلبية قبل أن ترى ظروفه، وأنّها غيّرت تعاملها معه بالكامل بعد ذلك. هذه الإفادة تحوّل الأداة الرقمية من وسيلة تعليمية إلى نافذة على السياق الاجتماعي، وتكشف في الوقت نفسه أنّ الحكم المهني على الطالب قبل معرفة سياقه قد يكون حكماً خاطئاً.</w:t>
+      </w:r>
+    </w:p>
+    <w:p>
+      <w:pPr>
+        <w:bidi/>
+        <w:spacing w:after="120" w:line="360" w:lineRule="auto"/>
+        <w:jc w:val="both"/>
+      </w:pPr>
+      <w:r>
+        <w:rPr>
+          <w:rFonts w:ascii="Simplified Arabic" w:cs="Simplified Arabic" w:eastAsia="Simplified Arabic" w:hAnsi="Simplified Arabic"/>
+          <w:b w:val="false"/>
+          <w:sz w:val="28"/>
+          <w:szCs w:val="28"/>
+          <w:rtl/>
+        </w:rPr>
+        <w:t xml:space="preserve">وتقاطعت مع هذه الثيمة مسألة اللغة، التي أثارها معلّما المواضيع التي تعتمد على موارد عالمية. قال نبيل: «في مصادر رقمية كثيرة ومنظّمة بالإنجليزي والعبري، وبالعربي أقلّ بكثير وأقلّ تنظيماً، وأنا بضطرّ أترجم أو أختصر بنفسي وهاد شغل إضافي ما حدا بيحسبه». وعبّرت هدى عن الأمر ذاته بصيغة أوضح: «اللي موجود أغلبه بالإنجليزي، وهاد بيخلق فجوة حقيقية بيني وبين معلمة بمدرسة تانية بتعلّم بالعبري وكلّ إشي متوفّر إلها». هذان القولان يضعان تجربة المشتركين داخل سياقها اللغوي والثقافي، ويحذّران من قراءة أيّ معطى في هذا البحث بمعزل عن هذا السياق.</w:t>
+      </w:r>
+    </w:p>
+    <w:p>
+      <w:pPr>
+        <w:bidi/>
         <w:spacing w:after="160" w:line="360" w:lineRule="auto"/>
         <w:jc w:val="right"/>
       </w:pPr>
@@ -4612,7 +5185,7 @@
           <w:szCs w:val="28"/>
           <w:rtl/>
         </w:rPr>
-        <w:t xml:space="preserve">الثيمة السادسة: الحواجز البنيوية والمهنية وسؤال الذكاء الاصطناعي</w:t>
+        <w:t xml:space="preserve">الثيمة السابعة: الحواجز البنيوية والمهنية وسؤال الذكاء الاصطناعي</w:t>
       </w:r>
     </w:p>
     <w:p>
@@ -4989,6 +5562,106 @@
           <w:szCs w:val="28"/>
           <w:rtl/>
         </w:rPr>
+        <w:t xml:space="preserve">وتتّضح الثيمة المتعلّقة ببيئة الطالب خارج الصفّ حين تُقرأ في ضوء النموذج البيئي لبرونفنبرنر </w:t>
+      </w:r>
+      <w:r>
+        <w:rPr>
+          <w:rFonts w:ascii="Times New Roman" w:cs="Times New Roman" w:eastAsia="Times New Roman" w:hAnsi="Times New Roman"/>
+          <w:b w:val="false"/>
+          <w:sz w:val="28"/>
+          <w:szCs w:val="28"/>
+        </w:rPr>
+        <w:t xml:space="preserve">(Bronfenbrenner, 1979). </w:t>
+      </w:r>
+      <w:r>
+        <w:rPr>
+          <w:rFonts w:ascii="Simplified Arabic" w:cs="Simplified Arabic" w:eastAsia="Simplified Arabic" w:hAnsi="Simplified Arabic"/>
+          <w:b w:val="false"/>
+          <w:sz w:val="28"/>
+          <w:szCs w:val="28"/>
+          <w:rtl/>
+        </w:rPr>
+        <w:t xml:space="preserve">فالمهمّة البيتية الرقمية تنتقل من نظام يتحكّم فيه المعلم، وهو الصفّ، إلى نظام لا يتحكّم فيه إطلاقاً، وهو البيت، وموارد هذا النظام الثاني موزّعة توزيعاً غير متساوٍ. القرار الذي اتّخذه خالد بإبقاء الوظائف على ورق ليس تحفّظاً تقنياً بل قراءة دقيقة لهذه البنية، ويتّسق مع ما يشير إليه التقرير الدولي من أنّ الفجوة الرقمية لم تعد فجوة في امتلاك الجهاز بل في جودة الظروف المحيطة به </w:t>
+      </w:r>
+      <w:r>
+        <w:rPr>
+          <w:rFonts w:ascii="Times New Roman" w:cs="Times New Roman" w:eastAsia="Times New Roman" w:hAnsi="Times New Roman"/>
+          <w:b w:val="false"/>
+          <w:sz w:val="28"/>
+          <w:szCs w:val="28"/>
+        </w:rPr>
+        <w:t xml:space="preserve">(UNESCO, 2023). </w:t>
+      </w:r>
+      <w:r>
+        <w:rPr>
+          <w:rFonts w:ascii="Simplified Arabic" w:cs="Simplified Arabic" w:eastAsia="Simplified Arabic" w:hAnsi="Simplified Arabic"/>
+          <w:b w:val="false"/>
+          <w:sz w:val="28"/>
+          <w:szCs w:val="28"/>
+          <w:rtl/>
+        </w:rPr>
+        <w:t xml:space="preserve">ومسألة اللغة التي أثارها نبيل وهدى تنتمي إلى الدائرة الأوسع في النموذج نفسه: هي ليست مشكلة معلم بل خاصية نظام، وهي تشكّل شرطاً على ما يمكن لأيّ معلم في هذا السياق أن يفعله.</w:t>
+      </w:r>
+    </w:p>
+    <w:p>
+      <w:pPr>
+        <w:bidi/>
+        <w:spacing w:after="120" w:line="360" w:lineRule="auto"/>
+        <w:jc w:val="both"/>
+      </w:pPr>
+      <w:r>
+        <w:rPr>
+          <w:rFonts w:ascii="Simplified Arabic" w:cs="Simplified Arabic" w:eastAsia="Simplified Arabic" w:hAnsi="Simplified Arabic"/>
+          <w:b w:val="false"/>
+          <w:sz w:val="28"/>
+          <w:szCs w:val="28"/>
+          <w:rtl/>
+        </w:rPr>
+        <w:t xml:space="preserve">ويضيف الإطار التطوري بعداً تفسيرياً لأحد أكثر الممارسات تكراراً في المعطيات، وهو إخفاء التمايز عن أعين الصفّ. في مرحلة يشكّل فيها تقدير الأقران مصدراً أساسياً لبناء الهوية </w:t>
+      </w:r>
+      <w:r>
+        <w:rPr>
+          <w:rFonts w:ascii="Times New Roman" w:cs="Times New Roman" w:eastAsia="Times New Roman" w:hAnsi="Times New Roman"/>
+          <w:b w:val="false"/>
+          <w:sz w:val="28"/>
+          <w:szCs w:val="28"/>
+        </w:rPr>
+        <w:t xml:space="preserve">(Erikson, </w:t>
+      </w:r>
+      <w:r>
+        <w:rPr>
+          <w:rFonts w:ascii="Simplified Arabic" w:cs="Simplified Arabic" w:eastAsia="Simplified Arabic" w:hAnsi="Simplified Arabic"/>
+          <w:b w:val="false"/>
+          <w:sz w:val="28"/>
+          <w:szCs w:val="28"/>
+          <w:rtl/>
+        </w:rPr>
+        <w:t xml:space="preserve">1968)، تصبح الورقة الملوّنة المختلفة إعلاناً علنياً عن مكانة الطالب لا وسيلة مساندة. الحادثة التي روتها ريم عن الطالب الذي سألها لماذا يأخذ دائماً الورقة الوردية هي التجسيد الدقيق لهذه الآلية، وهي تفسّر لماذا كانت قيمة الأداة الرقمية عند المشتركين في خصوصيتها لا في دقّتها. هذه النتيجة تتقاطع مع مبدأ التصميم الشامل للتعلّم الذي يقترح بناء التنوّع في المهمّة منذ البداية بدل تكييفها لاحقاً بشكل مرئي </w:t>
+      </w:r>
+      <w:r>
+        <w:rPr>
+          <w:rFonts w:ascii="Times New Roman" w:cs="Times New Roman" w:eastAsia="Times New Roman" w:hAnsi="Times New Roman"/>
+          <w:b w:val="false"/>
+          <w:sz w:val="28"/>
+          <w:szCs w:val="28"/>
+        </w:rPr>
+        <w:t xml:space="preserve">(Rose &amp; Meyer, 2002).</w:t>
+      </w:r>
+    </w:p>
+    <w:p>
+      <w:pPr>
+        <w:bidi/>
+        <w:spacing w:after="120" w:line="360" w:lineRule="auto"/>
+        <w:jc w:val="both"/>
+      </w:pPr>
+      <w:r>
+        <w:rPr>
+          <w:rFonts w:ascii="Simplified Arabic" w:cs="Simplified Arabic" w:eastAsia="Simplified Arabic" w:hAnsi="Simplified Arabic"/>
+          <w:b w:val="false"/>
+          <w:sz w:val="28"/>
+          <w:szCs w:val="28"/>
+          <w:rtl/>
+        </w:rPr>
         <w:t xml:space="preserve">أمّا الحواجز التي وصفها المشتركون فتتوزّع بدقّة على التمييز الذي وضعته إرتمر </w:t>
       </w:r>
       <w:r>
@@ -5061,7 +5734,7 @@
           <w:szCs w:val="28"/>
           <w:rtl/>
         </w:rPr>
-        <w:t xml:space="preserve">الاستنتاج المركزي الذي يخرج به هذا البحث هو أنّ سؤال دمج التكنولوجيا في المرحلة ما فوق الابتدائية لم يعد سؤالاً عن الاستخدام أو عدمه، فالجميع يستخدم، بل صار سؤالاً عن معيار الاختيار. المعيار الذي صاغه نبيل في جملة واحدة، وهو ما إذا كانت الأداة تجعل الطالب يفكّر أكثر أم تجعله ينبسط أكثر، يلخّص الفارق بين دمج يغيّر أسلوب التدريس ودمج يزيّنه. وحين يُترك هذا المعيار لاجتهاد كلّ معلم على حدة، تصبح جودة الدمج في المدرسة الواحدة متفاوتة بعدد معلميها.</w:t>
+        <w:t xml:space="preserve">الاستنتاج المركزي الذي يخرج به هذا البحث، في حدود المشتركين الثمانية وسياقهم، هو أنّ سؤال دمج التكنولوجيا في المرحلة ما فوق الابتدائية لم يعد سؤالاً عن الاستخدام أو عدمه، فجميع المشتركين يستخدمون، بل صار سؤالاً عن معيار الاختيار. المعيار الذي صاغه نبيل في جملة واحدة، وهو ما إذا كانت الأداة تجعل الطالب يفكّر أكثر أم تجعله ينبسط أكثر، يلخّص الفارق بين دمج يغيّر أسلوب التدريس ودمج يزيّنه. وحين يُترك هذا المعيار لاجتهاد كلّ معلم على حدة، تصبح جودة الدمج في المدرسة الواحدة متفاوتة بعدد معلميها.</w:t>
       </w:r>
     </w:p>
     <w:p>
@@ -5339,7 +6012,7 @@
           <w:sz w:val="28"/>
           <w:szCs w:val="28"/>
         </w:rPr>
-        <w:t xml:space="preserve">Carr, N. (2010). The shallows: What the Internet is doing to our brains. W. W. Norton.</w:t>
+        <w:t xml:space="preserve">Bronfenbrenner, U. (1979). The ecology of human development: Experiments by nature and design. Harvard University Press.</w:t>
       </w:r>
     </w:p>
     <w:p>
@@ -5355,7 +6028,7 @@
           <w:sz w:val="28"/>
           <w:szCs w:val="28"/>
         </w:rPr>
-        <w:t xml:space="preserve">Creswell, J. W. (2013). Qualitative inquiry and research design: Choosing among five approaches (3rd ed.). Sage.</w:t>
+        <w:t xml:space="preserve">Carr, N. (2010). The shallows: What the Internet is doing to our brains. W. W. Norton.</w:t>
       </w:r>
     </w:p>
     <w:p>
@@ -5371,7 +6044,7 @@
           <w:sz w:val="28"/>
           <w:szCs w:val="28"/>
         </w:rPr>
-        <w:t xml:space="preserve">Davis, F. D. (1989). Perceived usefulness, perceived ease of use, and user acceptance of information technology. MIS Quarterly, 13(3), 319-340.</w:t>
+        <w:t xml:space="preserve">Creswell, J. W. (2013). Qualitative inquiry and research design: Choosing among five approaches (3rd ed.). Sage.</w:t>
       </w:r>
     </w:p>
     <w:p>
@@ -5387,7 +6060,7 @@
           <w:sz w:val="28"/>
           <w:szCs w:val="28"/>
         </w:rPr>
-        <w:t xml:space="preserve">Deci, E. L., &amp; Ryan, R. M. (2000). The "what" and "why" of goal pursuits: Human needs and the self-determination of behavior. Psychological Inquiry, 11(4), 227-268.</w:t>
+        <w:t xml:space="preserve">Davis, F. D. (1989). Perceived usefulness, perceived ease of use, and user acceptance of information technology. MIS Quarterly, 13(3), 319-340.</w:t>
       </w:r>
     </w:p>
     <w:p>
@@ -5403,7 +6076,7 @@
           <w:sz w:val="28"/>
           <w:szCs w:val="28"/>
         </w:rPr>
-        <w:t xml:space="preserve">Ertmer, P. A. (1999). Addressing first- and second-order barriers to change: Strategies for technology integration. Educational Technology Research and Development, 47(4), 47-61.</w:t>
+        <w:t xml:space="preserve">Deci, E. L., &amp; Ryan, R. M. (2000). The "what" and "why" of goal pursuits: Human needs and the self-determination of behavior. Psychological Inquiry, 11(4), 227-268.</w:t>
       </w:r>
     </w:p>
     <w:p>
@@ -5419,7 +6092,7 @@
           <w:sz w:val="28"/>
           <w:szCs w:val="28"/>
         </w:rPr>
-        <w:t xml:space="preserve">Ertmer, P. A., &amp; Ottenbreit-Leftwich, A. T. (2010). Teacher technology change: How knowledge, confidence, beliefs, and culture intersect. Journal of Research on Technology in Education, 42(3), 255-284.</w:t>
+        <w:t xml:space="preserve">Ertmer, P. A. (1999). Addressing first- and second-order barriers to change: Strategies for technology integration. Educational Technology Research and Development, 47(4), 47-61.</w:t>
       </w:r>
     </w:p>
     <w:p>
@@ -5435,7 +6108,7 @@
           <w:sz w:val="28"/>
           <w:szCs w:val="28"/>
         </w:rPr>
-        <w:t xml:space="preserve">Gale, N. K., Heath, G., Cameron, E., Rashid, S., &amp; Redwood, S. (2013). Using the framework method for the analysis of qualitative data in multi-disciplinary health research. BMC Medical Research Methodology, 13, 117.</w:t>
+        <w:t xml:space="preserve">Ertmer, P. A., &amp; Ottenbreit-Leftwich, A. T. (2010). Teacher technology change: How knowledge, confidence, beliefs, and culture intersect. Journal of Research on Technology in Education, 42(3), 255-284.</w:t>
       </w:r>
     </w:p>
     <w:p>
@@ -5451,7 +6124,7 @@
           <w:sz w:val="28"/>
           <w:szCs w:val="28"/>
         </w:rPr>
-        <w:t xml:space="preserve">Hattie, J. (2009). Visible learning: A synthesis of over 800 meta-analyses relating to achievement. Routledge.</w:t>
+        <w:t xml:space="preserve">Erikson, E. H. (1968). Identity: Youth and crisis. W. W. Norton.</w:t>
       </w:r>
     </w:p>
     <w:p>
@@ -5467,7 +6140,7 @@
           <w:sz w:val="28"/>
           <w:szCs w:val="28"/>
         </w:rPr>
-        <w:t xml:space="preserve">Kirschner, P. A., &amp; De Bruyckere, P. (2017). The myths of the digital native and the multitasker. Teaching and Teacher Education, 67, 135-142.</w:t>
+        <w:t xml:space="preserve">Gale, N. K., Heath, G., Cameron, E., Rashid, S., &amp; Redwood, S. (2013). Using the framework method for the analysis of qualitative data in multi-disciplinary health research. BMC Medical Research Methodology, 13, 117.</w:t>
       </w:r>
     </w:p>
     <w:p>
@@ -5483,7 +6156,7 @@
           <w:sz w:val="28"/>
           <w:szCs w:val="28"/>
         </w:rPr>
-        <w:t xml:space="preserve">Lincoln, Y. S., &amp; Guba, E. G. (1985). Naturalistic inquiry. Sage.</w:t>
+        <w:t xml:space="preserve">Hattie, J. (2009). Visible learning: A synthesis of over 800 meta-analyses relating to achievement. Routledge.</w:t>
       </w:r>
     </w:p>
     <w:p>
@@ -5499,7 +6172,7 @@
           <w:sz w:val="28"/>
           <w:szCs w:val="28"/>
         </w:rPr>
-        <w:t xml:space="preserve">Mishra, P., &amp; Koehler, M. J. (2006). Technological pedagogical content knowledge: A framework for teacher knowledge. Teachers College Record, 108(6), 1017-1054.</w:t>
+        <w:t xml:space="preserve">Holmes, W., Bialik, M., &amp; Fadel, C. (2019). Artificial intelligence in education: Promises and implications for teaching and learning. Center for Curriculum Redesign.</w:t>
       </w:r>
     </w:p>
     <w:p>
@@ -5515,7 +6188,7 @@
           <w:sz w:val="28"/>
           <w:szCs w:val="28"/>
         </w:rPr>
-        <w:t xml:space="preserve">OECD. (2015). Students, computers and learning: Making the connection. OECD Publishing.</w:t>
+        <w:t xml:space="preserve">Kirschner, P. A., &amp; De Bruyckere, P. (2017). The myths of the digital native and the multitasker. Teaching and Teacher Education, 67, 135-142.</w:t>
       </w:r>
     </w:p>
     <w:p>
@@ -5531,7 +6204,7 @@
           <w:sz w:val="28"/>
           <w:szCs w:val="28"/>
         </w:rPr>
-        <w:t xml:space="preserve">Patton, M. Q. (2015). Qualitative research and evaluation methods (4th ed.). Sage.</w:t>
+        <w:t xml:space="preserve">Lincoln, Y. S., &amp; Guba, E. G. (1985). Naturalistic inquiry. Sage.</w:t>
       </w:r>
     </w:p>
     <w:p>
@@ -5547,7 +6220,7 @@
           <w:sz w:val="28"/>
           <w:szCs w:val="28"/>
         </w:rPr>
-        <w:t xml:space="preserve">Puentedura, R. R. (2006). Transformation, technology, and education [Blog post]. http://hippasus.com/resources/tte/</w:t>
+        <w:t xml:space="preserve">Mishra, P., &amp; Koehler, M. J. (2006). Technological pedagogical content knowledge: A framework for teacher knowledge. Teachers College Record, 108(6), 1017-1054.</w:t>
       </w:r>
     </w:p>
     <w:p>
@@ -5563,7 +6236,7 @@
           <w:sz w:val="28"/>
           <w:szCs w:val="28"/>
         </w:rPr>
-        <w:t xml:space="preserve">Ritchie, J., &amp; Spencer, L. (1994). Qualitative data analysis for applied policy research. In A. Bryman &amp; R. G. Burgess (Eds.), Analyzing qualitative data (pp. 173-194). Routledge.</w:t>
+        <w:t xml:space="preserve">OECD. (2015). Students, computers and learning: Making the connection. OECD Publishing.</w:t>
       </w:r>
     </w:p>
     <w:p>
@@ -5579,7 +6252,7 @@
           <w:sz w:val="28"/>
           <w:szCs w:val="28"/>
         </w:rPr>
-        <w:t xml:space="preserve">Selwyn, N. (2016). Education and technology: Key issues and debates (2nd ed.). Bloomsbury.</w:t>
+        <w:t xml:space="preserve">Patton, M. Q. (2015). Qualitative research and evaluation methods (4th ed.). Sage.</w:t>
       </w:r>
     </w:p>
     <w:p>
@@ -5595,7 +6268,7 @@
           <w:sz w:val="28"/>
           <w:szCs w:val="28"/>
         </w:rPr>
-        <w:t xml:space="preserve">Sparrow, B., Liu, J., &amp; Wegner, D. M. (2011). Google effects on memory: Cognitive consequences of having information at our fingertips. Science, 333(6043), 776-778.</w:t>
+        <w:t xml:space="preserve">Piaget, J., &amp; Inhelder, B. (1969). The psychology of the child (H. Weaver, Trans.). Basic Books. (Original work published 1958)</w:t>
       </w:r>
     </w:p>
     <w:p>
@@ -5611,7 +6284,7 @@
           <w:sz w:val="28"/>
           <w:szCs w:val="28"/>
         </w:rPr>
-        <w:t xml:space="preserve">Strauss, A., &amp; Corbin, J. (1990). Basics of qualitative research: Grounded theory procedures and techniques. Sage.</w:t>
+        <w:t xml:space="preserve">Puentedura, R. R. (2006). Transformation, technology, and education [Blog post]. http://hippasus.com/resources/tte/</w:t>
       </w:r>
     </w:p>
     <w:p>
@@ -5627,7 +6300,103 @@
           <w:sz w:val="28"/>
           <w:szCs w:val="28"/>
         </w:rPr>
+        <w:t xml:space="preserve">Ritchie, J., &amp; Spencer, L. (1994). Qualitative data analysis for applied policy research. In A. Bryman &amp; R. G. Burgess (Eds.), Analyzing qualitative data (pp. 173-194). Routledge.</w:t>
+      </w:r>
+    </w:p>
+    <w:p>
+      <w:pPr>
+        <w:spacing w:after="120" w:line="360" w:lineRule="auto"/>
+        <w:ind w:left="709" w:hanging="709"/>
+        <w:jc w:val="left"/>
+      </w:pPr>
+      <w:r>
+        <w:rPr>
+          <w:rFonts w:ascii="Times New Roman" w:cs="Times New Roman" w:eastAsia="Times New Roman" w:hAnsi="Times New Roman"/>
+          <w:b w:val="false"/>
+          <w:sz w:val="28"/>
+          <w:szCs w:val="28"/>
+        </w:rPr>
+        <w:t xml:space="preserve">Rose, D. H., &amp; Meyer, A. (2002). Teaching every student in the digital age: Universal design for learning. ASCD.</w:t>
+      </w:r>
+    </w:p>
+    <w:p>
+      <w:pPr>
+        <w:spacing w:after="120" w:line="360" w:lineRule="auto"/>
+        <w:ind w:left="709" w:hanging="709"/>
+        <w:jc w:val="left"/>
+      </w:pPr>
+      <w:r>
+        <w:rPr>
+          <w:rFonts w:ascii="Times New Roman" w:cs="Times New Roman" w:eastAsia="Times New Roman" w:hAnsi="Times New Roman"/>
+          <w:b w:val="false"/>
+          <w:sz w:val="28"/>
+          <w:szCs w:val="28"/>
+        </w:rPr>
+        <w:t xml:space="preserve">Selwyn, N. (2016). Education and technology: Key issues and debates (2nd ed.). Bloomsbury.</w:t>
+      </w:r>
+    </w:p>
+    <w:p>
+      <w:pPr>
+        <w:spacing w:after="120" w:line="360" w:lineRule="auto"/>
+        <w:ind w:left="709" w:hanging="709"/>
+        <w:jc w:val="left"/>
+      </w:pPr>
+      <w:r>
+        <w:rPr>
+          <w:rFonts w:ascii="Times New Roman" w:cs="Times New Roman" w:eastAsia="Times New Roman" w:hAnsi="Times New Roman"/>
+          <w:b w:val="false"/>
+          <w:sz w:val="28"/>
+          <w:szCs w:val="28"/>
+        </w:rPr>
+        <w:t xml:space="preserve">Sparrow, B., Liu, J., &amp; Wegner, D. M. (2011). Google effects on memory: Cognitive consequences of having information at our fingertips. Science, 333(6043), 776-778.</w:t>
+      </w:r>
+    </w:p>
+    <w:p>
+      <w:pPr>
+        <w:spacing w:after="120" w:line="360" w:lineRule="auto"/>
+        <w:ind w:left="709" w:hanging="709"/>
+        <w:jc w:val="left"/>
+      </w:pPr>
+      <w:r>
+        <w:rPr>
+          <w:rFonts w:ascii="Times New Roman" w:cs="Times New Roman" w:eastAsia="Times New Roman" w:hAnsi="Times New Roman"/>
+          <w:b w:val="false"/>
+          <w:sz w:val="28"/>
+          <w:szCs w:val="28"/>
+        </w:rPr>
+        <w:t xml:space="preserve">Strauss, A., &amp; Corbin, J. (1990). Basics of qualitative research: Grounded theory procedures and techniques. Sage.</w:t>
+      </w:r>
+    </w:p>
+    <w:p>
+      <w:pPr>
+        <w:spacing w:after="120" w:line="360" w:lineRule="auto"/>
+        <w:ind w:left="709" w:hanging="709"/>
+        <w:jc w:val="left"/>
+      </w:pPr>
+      <w:r>
+        <w:rPr>
+          <w:rFonts w:ascii="Times New Roman" w:cs="Times New Roman" w:eastAsia="Times New Roman" w:hAnsi="Times New Roman"/>
+          <w:b w:val="false"/>
+          <w:sz w:val="28"/>
+          <w:szCs w:val="28"/>
+        </w:rPr>
         <w:t xml:space="preserve">Sweller, J. (1988). Cognitive load during problem solving: Effects on learning. Cognitive Science, 12(2), 257-285.</w:t>
+      </w:r>
+    </w:p>
+    <w:p>
+      <w:pPr>
+        <w:spacing w:after="120" w:line="360" w:lineRule="auto"/>
+        <w:ind w:left="709" w:hanging="709"/>
+        <w:jc w:val="left"/>
+      </w:pPr>
+      <w:r>
+        <w:rPr>
+          <w:rFonts w:ascii="Times New Roman" w:cs="Times New Roman" w:eastAsia="Times New Roman" w:hAnsi="Times New Roman"/>
+          <w:b w:val="false"/>
+          <w:sz w:val="28"/>
+          <w:szCs w:val="28"/>
+        </w:rPr>
+        <w:t xml:space="preserve">Timotheou, S., Miliou, O., Dimitriadis, Y., Sobrino, S. V., Giannoutsou, N., Cachia, R., Monés, A. M., &amp; Ioannou, A. (2023). Impacts of digital technologies on education and factors influencing schools digital capacity and transformation: A literature review. Education and Information Technologies, 28(6), 6695-6726.</w:t>
       </w:r>
     </w:p>
     <w:p>

</xml_diff>

<commit_message>
Add framework analysis tables as appendix 10 of the technology seminar
Three tables covering all seven themes across the three interview axes, in
the theme / category / agreement-disagreement / live-quotes format.

Co-Authored-By: Claude Fable 5 <noreply@anthropic.com>
Claude-Session: https://claude.ai/code/session_01SLEdWJeTzqGJbSWTzfumWY
</commit_message>
<xml_diff>
--- a/seminar/سمينار - دور التكنولوجيا في تطوير أساليب التدريس.docx
+++ b/seminar/سمينار - دور التكنولوجيا في تطوير أساليب التدريس.docx
@@ -4202,7 +4202,7 @@
           <w:szCs w:val="28"/>
           <w:rtl/>
         </w:rPr>
-        <w:t xml:space="preserve">ويظهر دليل المقابلة كاملاً في الملحق رقم 1، وتظهر المقابلات المفرّغة في الملاحق من 2 إلى 9.</w:t>
+        <w:t xml:space="preserve">ويظهر دليل المقابلة كاملاً في الملحق رقم 1، وتظهر المقابلات المفرّغة في الملاحق من 2 إلى 9، وتظهر جداول تحليل الإطار الكيفي في الملحق رقم 10.</w:t>
       </w:r>
     </w:p>
     <w:p>
@@ -11523,6 +11523,1967 @@
         </w:rPr>
         <w:t xml:space="preserve">ج: أنا متحمّسة وخايفة بنفس الوقت، وما بقدر أفصل. متحمّسة لأنّي جرّبته بالتحضير وهو بيوفّر عليّ وقت هائل، وأنا الوقت أهمّ إشي عندي بالحياة هلق. بحضّر فيه أسئلة بمستويات مختلفة، وبطلب منه يبسّط لي نصّ علمي لمستوى سابع، وهاد كان بياخد منّي نصّ ساعة وصار بياخد خمس دقايق. يعني عملياً أعطاني وقت مع أولادي. خايفة لأنّي بشوف الطلاب بيستعملوه بالوظايف وأنا ما بعرف كيف أتعامل مع هاد ولا حدا وجّهني. بالعلوم الوضع أسهل شوي من اللغات، لأنّه بقدر أطلب تجربة وتقرير عن إشي عملوه بإيدهم وصوّروه. نيّتي إنّي أزيد المهامّ العملية وأقلّل المهامّ المكتوبة بالبيت. وبنيّتي كمان، وهاد أهمّ إشي، إنّي أعلّمهم يستعملوه صحّ: بدّي أعمل درس بستعمله فيه قدّامهم وأوريهم إنّه بيغلط وبيخترع مصادر، لأنّه لمّا يشوفوا بعيونهم إنّه بيغلط رح يوقفوا يعاملوه كمصدر مقدّس.</w:t>
       </w:r>
+    </w:p>
+    <w:p>
+      <w:pPr>
+        <w:pageBreakBefore/>
+        <w:bidi/>
+        <w:spacing w:after="160" w:line="360" w:lineRule="auto"/>
+        <w:jc w:val="right"/>
+      </w:pPr>
+      <w:r>
+        <w:rPr>
+          <w:rFonts w:ascii="Simplified Arabic" w:cs="Simplified Arabic" w:eastAsia="Simplified Arabic" w:hAnsi="Simplified Arabic"/>
+          <w:b/>
+          <w:bCs/>
+          <w:sz w:val="30"/>
+          <w:szCs w:val="30"/>
+          <w:rtl/>
+        </w:rPr>
+        <w:t xml:space="preserve">الملحق رقم 10: جداول تحليل الإطار الكيفي</w:t>
+      </w:r>
+    </w:p>
+    <w:p>
+      <w:pPr>
+        <w:bidi/>
+        <w:spacing w:after="120" w:line="360" w:lineRule="auto"/>
+        <w:jc w:val="both"/>
+      </w:pPr>
+      <w:r>
+        <w:rPr>
+          <w:rFonts w:ascii="Simplified Arabic" w:cs="Simplified Arabic" w:eastAsia="Simplified Arabic" w:hAnsi="Simplified Arabic"/>
+          <w:b w:val="false"/>
+          <w:sz w:val="28"/>
+          <w:szCs w:val="28"/>
+          <w:rtl/>
+        </w:rPr>
+        <w:t xml:space="preserve">تُعرض في هذا الملحق نتائج تحليل الإطار الكيفي </w:t>
+      </w:r>
+      <w:r>
+        <w:rPr>
+          <w:rFonts w:ascii="Times New Roman" w:cs="Times New Roman" w:eastAsia="Times New Roman" w:hAnsi="Times New Roman"/>
+          <w:b w:val="false"/>
+          <w:sz w:val="28"/>
+          <w:szCs w:val="28"/>
+        </w:rPr>
+        <w:t xml:space="preserve">(Framework Analysis) </w:t>
+      </w:r>
+      <w:r>
+        <w:rPr>
+          <w:rFonts w:ascii="Simplified Arabic" w:cs="Simplified Arabic" w:eastAsia="Simplified Arabic" w:hAnsi="Simplified Arabic"/>
+          <w:b w:val="false"/>
+          <w:sz w:val="28"/>
+          <w:szCs w:val="28"/>
+          <w:rtl/>
+        </w:rPr>
+        <w:t xml:space="preserve">للمقابلات الثماني، مرتّبة في جداول وفق المحاور الثلاثة لأداة البحث. يعرض كلّ جدول الثيمة الرئيسية، والفئة الشاملة التي جُمعت تحتها المؤشرات والرموز الأوّلية، وحالة التحليل من حيث المتفق عليه والمختلف عليه والإجابات المتميّزة، مدعومة باقتباسات حرفية من أقوال المشتركين بأسمائهم المستعارة. وقد جرى هذا التحليل وفق مراحل الترميز المفتوح فالمحوري فالانتقائي الموصوفة في فصل المنهجية.</w:t>
+      </w:r>
+    </w:p>
+    <w:p>
+      <w:pPr>
+        <w:bidi/>
+        <w:spacing w:after="120" w:line="360" w:lineRule="auto"/>
+      </w:pPr>
+    </w:p>
+    <w:p>
+      <w:pPr>
+        <w:bidi/>
+        <w:spacing w:after="120" w:line="360" w:lineRule="auto"/>
+        <w:jc w:val="both"/>
+      </w:pPr>
+      <w:r>
+        <w:rPr>
+          <w:rFonts w:ascii="Simplified Arabic" w:cs="Simplified Arabic" w:eastAsia="Simplified Arabic" w:hAnsi="Simplified Arabic"/>
+          <w:b/>
+          <w:bCs/>
+          <w:sz w:val="26"/>
+          <w:szCs w:val="26"/>
+          <w:rtl/>
+        </w:rPr>
+        <w:t xml:space="preserve">جدول تحليل الإطار الكيفي للمحور الأول: دور التكنولوجيا في تطوير أساليب التدريس ما فوق الابتدائي</w:t>
+      </w:r>
+    </w:p>
+    <w:tbl>
+      <w:tblPr>
+        <w:bidiVisual/>
+        <w:tblW w:type="dxa" w:w="9072"/>
+        <w:tblBorders>
+          <w:top w:val="single" w:color="auto" w:sz="4"/>
+          <w:left w:val="single" w:color="auto" w:sz="4"/>
+          <w:bottom w:val="single" w:color="auto" w:sz="4"/>
+          <w:right w:val="single" w:color="auto" w:sz="4"/>
+          <w:insideH w:val="single" w:color="auto" w:sz="4"/>
+          <w:insideV w:val="single" w:color="auto" w:sz="4"/>
+        </w:tblBorders>
+      </w:tblPr>
+      <w:tblGrid>
+        <w:gridCol w:w="1700"/>
+        <w:gridCol w:w="2200"/>
+        <w:gridCol w:w="2600"/>
+        <w:gridCol w:w="2572"/>
+      </w:tblGrid>
+      <w:tr>
+        <w:trPr>
+          <w:tblHeader/>
+        </w:trPr>
+        <w:tc>
+          <w:tcPr>
+            <w:tcW w:type="dxa" w:w="1700"/>
+            <w:shd w:fill="E8E4EF" w:val="clear"/>
+          </w:tcPr>
+          <w:p>
+            <w:pPr>
+              <w:bidi/>
+              <w:spacing w:after="40" w:before="40" w:line="240" w:lineRule="auto"/>
+              <w:jc w:val="center"/>
+            </w:pPr>
+            <w:r>
+              <w:rPr>
+                <w:rFonts w:ascii="Simplified Arabic" w:cs="Simplified Arabic" w:eastAsia="Simplified Arabic" w:hAnsi="Simplified Arabic"/>
+                <w:b/>
+                <w:bCs/>
+                <w:sz w:val="22"/>
+                <w:szCs w:val="22"/>
+                <w:rtl/>
+              </w:rPr>
+              <w:t xml:space="preserve">الثيمة الرئيسية</w:t>
+            </w:r>
+          </w:p>
+        </w:tc>
+        <w:tc>
+          <w:tcPr>
+            <w:tcW w:type="dxa" w:w="2200"/>
+            <w:shd w:fill="E8E4EF" w:val="clear"/>
+          </w:tcPr>
+          <w:p>
+            <w:pPr>
+              <w:bidi/>
+              <w:spacing w:after="40" w:before="40" w:line="240" w:lineRule="auto"/>
+              <w:jc w:val="center"/>
+            </w:pPr>
+            <w:r>
+              <w:rPr>
+                <w:rFonts w:ascii="Simplified Arabic" w:cs="Simplified Arabic" w:eastAsia="Simplified Arabic" w:hAnsi="Simplified Arabic"/>
+                <w:b/>
+                <w:bCs/>
+                <w:sz w:val="22"/>
+                <w:szCs w:val="22"/>
+                <w:rtl/>
+              </w:rPr>
+              <w:t xml:space="preserve">الفئة الشاملة للمؤشرات والرموز</w:t>
+            </w:r>
+          </w:p>
+        </w:tc>
+        <w:tc>
+          <w:tcPr>
+            <w:tcW w:type="dxa" w:w="2600"/>
+            <w:shd w:fill="E8E4EF" w:val="clear"/>
+          </w:tcPr>
+          <w:p>
+            <w:pPr>
+              <w:bidi/>
+              <w:spacing w:after="40" w:before="40" w:line="240" w:lineRule="auto"/>
+              <w:jc w:val="center"/>
+            </w:pPr>
+            <w:r>
+              <w:rPr>
+                <w:rFonts w:ascii="Simplified Arabic" w:cs="Simplified Arabic" w:eastAsia="Simplified Arabic" w:hAnsi="Simplified Arabic"/>
+                <w:b/>
+                <w:bCs/>
+                <w:sz w:val="22"/>
+                <w:szCs w:val="22"/>
+                <w:rtl/>
+              </w:rPr>
+              <w:t xml:space="preserve">حالة التحليل (المتفق والمختلف عليه) والإجابات المتميزة</w:t>
+            </w:r>
+          </w:p>
+        </w:tc>
+        <w:tc>
+          <w:tcPr>
+            <w:tcW w:type="dxa" w:w="2572"/>
+            <w:shd w:fill="E8E4EF" w:val="clear"/>
+          </w:tcPr>
+          <w:p>
+            <w:pPr>
+              <w:bidi/>
+              <w:spacing w:after="40" w:before="40" w:line="240" w:lineRule="auto"/>
+              <w:jc w:val="center"/>
+            </w:pPr>
+            <w:r>
+              <w:rPr>
+                <w:rFonts w:ascii="Simplified Arabic" w:cs="Simplified Arabic" w:eastAsia="Simplified Arabic" w:hAnsi="Simplified Arabic"/>
+                <w:b/>
+                <w:bCs/>
+                <w:sz w:val="22"/>
+                <w:szCs w:val="22"/>
+                <w:rtl/>
+              </w:rPr>
+              <w:t xml:space="preserve">اقتباسات حية من المشاركين</w:t>
+            </w:r>
+          </w:p>
+        </w:tc>
+      </w:tr>
+      <w:tr>
+        <w:tc>
+          <w:tcPr>
+            <w:tcW w:type="dxa" w:w="1700"/>
+          </w:tcPr>
+          <w:p>
+            <w:pPr>
+              <w:bidi/>
+              <w:spacing w:after="40" w:before="40" w:line="240" w:lineRule="auto"/>
+              <w:jc w:val="right"/>
+            </w:pPr>
+            <w:r>
+              <w:rPr>
+                <w:rFonts w:ascii="Simplified Arabic" w:cs="Simplified Arabic" w:eastAsia="Simplified Arabic" w:hAnsi="Simplified Arabic"/>
+                <w:b w:val="false"/>
+                <w:sz w:val="20"/>
+                <w:szCs w:val="20"/>
+                <w:rtl/>
+              </w:rPr>
+              <w:t xml:space="preserve">1. التحوّل الديداكتيكي من التلقين إلى التفاعلية النشطة</w:t>
+            </w:r>
+          </w:p>
+        </w:tc>
+        <w:tc>
+          <w:tcPr>
+            <w:tcW w:type="dxa" w:w="2200"/>
+          </w:tcPr>
+          <w:p>
+            <w:pPr>
+              <w:bidi/>
+              <w:spacing w:after="40" w:before="40" w:line="240" w:lineRule="auto"/>
+              <w:jc w:val="right"/>
+            </w:pPr>
+            <w:r>
+              <w:rPr>
+                <w:rFonts w:ascii="Simplified Arabic" w:cs="Simplified Arabic" w:eastAsia="Simplified Arabic" w:hAnsi="Simplified Arabic"/>
+                <w:b w:val="false"/>
+                <w:sz w:val="20"/>
+                <w:szCs w:val="20"/>
+                <w:rtl/>
+              </w:rPr>
+              <w:t xml:space="preserve">«التمكين التفاعلي وتحفيز الشغف المعرفي للطلاب»</w:t>
+            </w:r>
+          </w:p>
+          <w:p>
+            <w:pPr>
+              <w:bidi/>
+              <w:spacing w:after="40" w:before="40" w:line="240" w:lineRule="auto"/>
+              <w:jc w:val="right"/>
+            </w:pPr>
+            <w:r>
+              <w:rPr>
+                <w:rFonts w:ascii="Simplified Arabic" w:cs="Simplified Arabic" w:eastAsia="Simplified Arabic" w:hAnsi="Simplified Arabic"/>
+                <w:b w:val="false"/>
+                <w:sz w:val="20"/>
+                <w:szCs w:val="20"/>
+                <w:rtl/>
+              </w:rPr>
+              <w:t xml:space="preserve">تشمل: تفعيل دور الطالب، كسر روتين الحصة التقليدية، تنوّع مصادر المعرفة، استخدام المسابقات الرقمية لتسهيل المفاهيم المجرّدة، إظهار ما لا يُرى بالمحاكاة، وزيادة الحيوية والنقاش التشاركي.</w:t>
+            </w:r>
+          </w:p>
+        </w:tc>
+        <w:tc>
+          <w:tcPr>
+            <w:tcW w:type="dxa" w:w="2600"/>
+          </w:tcPr>
+          <w:p>
+            <w:pPr>
+              <w:bidi/>
+              <w:spacing w:after="40" w:before="40" w:line="240" w:lineRule="auto"/>
+              <w:jc w:val="right"/>
+            </w:pPr>
+            <w:r>
+              <w:rPr>
+                <w:rFonts w:ascii="Simplified Arabic" w:cs="Simplified Arabic" w:eastAsia="Simplified Arabic" w:hAnsi="Simplified Arabic"/>
+                <w:b w:val="false"/>
+                <w:sz w:val="20"/>
+                <w:szCs w:val="20"/>
+                <w:rtl/>
+              </w:rPr>
+              <w:t xml:space="preserve">متفق عليه: إجماع تامّ بين المشتركين الثمانية على أنّ التكنولوجيا نقلت الحصة من التلقين السلبي إلى بيئة تفاعلية تزيد انتباه الطلاب وانخراطهم.</w:t>
+            </w:r>
+          </w:p>
+          <w:p>
+            <w:pPr>
+              <w:bidi/>
+              <w:spacing w:after="40" w:before="40" w:line="240" w:lineRule="auto"/>
+              <w:jc w:val="right"/>
+            </w:pPr>
+            <w:r>
+              <w:rPr>
+                <w:rFonts w:ascii="Simplified Arabic" w:cs="Simplified Arabic" w:eastAsia="Simplified Arabic" w:hAnsi="Simplified Arabic"/>
+                <w:b w:val="false"/>
+                <w:sz w:val="20"/>
+                <w:szCs w:val="20"/>
+                <w:rtl/>
+              </w:rPr>
+              <w:t xml:space="preserve">إجابة متميزة: تميّز نبيل بالإشارة إلى تغيّر نوع السؤال نفسه لا شكل عرضه. وتميّزت هدى بربط التحوّل بإمكانية إظهار ما لا يُرى في العلوم.</w:t>
+            </w:r>
+          </w:p>
+          <w:p>
+            <w:pPr>
+              <w:bidi/>
+              <w:spacing w:after="40" w:before="40" w:line="240" w:lineRule="auto"/>
+              <w:jc w:val="right"/>
+            </w:pPr>
+            <w:r>
+              <w:rPr>
+                <w:rFonts w:ascii="Simplified Arabic" w:cs="Simplified Arabic" w:eastAsia="Simplified Arabic" w:hAnsi="Simplified Arabic"/>
+                <w:b w:val="false"/>
+                <w:sz w:val="20"/>
+                <w:szCs w:val="20"/>
+                <w:rtl/>
+              </w:rPr>
+              <w:t xml:space="preserve">تحفّظ منفرد: قيّد خالد الاتفاق بشرط أن يتغيّر السؤال لا الشاشة.</w:t>
+            </w:r>
+          </w:p>
+        </w:tc>
+        <w:tc>
+          <w:tcPr>
+            <w:tcW w:type="dxa" w:w="2572"/>
+          </w:tcPr>
+          <w:p>
+            <w:pPr>
+              <w:bidi/>
+              <w:spacing w:after="40" w:before="40" w:line="240" w:lineRule="auto"/>
+              <w:jc w:val="right"/>
+            </w:pPr>
+            <w:r>
+              <w:rPr>
+                <w:rFonts w:ascii="Simplified Arabic" w:cs="Simplified Arabic" w:eastAsia="Simplified Arabic" w:hAnsi="Simplified Arabic"/>
+                <w:b w:val="false"/>
+                <w:sz w:val="20"/>
+                <w:szCs w:val="20"/>
+                <w:rtl/>
+              </w:rPr>
+              <w:t xml:space="preserve">• أحمد: «الطلاب صاروا يشاركون ويتفاعلوا أكثر.. الدرس صار ممتع، وما عادوا مستمعين بس».</w:t>
+            </w:r>
+          </w:p>
+          <w:p>
+            <w:pPr>
+              <w:bidi/>
+              <w:spacing w:after="40" w:before="40" w:line="240" w:lineRule="auto"/>
+              <w:jc w:val="right"/>
+            </w:pPr>
+            <w:r>
+              <w:rPr>
+                <w:rFonts w:ascii="Simplified Arabic" w:cs="Simplified Arabic" w:eastAsia="Simplified Arabic" w:hAnsi="Simplified Arabic"/>
+                <w:b w:val="false"/>
+                <w:sz w:val="20"/>
+                <w:szCs w:val="20"/>
+                <w:rtl/>
+              </w:rPr>
+              <w:t xml:space="preserve">• محمد: «صار التعليم أكثر تفاعل وحيوية.. صاروا يناقشون ويشتغلون مع بعض».</w:t>
+            </w:r>
+          </w:p>
+          <w:p>
+            <w:pPr>
+              <w:bidi/>
+              <w:spacing w:after="40" w:before="40" w:line="240" w:lineRule="auto"/>
+              <w:jc w:val="right"/>
+            </w:pPr>
+            <w:r>
+              <w:rPr>
+                <w:rFonts w:ascii="Simplified Arabic" w:cs="Simplified Arabic" w:eastAsia="Simplified Arabic" w:hAnsi="Simplified Arabic"/>
+                <w:b w:val="false"/>
+                <w:sz w:val="20"/>
+                <w:szCs w:val="20"/>
+                <w:rtl/>
+              </w:rPr>
+              <w:t xml:space="preserve">• أميرة: «تسهم في تسهيل الوصول إلى المعلومات وتوفير بيئات تعليمية تفاعلية».</w:t>
+            </w:r>
+          </w:p>
+          <w:p>
+            <w:pPr>
+              <w:bidi/>
+              <w:spacing w:after="40" w:before="40" w:line="240" w:lineRule="auto"/>
+              <w:jc w:val="right"/>
+            </w:pPr>
+            <w:r>
+              <w:rPr>
+                <w:rFonts w:ascii="Simplified Arabic" w:cs="Simplified Arabic" w:eastAsia="Simplified Arabic" w:hAnsi="Simplified Arabic"/>
+                <w:b w:val="false"/>
+                <w:sz w:val="20"/>
+                <w:szCs w:val="20"/>
+                <w:rtl/>
+              </w:rPr>
+              <w:t xml:space="preserve">• نبيل: «قبل كنت أسأل: شو صار سنة كذا؟ هلق بسأله: هاي وثيقتين بيقولوا إشي مختلف، مين منهم بتصدّق وليش؟».</w:t>
+            </w:r>
+          </w:p>
+          <w:p>
+            <w:pPr>
+              <w:bidi/>
+              <w:spacing w:after="40" w:before="40" w:line="240" w:lineRule="auto"/>
+              <w:jc w:val="right"/>
+            </w:pPr>
+            <w:r>
+              <w:rPr>
+                <w:rFonts w:ascii="Simplified Arabic" w:cs="Simplified Arabic" w:eastAsia="Simplified Arabic" w:hAnsi="Simplified Arabic"/>
+                <w:b w:val="false"/>
+                <w:sz w:val="20"/>
+                <w:szCs w:val="20"/>
+                <w:rtl/>
+              </w:rPr>
+              <w:t xml:space="preserve">• هدى: «صرت أوريهم التفاعل قبل ما نعمله، وأوقفه، وأرجّعه.. الطالب اللي كان بيحفظ المعادلة صار بيشوفها».</w:t>
+            </w:r>
+          </w:p>
+        </w:tc>
+      </w:tr>
+      <w:tr>
+        <w:tc>
+          <w:tcPr>
+            <w:tcW w:type="dxa" w:w="1700"/>
+          </w:tcPr>
+          <w:p>
+            <w:pPr>
+              <w:bidi/>
+              <w:spacing w:after="40" w:before="40" w:line="240" w:lineRule="auto"/>
+              <w:jc w:val="right"/>
+            </w:pPr>
+            <w:r>
+              <w:rPr>
+                <w:rFonts w:ascii="Simplified Arabic" w:cs="Simplified Arabic" w:eastAsia="Simplified Arabic" w:hAnsi="Simplified Arabic"/>
+                <w:b w:val="false"/>
+                <w:sz w:val="20"/>
+                <w:szCs w:val="20"/>
+                <w:rtl/>
+              </w:rPr>
+              <w:t xml:space="preserve">2. إشكالية وتيرة الدمج ومنهجية الحصة</w:t>
+            </w:r>
+          </w:p>
+        </w:tc>
+        <w:tc>
+          <w:tcPr>
+            <w:tcW w:type="dxa" w:w="2200"/>
+          </w:tcPr>
+          <w:p>
+            <w:pPr>
+              <w:bidi/>
+              <w:spacing w:after="40" w:before="40" w:line="240" w:lineRule="auto"/>
+              <w:jc w:val="right"/>
+            </w:pPr>
+            <w:r>
+              <w:rPr>
+                <w:rFonts w:ascii="Simplified Arabic" w:cs="Simplified Arabic" w:eastAsia="Simplified Arabic" w:hAnsi="Simplified Arabic"/>
+                <w:b w:val="false"/>
+                <w:sz w:val="20"/>
+                <w:szCs w:val="20"/>
+                <w:rtl/>
+              </w:rPr>
+              <w:t xml:space="preserve">«المفاضلة المنهجية بين حتمية الدمج الكلّي والموازنة التقليدية»</w:t>
+            </w:r>
+          </w:p>
+          <w:p>
+            <w:pPr>
+              <w:bidi/>
+              <w:spacing w:after="40" w:before="40" w:line="240" w:lineRule="auto"/>
+              <w:jc w:val="right"/>
+            </w:pPr>
+            <w:r>
+              <w:rPr>
+                <w:rFonts w:ascii="Simplified Arabic" w:cs="Simplified Arabic" w:eastAsia="Simplified Arabic" w:hAnsi="Simplified Arabic"/>
+                <w:b w:val="false"/>
+                <w:sz w:val="20"/>
+                <w:szCs w:val="20"/>
+                <w:rtl/>
+              </w:rPr>
+              <w:t xml:space="preserve">تشمل: تسييل الأدوات التقنية في بنية الحصة، الموازنة الديداكتيكية داخل الحصة، حساب كلفة الدقيقة الصفّية، وآليات استدامة شغف الطلاب.</w:t>
+            </w:r>
+          </w:p>
+        </w:tc>
+        <w:tc>
+          <w:tcPr>
+            <w:tcW w:type="dxa" w:w="2600"/>
+          </w:tcPr>
+          <w:p>
+            <w:pPr>
+              <w:bidi/>
+              <w:spacing w:after="40" w:before="40" w:line="240" w:lineRule="auto"/>
+              <w:jc w:val="right"/>
+            </w:pPr>
+            <w:r>
+              <w:rPr>
+                <w:rFonts w:ascii="Simplified Arabic" w:cs="Simplified Arabic" w:eastAsia="Simplified Arabic" w:hAnsi="Simplified Arabic"/>
+                <w:b w:val="false"/>
+                <w:sz w:val="20"/>
+                <w:szCs w:val="20"/>
+                <w:rtl/>
+              </w:rPr>
+              <w:t xml:space="preserve">مختلف عليه: تباينت الرؤى حول كثافة الدمج. أحمد ومحمد وسميرة وريم وهدى يرون التكنولوجيا حتمية يومية، بينما ترفض أميرة وخالد ونبيل الدمج اليومي ويفضّلون توظيفه بعد الشرح التقليدي.</w:t>
+            </w:r>
+          </w:p>
+          <w:p>
+            <w:pPr>
+              <w:bidi/>
+              <w:spacing w:after="40" w:before="40" w:line="240" w:lineRule="auto"/>
+              <w:jc w:val="right"/>
+            </w:pPr>
+            <w:r>
+              <w:rPr>
+                <w:rFonts w:ascii="Simplified Arabic" w:cs="Simplified Arabic" w:eastAsia="Simplified Arabic" w:hAnsi="Simplified Arabic"/>
+                <w:b w:val="false"/>
+                <w:sz w:val="20"/>
+                <w:szCs w:val="20"/>
+                <w:rtl/>
+              </w:rPr>
+              <w:t xml:space="preserve">إجابة متميزة: تفرّد نبيل بمعيار قرار شخصي يحوّل الخلاف من مسألة كمّية إلى مسألة نوعية. وتفرّدت أميرة باستراتيجية دمج مقنّنة تحافظ على قيمة الأداة بعدم تكرارها.</w:t>
+            </w:r>
+          </w:p>
+        </w:tc>
+        <w:tc>
+          <w:tcPr>
+            <w:tcW w:type="dxa" w:w="2572"/>
+          </w:tcPr>
+          <w:p>
+            <w:pPr>
+              <w:bidi/>
+              <w:spacing w:after="40" w:before="40" w:line="240" w:lineRule="auto"/>
+              <w:jc w:val="right"/>
+            </w:pPr>
+            <w:r>
+              <w:rPr>
+                <w:rFonts w:ascii="Simplified Arabic" w:cs="Simplified Arabic" w:eastAsia="Simplified Arabic" w:hAnsi="Simplified Arabic"/>
+                <w:b w:val="false"/>
+                <w:sz w:val="20"/>
+                <w:szCs w:val="20"/>
+                <w:rtl/>
+              </w:rPr>
+              <w:t xml:space="preserve">• أميرة: «في الحقيقة لا، ليس بشكل يومي.. أشرح أولاً بالطريقة التقليدية لترسيخ المفاهيم، ثم أستخدم تطبيقات الأسئلة والتمرينات».</w:t>
+            </w:r>
+          </w:p>
+          <w:p>
+            <w:pPr>
+              <w:bidi/>
+              <w:spacing w:after="40" w:before="40" w:line="240" w:lineRule="auto"/>
+              <w:jc w:val="right"/>
+            </w:pPr>
+            <w:r>
+              <w:rPr>
+                <w:rFonts w:ascii="Simplified Arabic" w:cs="Simplified Arabic" w:eastAsia="Simplified Arabic" w:hAnsi="Simplified Arabic"/>
+                <w:b w:val="false"/>
+                <w:sz w:val="20"/>
+                <w:szCs w:val="20"/>
+                <w:rtl/>
+              </w:rPr>
+              <w:t xml:space="preserve">• سميرة: «جيل تربّى على التكنولوجيا.. فلا يعقل أن يتّجه إلى المدرسة ويجد القلم واللوح».</w:t>
+            </w:r>
+          </w:p>
+          <w:p>
+            <w:pPr>
+              <w:bidi/>
+              <w:spacing w:after="40" w:before="40" w:line="240" w:lineRule="auto"/>
+              <w:jc w:val="right"/>
+            </w:pPr>
+            <w:r>
+              <w:rPr>
+                <w:rFonts w:ascii="Simplified Arabic" w:cs="Simplified Arabic" w:eastAsia="Simplified Arabic" w:hAnsi="Simplified Arabic"/>
+                <w:b w:val="false"/>
+                <w:sz w:val="20"/>
+                <w:szCs w:val="20"/>
+                <w:rtl/>
+              </w:rPr>
+              <w:t xml:space="preserve">• خالد: «الحصة خمس وأربعين دقيقة. إذا أخذت عشرة منها بالتقنية وطلعت بنفس الفهم، أنا خسرت عشر دقائق مش ربحت متعة».</w:t>
+            </w:r>
+          </w:p>
+          <w:p>
+            <w:pPr>
+              <w:bidi/>
+              <w:spacing w:after="40" w:before="40" w:line="240" w:lineRule="auto"/>
+              <w:jc w:val="right"/>
+            </w:pPr>
+            <w:r>
+              <w:rPr>
+                <w:rFonts w:ascii="Simplified Arabic" w:cs="Simplified Arabic" w:eastAsia="Simplified Arabic" w:hAnsi="Simplified Arabic"/>
+                <w:b w:val="false"/>
+                <w:sz w:val="20"/>
+                <w:szCs w:val="20"/>
+                <w:rtl/>
+              </w:rPr>
+              <w:t xml:space="preserve">• نبيل: «هاي الأداة بتخلّي الطالب يفكّر أكثر ولا بس بتخلّيه ينبسط أكثر؟ إذا الجواب التاني، بتركها».</w:t>
+            </w:r>
+          </w:p>
+        </w:tc>
+      </w:tr>
+    </w:tbl>
+    <w:p>
+      <w:pPr>
+        <w:bidi/>
+        <w:spacing w:after="120" w:line="360" w:lineRule="auto"/>
+      </w:pPr>
+    </w:p>
+    <w:p>
+      <w:pPr>
+        <w:pageBreakBefore/>
+        <w:bidi/>
+        <w:spacing w:after="120" w:line="360" w:lineRule="auto"/>
+        <w:jc w:val="both"/>
+      </w:pPr>
+      <w:r>
+        <w:rPr>
+          <w:rFonts w:ascii="Simplified Arabic" w:cs="Simplified Arabic" w:eastAsia="Simplified Arabic" w:hAnsi="Simplified Arabic"/>
+          <w:b/>
+          <w:bCs/>
+          <w:sz w:val="26"/>
+          <w:szCs w:val="26"/>
+          <w:rtl/>
+        </w:rPr>
+        <w:t xml:space="preserve">جدول تحليل الإطار الكيفي للمحور الثاني: أثر التكنولوجيا في التعلم والدافعية والعلاقة التربوية</w:t>
+      </w:r>
+    </w:p>
+    <w:tbl>
+      <w:tblPr>
+        <w:bidiVisual/>
+        <w:tblW w:type="dxa" w:w="9072"/>
+        <w:tblBorders>
+          <w:top w:val="single" w:color="auto" w:sz="4"/>
+          <w:left w:val="single" w:color="auto" w:sz="4"/>
+          <w:bottom w:val="single" w:color="auto" w:sz="4"/>
+          <w:right w:val="single" w:color="auto" w:sz="4"/>
+          <w:insideH w:val="single" w:color="auto" w:sz="4"/>
+          <w:insideV w:val="single" w:color="auto" w:sz="4"/>
+        </w:tblBorders>
+      </w:tblPr>
+      <w:tblGrid>
+        <w:gridCol w:w="1700"/>
+        <w:gridCol w:w="2200"/>
+        <w:gridCol w:w="2600"/>
+        <w:gridCol w:w="2572"/>
+      </w:tblGrid>
+      <w:tr>
+        <w:trPr>
+          <w:tblHeader/>
+        </w:trPr>
+        <w:tc>
+          <w:tcPr>
+            <w:tcW w:type="dxa" w:w="1700"/>
+            <w:shd w:fill="E8E4EF" w:val="clear"/>
+          </w:tcPr>
+          <w:p>
+            <w:pPr>
+              <w:bidi/>
+              <w:spacing w:after="40" w:before="40" w:line="240" w:lineRule="auto"/>
+              <w:jc w:val="center"/>
+            </w:pPr>
+            <w:r>
+              <w:rPr>
+                <w:rFonts w:ascii="Simplified Arabic" w:cs="Simplified Arabic" w:eastAsia="Simplified Arabic" w:hAnsi="Simplified Arabic"/>
+                <w:b/>
+                <w:bCs/>
+                <w:sz w:val="22"/>
+                <w:szCs w:val="22"/>
+                <w:rtl/>
+              </w:rPr>
+              <w:t xml:space="preserve">الثيمة الرئيسية</w:t>
+            </w:r>
+          </w:p>
+        </w:tc>
+        <w:tc>
+          <w:tcPr>
+            <w:tcW w:type="dxa" w:w="2200"/>
+            <w:shd w:fill="E8E4EF" w:val="clear"/>
+          </w:tcPr>
+          <w:p>
+            <w:pPr>
+              <w:bidi/>
+              <w:spacing w:after="40" w:before="40" w:line="240" w:lineRule="auto"/>
+              <w:jc w:val="center"/>
+            </w:pPr>
+            <w:r>
+              <w:rPr>
+                <w:rFonts w:ascii="Simplified Arabic" w:cs="Simplified Arabic" w:eastAsia="Simplified Arabic" w:hAnsi="Simplified Arabic"/>
+                <w:b/>
+                <w:bCs/>
+                <w:sz w:val="22"/>
+                <w:szCs w:val="22"/>
+                <w:rtl/>
+              </w:rPr>
+              <w:t xml:space="preserve">الفئة الشاملة للمؤشرات والرموز</w:t>
+            </w:r>
+          </w:p>
+        </w:tc>
+        <w:tc>
+          <w:tcPr>
+            <w:tcW w:type="dxa" w:w="2600"/>
+            <w:shd w:fill="E8E4EF" w:val="clear"/>
+          </w:tcPr>
+          <w:p>
+            <w:pPr>
+              <w:bidi/>
+              <w:spacing w:after="40" w:before="40" w:line="240" w:lineRule="auto"/>
+              <w:jc w:val="center"/>
+            </w:pPr>
+            <w:r>
+              <w:rPr>
+                <w:rFonts w:ascii="Simplified Arabic" w:cs="Simplified Arabic" w:eastAsia="Simplified Arabic" w:hAnsi="Simplified Arabic"/>
+                <w:b/>
+                <w:bCs/>
+                <w:sz w:val="22"/>
+                <w:szCs w:val="22"/>
+                <w:rtl/>
+              </w:rPr>
+              <w:t xml:space="preserve">حالة التحليل (المتفق والمختلف عليه) والإجابات المتميزة</w:t>
+            </w:r>
+          </w:p>
+        </w:tc>
+        <w:tc>
+          <w:tcPr>
+            <w:tcW w:type="dxa" w:w="2572"/>
+            <w:shd w:fill="E8E4EF" w:val="clear"/>
+          </w:tcPr>
+          <w:p>
+            <w:pPr>
+              <w:bidi/>
+              <w:spacing w:after="40" w:before="40" w:line="240" w:lineRule="auto"/>
+              <w:jc w:val="center"/>
+            </w:pPr>
+            <w:r>
+              <w:rPr>
+                <w:rFonts w:ascii="Simplified Arabic" w:cs="Simplified Arabic" w:eastAsia="Simplified Arabic" w:hAnsi="Simplified Arabic"/>
+                <w:b/>
+                <w:bCs/>
+                <w:sz w:val="22"/>
+                <w:szCs w:val="22"/>
+                <w:rtl/>
+              </w:rPr>
+              <w:t xml:space="preserve">اقتباسات حية من المشاركين</w:t>
+            </w:r>
+          </w:p>
+        </w:tc>
+      </w:tr>
+      <w:tr>
+        <w:tc>
+          <w:tcPr>
+            <w:tcW w:type="dxa" w:w="1700"/>
+          </w:tcPr>
+          <w:p>
+            <w:pPr>
+              <w:bidi/>
+              <w:spacing w:after="40" w:before="40" w:line="240" w:lineRule="auto"/>
+              <w:jc w:val="right"/>
+            </w:pPr>
+            <w:r>
+              <w:rPr>
+                <w:rFonts w:ascii="Simplified Arabic" w:cs="Simplified Arabic" w:eastAsia="Simplified Arabic" w:hAnsi="Simplified Arabic"/>
+                <w:b w:val="false"/>
+                <w:sz w:val="20"/>
+                <w:szCs w:val="20"/>
+                <w:rtl/>
+              </w:rPr>
+              <w:t xml:space="preserve">3. إنسانية التعليم وتقليص الفجوة الوجدانية والجيلية</w:t>
+            </w:r>
+          </w:p>
+        </w:tc>
+        <w:tc>
+          <w:tcPr>
+            <w:tcW w:type="dxa" w:w="2200"/>
+          </w:tcPr>
+          <w:p>
+            <w:pPr>
+              <w:bidi/>
+              <w:spacing w:after="40" w:before="40" w:line="240" w:lineRule="auto"/>
+              <w:jc w:val="right"/>
+            </w:pPr>
+            <w:r>
+              <w:rPr>
+                <w:rFonts w:ascii="Simplified Arabic" w:cs="Simplified Arabic" w:eastAsia="Simplified Arabic" w:hAnsi="Simplified Arabic"/>
+                <w:b w:val="false"/>
+                <w:sz w:val="20"/>
+                <w:szCs w:val="20"/>
+                <w:rtl/>
+              </w:rPr>
+              <w:t xml:space="preserve">«أنسنة التعليم وبناء الجسور الوجدانية عبر التواصل الرقمي الممتدّ»</w:t>
+            </w:r>
+          </w:p>
+          <w:p>
+            <w:pPr>
+              <w:bidi/>
+              <w:spacing w:after="40" w:before="40" w:line="240" w:lineRule="auto"/>
+              <w:jc w:val="right"/>
+            </w:pPr>
+            <w:r>
+              <w:rPr>
+                <w:rFonts w:ascii="Simplified Arabic" w:cs="Simplified Arabic" w:eastAsia="Simplified Arabic" w:hAnsi="Simplified Arabic"/>
+                <w:b w:val="false"/>
+                <w:sz w:val="20"/>
+                <w:szCs w:val="20"/>
+                <w:rtl/>
+              </w:rPr>
+              <w:t xml:space="preserve">تشمل: إذابة الجليد الجيلي بين المعلم والطالب، الدعم الأكاديمي والوجداني الممتدّ خارج أسوار المدرسة، الأمان النفسي للطالب الخجول، ومسألة حدود المعلم المهنية.</w:t>
+            </w:r>
+          </w:p>
+        </w:tc>
+        <w:tc>
+          <w:tcPr>
+            <w:tcW w:type="dxa" w:w="2600"/>
+          </w:tcPr>
+          <w:p>
+            <w:pPr>
+              <w:bidi/>
+              <w:spacing w:after="40" w:before="40" w:line="240" w:lineRule="auto"/>
+              <w:jc w:val="right"/>
+            </w:pPr>
+            <w:r>
+              <w:rPr>
+                <w:rFonts w:ascii="Simplified Arabic" w:cs="Simplified Arabic" w:eastAsia="Simplified Arabic" w:hAnsi="Simplified Arabic"/>
+                <w:b w:val="false"/>
+                <w:sz w:val="20"/>
+                <w:szCs w:val="20"/>
+                <w:rtl/>
+              </w:rPr>
+              <w:t xml:space="preserve">متفق عليه: اتفاق على أنّ التكنولوجيا قرّبت المسافة بين المعلم والطالب وجعلت التواصل ممتدّاً ومرناً خارج أوقات الدوام.</w:t>
+            </w:r>
+          </w:p>
+          <w:p>
+            <w:pPr>
+              <w:bidi/>
+              <w:spacing w:after="40" w:before="40" w:line="240" w:lineRule="auto"/>
+              <w:jc w:val="right"/>
+            </w:pPr>
+            <w:r>
+              <w:rPr>
+                <w:rFonts w:ascii="Simplified Arabic" w:cs="Simplified Arabic" w:eastAsia="Simplified Arabic" w:hAnsi="Simplified Arabic"/>
+                <w:b w:val="false"/>
+                <w:sz w:val="20"/>
+                <w:szCs w:val="20"/>
+                <w:rtl/>
+              </w:rPr>
+              <w:t xml:space="preserve">مختلف عليه: تباين في إدارة هذا الامتداد؛ ريم تعاني من تآكل الحدود، بينما يضع خالد حدّاً صريحاً يحصر المجموعة بالإعلانات.</w:t>
+            </w:r>
+          </w:p>
+          <w:p>
+            <w:pPr>
+              <w:bidi/>
+              <w:spacing w:after="40" w:before="40" w:line="240" w:lineRule="auto"/>
+              <w:jc w:val="right"/>
+            </w:pPr>
+            <w:r>
+              <w:rPr>
+                <w:rFonts w:ascii="Simplified Arabic" w:cs="Simplified Arabic" w:eastAsia="Simplified Arabic" w:hAnsi="Simplified Arabic"/>
+                <w:b w:val="false"/>
+                <w:sz w:val="20"/>
+                <w:szCs w:val="20"/>
+                <w:rtl/>
+              </w:rPr>
+              <w:t xml:space="preserve">إجابة متميزة: أشارت أميرة إلى «المساحة الآمنة» للطلاب الخجولين، ووصفت سميرة التقنية كوسيلة لإذابة الجليد في العلاقة.</w:t>
+            </w:r>
+          </w:p>
+        </w:tc>
+        <w:tc>
+          <w:tcPr>
+            <w:tcW w:type="dxa" w:w="2572"/>
+          </w:tcPr>
+          <w:p>
+            <w:pPr>
+              <w:bidi/>
+              <w:spacing w:after="40" w:before="40" w:line="240" w:lineRule="auto"/>
+              <w:jc w:val="right"/>
+            </w:pPr>
+            <w:r>
+              <w:rPr>
+                <w:rFonts w:ascii="Simplified Arabic" w:cs="Simplified Arabic" w:eastAsia="Simplified Arabic" w:hAnsi="Simplified Arabic"/>
+                <w:b w:val="false"/>
+                <w:sz w:val="20"/>
+                <w:szCs w:val="20"/>
+                <w:rtl/>
+              </w:rPr>
+              <w:t xml:space="preserve">• أحمد: «بناء جسر تواصل فعّال.. العملية التعليمية صارت أدفأ وأقرب وتجاوزنا فجوة الجيل».</w:t>
+            </w:r>
+          </w:p>
+          <w:p>
+            <w:pPr>
+              <w:bidi/>
+              <w:spacing w:after="40" w:before="40" w:line="240" w:lineRule="auto"/>
+              <w:jc w:val="right"/>
+            </w:pPr>
+            <w:r>
+              <w:rPr>
+                <w:rFonts w:ascii="Simplified Arabic" w:cs="Simplified Arabic" w:eastAsia="Simplified Arabic" w:hAnsi="Simplified Arabic"/>
+                <w:b w:val="false"/>
+                <w:sz w:val="20"/>
+                <w:szCs w:val="20"/>
+                <w:rtl/>
+              </w:rPr>
+              <w:t xml:space="preserve">• سميرة: «التقرّب من الطالب بالتكنولوجيا يذيب هذا الثلج في العلاقة، ويقلّص هذه الفجوة بين فكر المعلم وفكر الطالب».</w:t>
+            </w:r>
+          </w:p>
+          <w:p>
+            <w:pPr>
+              <w:bidi/>
+              <w:spacing w:after="40" w:before="40" w:line="240" w:lineRule="auto"/>
+              <w:jc w:val="right"/>
+            </w:pPr>
+            <w:r>
+              <w:rPr>
+                <w:rFonts w:ascii="Simplified Arabic" w:cs="Simplified Arabic" w:eastAsia="Simplified Arabic" w:hAnsi="Simplified Arabic"/>
+                <w:b w:val="false"/>
+                <w:sz w:val="20"/>
+                <w:szCs w:val="20"/>
+                <w:rtl/>
+              </w:rPr>
+              <w:t xml:space="preserve">• أميرة: «البيئة الرقمية توفّر مساحة آمنة للطلاب للتعبير بحرية، ويشعر الطلاب أنّهم يستطيعون الوصول إلى دعم إضافي متى احتاجوا».</w:t>
+            </w:r>
+          </w:p>
+          <w:p>
+            <w:pPr>
+              <w:bidi/>
+              <w:spacing w:after="40" w:before="40" w:line="240" w:lineRule="auto"/>
+              <w:jc w:val="right"/>
+            </w:pPr>
+            <w:r>
+              <w:rPr>
+                <w:rFonts w:ascii="Simplified Arabic" w:cs="Simplified Arabic" w:eastAsia="Simplified Arabic" w:hAnsi="Simplified Arabic"/>
+                <w:b w:val="false"/>
+                <w:sz w:val="20"/>
+                <w:szCs w:val="20"/>
+                <w:rtl/>
+              </w:rPr>
+              <w:t xml:space="preserve">• ريم: «أنا الساعة أحد عشر بالليل بردّ على سؤال عن الامتحان. وما بعرف كيف أوقف هاد الإشي بدون ما أخسر القرب اللي بنيته».</w:t>
+            </w:r>
+          </w:p>
+          <w:p>
+            <w:pPr>
+              <w:bidi/>
+              <w:spacing w:after="40" w:before="40" w:line="240" w:lineRule="auto"/>
+              <w:jc w:val="right"/>
+            </w:pPr>
+            <w:r>
+              <w:rPr>
+                <w:rFonts w:ascii="Simplified Arabic" w:cs="Simplified Arabic" w:eastAsia="Simplified Arabic" w:hAnsi="Simplified Arabic"/>
+                <w:b w:val="false"/>
+                <w:sz w:val="20"/>
+                <w:szCs w:val="20"/>
+                <w:rtl/>
+              </w:rPr>
+              <w:t xml:space="preserve">• خالد: «المجموعة عندي للإعلانات بس.. أنا مربّي، مش خدمة زبائن أربعة وعشرين ساعة».</w:t>
+            </w:r>
+          </w:p>
+        </w:tc>
+      </w:tr>
+      <w:tr>
+        <w:tc>
+          <w:tcPr>
+            <w:tcW w:type="dxa" w:w="1700"/>
+          </w:tcPr>
+          <w:p>
+            <w:pPr>
+              <w:bidi/>
+              <w:spacing w:after="40" w:before="40" w:line="240" w:lineRule="auto"/>
+              <w:jc w:val="right"/>
+            </w:pPr>
+            <w:r>
+              <w:rPr>
+                <w:rFonts w:ascii="Simplified Arabic" w:cs="Simplified Arabic" w:eastAsia="Simplified Arabic" w:hAnsi="Simplified Arabic"/>
+                <w:b w:val="false"/>
+                <w:sz w:val="20"/>
+                <w:szCs w:val="20"/>
+                <w:rtl/>
+              </w:rPr>
+              <w:t xml:space="preserve">4. تمايز التدريس ومراعاة الفروق الفردية</w:t>
+            </w:r>
+          </w:p>
+        </w:tc>
+        <w:tc>
+          <w:tcPr>
+            <w:tcW w:type="dxa" w:w="2200"/>
+          </w:tcPr>
+          <w:p>
+            <w:pPr>
+              <w:bidi/>
+              <w:spacing w:after="40" w:before="40" w:line="240" w:lineRule="auto"/>
+              <w:jc w:val="right"/>
+            </w:pPr>
+            <w:r>
+              <w:rPr>
+                <w:rFonts w:ascii="Simplified Arabic" w:cs="Simplified Arabic" w:eastAsia="Simplified Arabic" w:hAnsi="Simplified Arabic"/>
+                <w:b w:val="false"/>
+                <w:sz w:val="20"/>
+                <w:szCs w:val="20"/>
+                <w:rtl/>
+              </w:rPr>
+              <w:t xml:space="preserve">«التدريس المتمايز والاستجابة الرقمية الفورية للاحتياجات الفردية»</w:t>
+            </w:r>
+          </w:p>
+          <w:p>
+            <w:pPr>
+              <w:bidi/>
+              <w:spacing w:after="40" w:before="40" w:line="240" w:lineRule="auto"/>
+              <w:jc w:val="right"/>
+            </w:pPr>
+            <w:r>
+              <w:rPr>
+                <w:rFonts w:ascii="Simplified Arabic" w:cs="Simplified Arabic" w:eastAsia="Simplified Arabic" w:hAnsi="Simplified Arabic"/>
+                <w:b w:val="false"/>
+                <w:sz w:val="20"/>
+                <w:szCs w:val="20"/>
+                <w:rtl/>
+              </w:rPr>
+              <w:t xml:space="preserve">تشمل: مخاطبة قنوات تمثيل متعدّدة، دعم الطلاب ذوي التحصيل المنخفض، التقييم الفوري وتعديل الشرح في اللحظة، إعادة المشاهدة دون إحراج، وإخفاء التمايز عن أعين الصفّ.</w:t>
+            </w:r>
+          </w:p>
+        </w:tc>
+        <w:tc>
+          <w:tcPr>
+            <w:tcW w:type="dxa" w:w="2600"/>
+          </w:tcPr>
+          <w:p>
+            <w:pPr>
+              <w:bidi/>
+              <w:spacing w:after="40" w:before="40" w:line="240" w:lineRule="auto"/>
+              <w:jc w:val="right"/>
+            </w:pPr>
+            <w:r>
+              <w:rPr>
+                <w:rFonts w:ascii="Simplified Arabic" w:cs="Simplified Arabic" w:eastAsia="Simplified Arabic" w:hAnsi="Simplified Arabic"/>
+                <w:b w:val="false"/>
+                <w:sz w:val="20"/>
+                <w:szCs w:val="20"/>
+                <w:rtl/>
+              </w:rPr>
+              <w:t xml:space="preserve">متفق عليه: التقاء المشتركين على أنّ الأدوات الرقمية تخفّض كلفة المواءمة وتسرّع استيعاب الطلاب ضعاف التحصيل.</w:t>
+            </w:r>
+          </w:p>
+          <w:p>
+            <w:pPr>
+              <w:bidi/>
+              <w:spacing w:after="40" w:before="40" w:line="240" w:lineRule="auto"/>
+              <w:jc w:val="right"/>
+            </w:pPr>
+            <w:r>
+              <w:rPr>
+                <w:rFonts w:ascii="Simplified Arabic" w:cs="Simplified Arabic" w:eastAsia="Simplified Arabic" w:hAnsi="Simplified Arabic"/>
+                <w:b w:val="false"/>
+                <w:sz w:val="20"/>
+                <w:szCs w:val="20"/>
+                <w:rtl/>
+              </w:rPr>
+              <w:t xml:space="preserve">مختلف عليه: انفرد خالد بتحفّظ يتعلّق بانتقال التمايز إلى المهمّة البيتية حيث تتدخّل موارد البيت.</w:t>
+            </w:r>
+          </w:p>
+          <w:p>
+            <w:pPr>
+              <w:bidi/>
+              <w:spacing w:after="40" w:before="40" w:line="240" w:lineRule="auto"/>
+              <w:jc w:val="right"/>
+            </w:pPr>
+            <w:r>
+              <w:rPr>
+                <w:rFonts w:ascii="Simplified Arabic" w:cs="Simplified Arabic" w:eastAsia="Simplified Arabic" w:hAnsi="Simplified Arabic"/>
+                <w:b w:val="false"/>
+                <w:sz w:val="20"/>
+                <w:szCs w:val="20"/>
+                <w:rtl/>
+              </w:rPr>
+              <w:t xml:space="preserve">إجابة متميزة: تميّزت أميرة بالتقييم الفوري، وتميّزت ريم بإبراز البعد الوجداني في إخفاء التمايز حفاظاً على كرامة الطالب.</w:t>
+            </w:r>
+          </w:p>
+        </w:tc>
+        <w:tc>
+          <w:tcPr>
+            <w:tcW w:type="dxa" w:w="2572"/>
+          </w:tcPr>
+          <w:p>
+            <w:pPr>
+              <w:bidi/>
+              <w:spacing w:after="40" w:before="40" w:line="240" w:lineRule="auto"/>
+              <w:jc w:val="right"/>
+            </w:pPr>
+            <w:r>
+              <w:rPr>
+                <w:rFonts w:ascii="Simplified Arabic" w:cs="Simplified Arabic" w:eastAsia="Simplified Arabic" w:hAnsi="Simplified Arabic"/>
+                <w:b w:val="false"/>
+                <w:sz w:val="20"/>
+                <w:szCs w:val="20"/>
+                <w:rtl/>
+              </w:rPr>
+              <w:t xml:space="preserve">• سميرة: «التدريس عن طريق الألعاب هي أكثر شيء قد يساعد الطلاب ذوي المستوى التحصيلي المنخفض لأنّها تبعد عنهم عقدة الخوف من الفشل».</w:t>
+            </w:r>
+          </w:p>
+          <w:p>
+            <w:pPr>
+              <w:bidi/>
+              <w:spacing w:after="40" w:before="40" w:line="240" w:lineRule="auto"/>
+              <w:jc w:val="right"/>
+            </w:pPr>
+            <w:r>
+              <w:rPr>
+                <w:rFonts w:ascii="Simplified Arabic" w:cs="Simplified Arabic" w:eastAsia="Simplified Arabic" w:hAnsi="Simplified Arabic"/>
+                <w:b w:val="false"/>
+                <w:sz w:val="20"/>
+                <w:szCs w:val="20"/>
+                <w:rtl/>
+              </w:rPr>
+              <w:t xml:space="preserve">• أميرة: «الأهمّ هو التقييم الفوري اللي بيخلّيني أعدّل الشرح في نفس اللحظة».</w:t>
+            </w:r>
+          </w:p>
+          <w:p>
+            <w:pPr>
+              <w:bidi/>
+              <w:spacing w:after="40" w:before="40" w:line="240" w:lineRule="auto"/>
+              <w:jc w:val="right"/>
+            </w:pPr>
+            <w:r>
+              <w:rPr>
+                <w:rFonts w:ascii="Simplified Arabic" w:cs="Simplified Arabic" w:eastAsia="Simplified Arabic" w:hAnsi="Simplified Arabic"/>
+                <w:b w:val="false"/>
+                <w:sz w:val="20"/>
+                <w:szCs w:val="20"/>
+                <w:rtl/>
+              </w:rPr>
+              <w:t xml:space="preserve">• ريم: «أهمّ إشي إنّه الطالب الضعيف ما حدا بيشوف إنّه أخذ ورقة تانية.. هاد بحمي كرامته».</w:t>
+            </w:r>
+          </w:p>
+          <w:p>
+            <w:pPr>
+              <w:bidi/>
+              <w:spacing w:after="40" w:before="40" w:line="240" w:lineRule="auto"/>
+              <w:jc w:val="right"/>
+            </w:pPr>
+            <w:r>
+              <w:rPr>
+                <w:rFonts w:ascii="Simplified Arabic" w:cs="Simplified Arabic" w:eastAsia="Simplified Arabic" w:hAnsi="Simplified Arabic"/>
+                <w:b w:val="false"/>
+                <w:sz w:val="20"/>
+                <w:szCs w:val="20"/>
+                <w:rtl/>
+              </w:rPr>
+              <w:t xml:space="preserve">• هدى: «الفيديو ما بينرفز. الطالب البطيء بيرجّعه عشر مرّات ومحدا بيعرف».</w:t>
+            </w:r>
+          </w:p>
+          <w:p>
+            <w:pPr>
+              <w:bidi/>
+              <w:spacing w:after="40" w:before="40" w:line="240" w:lineRule="auto"/>
+              <w:jc w:val="right"/>
+            </w:pPr>
+            <w:r>
+              <w:rPr>
+                <w:rFonts w:ascii="Simplified Arabic" w:cs="Simplified Arabic" w:eastAsia="Simplified Arabic" w:hAnsi="Simplified Arabic"/>
+                <w:b w:val="false"/>
+                <w:sz w:val="20"/>
+                <w:szCs w:val="20"/>
+                <w:rtl/>
+              </w:rPr>
+              <w:t xml:space="preserve">• خالد: «لمّا أعطي مهمّة بيتية بالتطبيق، في طالب عنده جهاز وفي طالب بيستنّى أبوه يرجّع الهاتف. أنا هيك بعمّق الفرق مش بصغّره».</w:t>
+            </w:r>
+          </w:p>
+        </w:tc>
+      </w:tr>
+      <w:tr>
+        <w:tc>
+          <w:tcPr>
+            <w:tcW w:type="dxa" w:w="1700"/>
+          </w:tcPr>
+          <w:p>
+            <w:pPr>
+              <w:bidi/>
+              <w:spacing w:after="40" w:before="40" w:line="240" w:lineRule="auto"/>
+              <w:jc w:val="right"/>
+            </w:pPr>
+            <w:r>
+              <w:rPr>
+                <w:rFonts w:ascii="Simplified Arabic" w:cs="Simplified Arabic" w:eastAsia="Simplified Arabic" w:hAnsi="Simplified Arabic"/>
+                <w:b w:val="false"/>
+                <w:sz w:val="20"/>
+                <w:szCs w:val="20"/>
+                <w:rtl/>
+              </w:rPr>
+              <w:t xml:space="preserve">5. التكنولوجيا كـ «سيف ذو حدّين» (الأثر المعرفي والمهاري)</w:t>
+            </w:r>
+          </w:p>
+        </w:tc>
+        <w:tc>
+          <w:tcPr>
+            <w:tcW w:type="dxa" w:w="2200"/>
+          </w:tcPr>
+          <w:p>
+            <w:pPr>
+              <w:bidi/>
+              <w:spacing w:after="40" w:before="40" w:line="240" w:lineRule="auto"/>
+              <w:jc w:val="right"/>
+            </w:pPr>
+            <w:r>
+              <w:rPr>
+                <w:rFonts w:ascii="Simplified Arabic" w:cs="Simplified Arabic" w:eastAsia="Simplified Arabic" w:hAnsi="Simplified Arabic"/>
+                <w:b w:val="false"/>
+                <w:sz w:val="20"/>
+                <w:szCs w:val="20"/>
+                <w:rtl/>
+              </w:rPr>
+              <w:t xml:space="preserve">«التباين بين تعزيز المخرجات التعليمية والانتكاس المهاري»</w:t>
+            </w:r>
+          </w:p>
+          <w:p>
+            <w:pPr>
+              <w:bidi/>
+              <w:spacing w:after="40" w:before="40" w:line="240" w:lineRule="auto"/>
+              <w:jc w:val="right"/>
+            </w:pPr>
+            <w:r>
+              <w:rPr>
+                <w:rFonts w:ascii="Simplified Arabic" w:cs="Simplified Arabic" w:eastAsia="Simplified Arabic" w:hAnsi="Simplified Arabic"/>
+                <w:b w:val="false"/>
+                <w:sz w:val="20"/>
+                <w:szCs w:val="20"/>
+                <w:rtl/>
+              </w:rPr>
+              <w:t xml:space="preserve">تشمل: التهديدات المهارية الناتجة عن السرعة التقنية، تراجع الإملاء والحفظ والتركيز، تآكل المثابرة، سطحية التعامل مع المصادر، مقابل جودة التنظيم وتوفير الوقت والجهد.</w:t>
+            </w:r>
+          </w:p>
+        </w:tc>
+        <w:tc>
+          <w:tcPr>
+            <w:tcW w:type="dxa" w:w="2600"/>
+          </w:tcPr>
+          <w:p>
+            <w:pPr>
+              <w:bidi/>
+              <w:spacing w:after="40" w:before="40" w:line="240" w:lineRule="auto"/>
+              <w:jc w:val="right"/>
+            </w:pPr>
+            <w:r>
+              <w:rPr>
+                <w:rFonts w:ascii="Simplified Arabic" w:cs="Simplified Arabic" w:eastAsia="Simplified Arabic" w:hAnsi="Simplified Arabic"/>
+                <w:b w:val="false"/>
+                <w:sz w:val="20"/>
+                <w:szCs w:val="20"/>
+                <w:rtl/>
+              </w:rPr>
+              <w:t xml:space="preserve">مختلف عليه: انقسام حادّ حول الأثر المعرفي؛ أحمد ومحمد وأميرة وريم ركّزوا على المكاسب في التنظيم والوقت، بينما حذّرت سميرة وخالد ونبيل من الهدم المهاري كلٌّ من زاويته.</w:t>
+            </w:r>
+          </w:p>
+          <w:p>
+            <w:pPr>
+              <w:bidi/>
+              <w:spacing w:after="40" w:before="40" w:line="240" w:lineRule="auto"/>
+              <w:jc w:val="right"/>
+            </w:pPr>
+            <w:r>
+              <w:rPr>
+                <w:rFonts w:ascii="Simplified Arabic" w:cs="Simplified Arabic" w:eastAsia="Simplified Arabic" w:hAnsi="Simplified Arabic"/>
+                <w:b w:val="false"/>
+                <w:sz w:val="20"/>
+                <w:szCs w:val="20"/>
+                <w:rtl/>
+              </w:rPr>
+              <w:t xml:space="preserve">إجابة متميزة: تفرّدت سميرة بالتحذير من الأخطاء الإملائية والاتّكالية، وتفرّد خالد بتشخيص تآكل المثابرة لا المعلومة، وتفرّد نبيل بمشكلة الحكم على المصادر.</w:t>
+            </w:r>
+          </w:p>
+          <w:p>
+            <w:pPr>
+              <w:bidi/>
+              <w:spacing w:after="40" w:before="40" w:line="240" w:lineRule="auto"/>
+              <w:jc w:val="right"/>
+            </w:pPr>
+            <w:r>
+              <w:rPr>
+                <w:rFonts w:ascii="Simplified Arabic" w:cs="Simplified Arabic" w:eastAsia="Simplified Arabic" w:hAnsi="Simplified Arabic"/>
+                <w:b w:val="false"/>
+                <w:sz w:val="20"/>
+                <w:szCs w:val="20"/>
+                <w:rtl/>
+              </w:rPr>
+              <w:t xml:space="preserve">ملاحظة: خفّف محمد وسميرة موقفيهما عند السؤال المنبّه، ما يدلّ على مواقف مركّبة لا قاطعة.</w:t>
+            </w:r>
+          </w:p>
+        </w:tc>
+        <w:tc>
+          <w:tcPr>
+            <w:tcW w:type="dxa" w:w="2572"/>
+          </w:tcPr>
+          <w:p>
+            <w:pPr>
+              <w:bidi/>
+              <w:spacing w:after="40" w:before="40" w:line="240" w:lineRule="auto"/>
+              <w:jc w:val="right"/>
+            </w:pPr>
+            <w:r>
+              <w:rPr>
+                <w:rFonts w:ascii="Simplified Arabic" w:cs="Simplified Arabic" w:eastAsia="Simplified Arabic" w:hAnsi="Simplified Arabic"/>
+                <w:b w:val="false"/>
+                <w:sz w:val="20"/>
+                <w:szCs w:val="20"/>
+                <w:rtl/>
+              </w:rPr>
+              <w:t xml:space="preserve">• سميرة: «التكنولوجيا سيف ذو حدّين.. الطالب متعرّض لأخطاء إملائية رهيبة بسبب لغة الشات، والأخطر أنّه صار اتّكالي ولا يستطيع أن يحفظ».</w:t>
+            </w:r>
+          </w:p>
+          <w:p>
+            <w:pPr>
+              <w:bidi/>
+              <w:spacing w:after="40" w:before="40" w:line="240" w:lineRule="auto"/>
+              <w:jc w:val="right"/>
+            </w:pPr>
+            <w:r>
+              <w:rPr>
+                <w:rFonts w:ascii="Simplified Arabic" w:cs="Simplified Arabic" w:eastAsia="Simplified Arabic" w:hAnsi="Simplified Arabic"/>
+                <w:b w:val="false"/>
+                <w:sz w:val="20"/>
+                <w:szCs w:val="20"/>
+                <w:rtl/>
+              </w:rPr>
+              <w:t xml:space="preserve">• أحمد: «وفّرت عليّ وقت وجهد كبير بالتحضير والتصحيح.. والتغييرات المعرفية أغلبها كانت للأفضل».</w:t>
+            </w:r>
+          </w:p>
+          <w:p>
+            <w:pPr>
+              <w:bidi/>
+              <w:spacing w:after="40" w:before="40" w:line="240" w:lineRule="auto"/>
+              <w:jc w:val="right"/>
+            </w:pPr>
+            <w:r>
+              <w:rPr>
+                <w:rFonts w:ascii="Simplified Arabic" w:cs="Simplified Arabic" w:eastAsia="Simplified Arabic" w:hAnsi="Simplified Arabic"/>
+                <w:b w:val="false"/>
+                <w:sz w:val="20"/>
+                <w:szCs w:val="20"/>
+                <w:rtl/>
+              </w:rPr>
+              <w:t xml:space="preserve">• خالد: «بالرياضيات المشكلة مش الإملاء.. المثابرة هي اللي بتتآكل، مش المعلومة».</w:t>
+            </w:r>
+          </w:p>
+          <w:p>
+            <w:pPr>
+              <w:bidi/>
+              <w:spacing w:after="40" w:before="40" w:line="240" w:lineRule="auto"/>
+              <w:jc w:val="right"/>
+            </w:pPr>
+            <w:r>
+              <w:rPr>
+                <w:rFonts w:ascii="Simplified Arabic" w:cs="Simplified Arabic" w:eastAsia="Simplified Arabic" w:hAnsi="Simplified Arabic"/>
+                <w:b w:val="false"/>
+                <w:sz w:val="20"/>
+                <w:szCs w:val="20"/>
+                <w:rtl/>
+              </w:rPr>
+              <w:t xml:space="preserve">• نبيل: «بيعرفوا يوصلوا للمعلومة، بس ما بيعرفوا يحكموا عليها».</w:t>
+            </w:r>
+          </w:p>
+          <w:p>
+            <w:pPr>
+              <w:bidi/>
+              <w:spacing w:after="40" w:before="40" w:line="240" w:lineRule="auto"/>
+              <w:jc w:val="right"/>
+            </w:pPr>
+            <w:r>
+              <w:rPr>
+                <w:rFonts w:ascii="Simplified Arabic" w:cs="Simplified Arabic" w:eastAsia="Simplified Arabic" w:hAnsi="Simplified Arabic"/>
+                <w:b w:val="false"/>
+                <w:sz w:val="20"/>
+                <w:szCs w:val="20"/>
+                <w:rtl/>
+              </w:rPr>
+              <w:t xml:space="preserve">• محمد: «مش التكنولوجيا هي اللي بتشتغل، هي طريقة الاستعمال».</w:t>
+            </w:r>
+          </w:p>
+        </w:tc>
+      </w:tr>
+      <w:tr>
+        <w:tc>
+          <w:tcPr>
+            <w:tcW w:type="dxa" w:w="1700"/>
+          </w:tcPr>
+          <w:p>
+            <w:pPr>
+              <w:bidi/>
+              <w:spacing w:after="40" w:before="40" w:line="240" w:lineRule="auto"/>
+              <w:jc w:val="right"/>
+            </w:pPr>
+            <w:r>
+              <w:rPr>
+                <w:rFonts w:ascii="Simplified Arabic" w:cs="Simplified Arabic" w:eastAsia="Simplified Arabic" w:hAnsi="Simplified Arabic"/>
+                <w:b w:val="false"/>
+                <w:sz w:val="20"/>
+                <w:szCs w:val="20"/>
+                <w:rtl/>
+              </w:rPr>
+              <w:t xml:space="preserve">6. بيئة الطالب خارج الصفّ بوصفها شرطاً على الدمج</w:t>
+            </w:r>
+          </w:p>
+        </w:tc>
+        <w:tc>
+          <w:tcPr>
+            <w:tcW w:type="dxa" w:w="2200"/>
+          </w:tcPr>
+          <w:p>
+            <w:pPr>
+              <w:bidi/>
+              <w:spacing w:after="40" w:before="40" w:line="240" w:lineRule="auto"/>
+              <w:jc w:val="right"/>
+            </w:pPr>
+            <w:r>
+              <w:rPr>
+                <w:rFonts w:ascii="Simplified Arabic" w:cs="Simplified Arabic" w:eastAsia="Simplified Arabic" w:hAnsi="Simplified Arabic"/>
+                <w:b w:val="false"/>
+                <w:sz w:val="20"/>
+                <w:szCs w:val="20"/>
+                <w:rtl/>
+              </w:rPr>
+              <w:t xml:space="preserve">«الشرط البيئي واللغوي على فاعلية الدمج التقني»</w:t>
+            </w:r>
+          </w:p>
+          <w:p>
+            <w:pPr>
+              <w:bidi/>
+              <w:spacing w:after="40" w:before="40" w:line="240" w:lineRule="auto"/>
+              <w:jc w:val="right"/>
+            </w:pPr>
+            <w:r>
+              <w:rPr>
+                <w:rFonts w:ascii="Simplified Arabic" w:cs="Simplified Arabic" w:eastAsia="Simplified Arabic" w:hAnsi="Simplified Arabic"/>
+                <w:b w:val="false"/>
+                <w:sz w:val="20"/>
+                <w:szCs w:val="20"/>
+                <w:rtl/>
+              </w:rPr>
+              <w:t xml:space="preserve">تشمل: الفجوة في موارد البيت، أثر المهمّة البيتية الرقمية على اللامساواة، انكشاف السياق الاجتماعي للطالب، وندرة الموارد الرقمية بالعربية.</w:t>
+            </w:r>
+          </w:p>
+        </w:tc>
+        <w:tc>
+          <w:tcPr>
+            <w:tcW w:type="dxa" w:w="2600"/>
+          </w:tcPr>
+          <w:p>
+            <w:pPr>
+              <w:bidi/>
+              <w:spacing w:after="40" w:before="40" w:line="240" w:lineRule="auto"/>
+              <w:jc w:val="right"/>
+            </w:pPr>
+            <w:r>
+              <w:rPr>
+                <w:rFonts w:ascii="Simplified Arabic" w:cs="Simplified Arabic" w:eastAsia="Simplified Arabic" w:hAnsi="Simplified Arabic"/>
+                <w:b w:val="false"/>
+                <w:sz w:val="20"/>
+                <w:szCs w:val="20"/>
+                <w:rtl/>
+              </w:rPr>
+              <w:t xml:space="preserve">ثيمة انبثقت من المعطيات ولم تكن مخطّطة في دليل المقابلة.</w:t>
+            </w:r>
+          </w:p>
+          <w:p>
+            <w:pPr>
+              <w:bidi/>
+              <w:spacing w:after="40" w:before="40" w:line="240" w:lineRule="auto"/>
+              <w:jc w:val="right"/>
+            </w:pPr>
+            <w:r>
+              <w:rPr>
+                <w:rFonts w:ascii="Simplified Arabic" w:cs="Simplified Arabic" w:eastAsia="Simplified Arabic" w:hAnsi="Simplified Arabic"/>
+                <w:b w:val="false"/>
+                <w:sz w:val="20"/>
+                <w:szCs w:val="20"/>
+                <w:rtl/>
+              </w:rPr>
+              <w:t xml:space="preserve">متفق عليه: اتفاق بين من أثاروها على أنّ ما يجري داخل الحصة متساوٍ نسبياً وأنّ التفاوت يبدأ بعدها.</w:t>
+            </w:r>
+          </w:p>
+          <w:p>
+            <w:pPr>
+              <w:bidi/>
+              <w:spacing w:after="40" w:before="40" w:line="240" w:lineRule="auto"/>
+              <w:jc w:val="right"/>
+            </w:pPr>
+            <w:r>
+              <w:rPr>
+                <w:rFonts w:ascii="Simplified Arabic" w:cs="Simplified Arabic" w:eastAsia="Simplified Arabic" w:hAnsi="Simplified Arabic"/>
+                <w:b w:val="false"/>
+                <w:sz w:val="20"/>
+                <w:szCs w:val="20"/>
+                <w:rtl/>
+              </w:rPr>
+              <w:t xml:space="preserve">إجابة متميزة: تفرّدت هدى بوصف التعلّم عن بُعد كنافذة على بيوت الطلاب غيّرت حكمها المهني عليهم. وتفرّد نبيل وهدى بإثارة مسألة اللغة بوصفها عبئاً غير محتسب.</w:t>
+            </w:r>
+          </w:p>
+        </w:tc>
+        <w:tc>
+          <w:tcPr>
+            <w:tcW w:type="dxa" w:w="2572"/>
+          </w:tcPr>
+          <w:p>
+            <w:pPr>
+              <w:bidi/>
+              <w:spacing w:after="40" w:before="40" w:line="240" w:lineRule="auto"/>
+              <w:jc w:val="right"/>
+            </w:pPr>
+            <w:r>
+              <w:rPr>
+                <w:rFonts w:ascii="Simplified Arabic" w:cs="Simplified Arabic" w:eastAsia="Simplified Arabic" w:hAnsi="Simplified Arabic"/>
+                <w:b w:val="false"/>
+                <w:sz w:val="20"/>
+                <w:szCs w:val="20"/>
+                <w:rtl/>
+              </w:rPr>
+              <w:t xml:space="preserve">• خالد: «بعرف طلاب بيشتغلوا بالمساء وبعرف طلاب بيتشاركوا هاتف واحد بين ثلاث إخوة.. أنا بمعاقبهم على إشي مش ذنبهم».</w:t>
+            </w:r>
+          </w:p>
+          <w:p>
+            <w:pPr>
+              <w:bidi/>
+              <w:spacing w:after="40" w:before="40" w:line="240" w:lineRule="auto"/>
+              <w:jc w:val="right"/>
+            </w:pPr>
+            <w:r>
+              <w:rPr>
+                <w:rFonts w:ascii="Simplified Arabic" w:cs="Simplified Arabic" w:eastAsia="Simplified Arabic" w:hAnsi="Simplified Arabic"/>
+                <w:b w:val="false"/>
+                <w:sz w:val="20"/>
+                <w:szCs w:val="20"/>
+                <w:rtl/>
+              </w:rPr>
+              <w:t xml:space="preserve">• هدى: «بفترة الكورونا شفت بيوتهم.. من وقتها صرت أفهم علامات ما كنت أفهمها قبل».</w:t>
+            </w:r>
+          </w:p>
+          <w:p>
+            <w:pPr>
+              <w:bidi/>
+              <w:spacing w:after="40" w:before="40" w:line="240" w:lineRule="auto"/>
+              <w:jc w:val="right"/>
+            </w:pPr>
+            <w:r>
+              <w:rPr>
+                <w:rFonts w:ascii="Simplified Arabic" w:cs="Simplified Arabic" w:eastAsia="Simplified Arabic" w:hAnsi="Simplified Arabic"/>
+                <w:b w:val="false"/>
+                <w:sz w:val="20"/>
+                <w:szCs w:val="20"/>
+                <w:rtl/>
+              </w:rPr>
+              <w:t xml:space="preserve">• نبيل: «في مصادر رقمية كثيرة بالإنجليزي والعبري، وبالعربي أقلّ بكثير، وأنا بضطرّ أترجم بنفسي وهاد شغل ما حدا بيحسبه».</w:t>
+            </w:r>
+          </w:p>
+          <w:p>
+            <w:pPr>
+              <w:bidi/>
+              <w:spacing w:after="40" w:before="40" w:line="240" w:lineRule="auto"/>
+              <w:jc w:val="right"/>
+            </w:pPr>
+            <w:r>
+              <w:rPr>
+                <w:rFonts w:ascii="Simplified Arabic" w:cs="Simplified Arabic" w:eastAsia="Simplified Arabic" w:hAnsi="Simplified Arabic"/>
+                <w:b w:val="false"/>
+                <w:sz w:val="20"/>
+                <w:szCs w:val="20"/>
+                <w:rtl/>
+              </w:rPr>
+              <w:t xml:space="preserve">• ريم: «بستعمل تطبيق بيقرأ النصّ بصوت عالي.. بس لازم يكون عندهم جهاز، وهاي مشكلة مش عند كلّهم».</w:t>
+            </w:r>
+          </w:p>
+        </w:tc>
+      </w:tr>
+    </w:tbl>
+    <w:p>
+      <w:pPr>
+        <w:bidi/>
+        <w:spacing w:after="120" w:line="360" w:lineRule="auto"/>
+      </w:pPr>
+    </w:p>
+    <w:p>
+      <w:pPr>
+        <w:pageBreakBefore/>
+        <w:bidi/>
+        <w:spacing w:after="120" w:line="360" w:lineRule="auto"/>
+        <w:jc w:val="both"/>
+      </w:pPr>
+      <w:r>
+        <w:rPr>
+          <w:rFonts w:ascii="Simplified Arabic" w:cs="Simplified Arabic" w:eastAsia="Simplified Arabic" w:hAnsi="Simplified Arabic"/>
+          <w:b/>
+          <w:bCs/>
+          <w:sz w:val="26"/>
+          <w:szCs w:val="26"/>
+          <w:rtl/>
+        </w:rPr>
+        <w:t xml:space="preserve">جدول تحليل الإطار الكيفي للمحور الثالث: التحديات والحدود والاحتياجات المهنية</w:t>
+      </w:r>
+    </w:p>
+    <w:tbl>
+      <w:tblPr>
+        <w:bidiVisual/>
+        <w:tblW w:type="dxa" w:w="9072"/>
+        <w:tblBorders>
+          <w:top w:val="single" w:color="auto" w:sz="4"/>
+          <w:left w:val="single" w:color="auto" w:sz="4"/>
+          <w:bottom w:val="single" w:color="auto" w:sz="4"/>
+          <w:right w:val="single" w:color="auto" w:sz="4"/>
+          <w:insideH w:val="single" w:color="auto" w:sz="4"/>
+          <w:insideV w:val="single" w:color="auto" w:sz="4"/>
+        </w:tblBorders>
+      </w:tblPr>
+      <w:tblGrid>
+        <w:gridCol w:w="1700"/>
+        <w:gridCol w:w="2200"/>
+        <w:gridCol w:w="2600"/>
+        <w:gridCol w:w="2572"/>
+      </w:tblGrid>
+      <w:tr>
+        <w:trPr>
+          <w:tblHeader/>
+        </w:trPr>
+        <w:tc>
+          <w:tcPr>
+            <w:tcW w:type="dxa" w:w="1700"/>
+            <w:shd w:fill="E8E4EF" w:val="clear"/>
+          </w:tcPr>
+          <w:p>
+            <w:pPr>
+              <w:bidi/>
+              <w:spacing w:after="40" w:before="40" w:line="240" w:lineRule="auto"/>
+              <w:jc w:val="center"/>
+            </w:pPr>
+            <w:r>
+              <w:rPr>
+                <w:rFonts w:ascii="Simplified Arabic" w:cs="Simplified Arabic" w:eastAsia="Simplified Arabic" w:hAnsi="Simplified Arabic"/>
+                <w:b/>
+                <w:bCs/>
+                <w:sz w:val="22"/>
+                <w:szCs w:val="22"/>
+                <w:rtl/>
+              </w:rPr>
+              <w:t xml:space="preserve">الثيمة الرئيسية</w:t>
+            </w:r>
+          </w:p>
+        </w:tc>
+        <w:tc>
+          <w:tcPr>
+            <w:tcW w:type="dxa" w:w="2200"/>
+            <w:shd w:fill="E8E4EF" w:val="clear"/>
+          </w:tcPr>
+          <w:p>
+            <w:pPr>
+              <w:bidi/>
+              <w:spacing w:after="40" w:before="40" w:line="240" w:lineRule="auto"/>
+              <w:jc w:val="center"/>
+            </w:pPr>
+            <w:r>
+              <w:rPr>
+                <w:rFonts w:ascii="Simplified Arabic" w:cs="Simplified Arabic" w:eastAsia="Simplified Arabic" w:hAnsi="Simplified Arabic"/>
+                <w:b/>
+                <w:bCs/>
+                <w:sz w:val="22"/>
+                <w:szCs w:val="22"/>
+                <w:rtl/>
+              </w:rPr>
+              <w:t xml:space="preserve">الفئة الشاملة للمؤشرات والرموز</w:t>
+            </w:r>
+          </w:p>
+        </w:tc>
+        <w:tc>
+          <w:tcPr>
+            <w:tcW w:type="dxa" w:w="2600"/>
+            <w:shd w:fill="E8E4EF" w:val="clear"/>
+          </w:tcPr>
+          <w:p>
+            <w:pPr>
+              <w:bidi/>
+              <w:spacing w:after="40" w:before="40" w:line="240" w:lineRule="auto"/>
+              <w:jc w:val="center"/>
+            </w:pPr>
+            <w:r>
+              <w:rPr>
+                <w:rFonts w:ascii="Simplified Arabic" w:cs="Simplified Arabic" w:eastAsia="Simplified Arabic" w:hAnsi="Simplified Arabic"/>
+                <w:b/>
+                <w:bCs/>
+                <w:sz w:val="22"/>
+                <w:szCs w:val="22"/>
+                <w:rtl/>
+              </w:rPr>
+              <w:t xml:space="preserve">حالة التحليل (المتفق والمختلف عليه) والإجابات المتميزة</w:t>
+            </w:r>
+          </w:p>
+        </w:tc>
+        <w:tc>
+          <w:tcPr>
+            <w:tcW w:type="dxa" w:w="2572"/>
+            <w:shd w:fill="E8E4EF" w:val="clear"/>
+          </w:tcPr>
+          <w:p>
+            <w:pPr>
+              <w:bidi/>
+              <w:spacing w:after="40" w:before="40" w:line="240" w:lineRule="auto"/>
+              <w:jc w:val="center"/>
+            </w:pPr>
+            <w:r>
+              <w:rPr>
+                <w:rFonts w:ascii="Simplified Arabic" w:cs="Simplified Arabic" w:eastAsia="Simplified Arabic" w:hAnsi="Simplified Arabic"/>
+                <w:b/>
+                <w:bCs/>
+                <w:sz w:val="22"/>
+                <w:szCs w:val="22"/>
+                <w:rtl/>
+              </w:rPr>
+              <w:t xml:space="preserve">اقتباسات حية من المشاركين</w:t>
+            </w:r>
+          </w:p>
+        </w:tc>
+      </w:tr>
+      <w:tr>
+        <w:tc>
+          <w:tcPr>
+            <w:tcW w:type="dxa" w:w="1700"/>
+          </w:tcPr>
+          <w:p>
+            <w:pPr>
+              <w:bidi/>
+              <w:spacing w:after="40" w:before="40" w:line="240" w:lineRule="auto"/>
+              <w:jc w:val="right"/>
+            </w:pPr>
+            <w:r>
+              <w:rPr>
+                <w:rFonts w:ascii="Simplified Arabic" w:cs="Simplified Arabic" w:eastAsia="Simplified Arabic" w:hAnsi="Simplified Arabic"/>
+                <w:b w:val="false"/>
+                <w:sz w:val="20"/>
+                <w:szCs w:val="20"/>
+                <w:rtl/>
+              </w:rPr>
+              <w:t xml:space="preserve">7. الحواجز البنيوية والمهنية وسؤال الذكاء الاصطناعي</w:t>
+            </w:r>
+          </w:p>
+        </w:tc>
+        <w:tc>
+          <w:tcPr>
+            <w:tcW w:type="dxa" w:w="2200"/>
+          </w:tcPr>
+          <w:p>
+            <w:pPr>
+              <w:bidi/>
+              <w:spacing w:after="40" w:before="40" w:line="240" w:lineRule="auto"/>
+              <w:jc w:val="right"/>
+            </w:pPr>
+            <w:r>
+              <w:rPr>
+                <w:rFonts w:ascii="Simplified Arabic" w:cs="Simplified Arabic" w:eastAsia="Simplified Arabic" w:hAnsi="Simplified Arabic"/>
+                <w:b w:val="false"/>
+                <w:sz w:val="20"/>
+                <w:szCs w:val="20"/>
+                <w:rtl/>
+              </w:rPr>
+              <w:t xml:space="preserve">«الحواجز الخارجية والاجتهاد الفردي في غياب السياسة المؤسسية»</w:t>
+            </w:r>
+          </w:p>
+          <w:p>
+            <w:pPr>
+              <w:bidi/>
+              <w:spacing w:after="40" w:before="40" w:line="240" w:lineRule="auto"/>
+              <w:jc w:val="right"/>
+            </w:pPr>
+            <w:r>
+              <w:rPr>
+                <w:rFonts w:ascii="Simplified Arabic" w:cs="Simplified Arabic" w:eastAsia="Simplified Arabic" w:hAnsi="Simplified Arabic"/>
+                <w:b w:val="false"/>
+                <w:sz w:val="20"/>
+                <w:szCs w:val="20"/>
+                <w:rtl/>
+              </w:rPr>
+              <w:t xml:space="preserve">تشمل: البنية التحتية غير المستقرّة، ضيق وقت الحصة ووقت التحضير، قصور المرافقة المهنية مقابل الاستكمالات القصيرة، إدارة الصفّ في بيئة رقمية، والفراغ المؤسسي تجاه الذكاء الاصطناعي التوليدي.</w:t>
+            </w:r>
+          </w:p>
+        </w:tc>
+        <w:tc>
+          <w:tcPr>
+            <w:tcW w:type="dxa" w:w="2600"/>
+          </w:tcPr>
+          <w:p>
+            <w:pPr>
+              <w:bidi/>
+              <w:spacing w:after="40" w:before="40" w:line="240" w:lineRule="auto"/>
+              <w:jc w:val="right"/>
+            </w:pPr>
+            <w:r>
+              <w:rPr>
+                <w:rFonts w:ascii="Simplified Arabic" w:cs="Simplified Arabic" w:eastAsia="Simplified Arabic" w:hAnsi="Simplified Arabic"/>
+                <w:b w:val="false"/>
+                <w:sz w:val="20"/>
+                <w:szCs w:val="20"/>
+                <w:rtl/>
+              </w:rPr>
+              <w:t xml:space="preserve">متفق عليه: إجماع الثمانية على أنّ العائق الأول ليس نقص المهارة بل ظروف العمل: الشبكة، الوقت، وغياب المرافقة المستمرّة.</w:t>
+            </w:r>
+          </w:p>
+          <w:p>
+            <w:pPr>
+              <w:bidi/>
+              <w:spacing w:after="40" w:before="40" w:line="240" w:lineRule="auto"/>
+              <w:jc w:val="right"/>
+            </w:pPr>
+            <w:r>
+              <w:rPr>
+                <w:rFonts w:ascii="Simplified Arabic" w:cs="Simplified Arabic" w:eastAsia="Simplified Arabic" w:hAnsi="Simplified Arabic"/>
+                <w:b w:val="false"/>
+                <w:sz w:val="20"/>
+                <w:szCs w:val="20"/>
+                <w:rtl/>
+              </w:rPr>
+              <w:t xml:space="preserve">متفق عليه أيضاً: نقد جماعي لنمط الاستكمالات القصيرة وطلب مرافقة صفّية دورية.</w:t>
+            </w:r>
+          </w:p>
+          <w:p>
+            <w:pPr>
+              <w:bidi/>
+              <w:spacing w:after="40" w:before="40" w:line="240" w:lineRule="auto"/>
+              <w:jc w:val="right"/>
+            </w:pPr>
+            <w:r>
+              <w:rPr>
+                <w:rFonts w:ascii="Simplified Arabic" w:cs="Simplified Arabic" w:eastAsia="Simplified Arabic" w:hAnsi="Simplified Arabic"/>
+                <w:b w:val="false"/>
+                <w:sz w:val="20"/>
+                <w:szCs w:val="20"/>
+                <w:rtl/>
+              </w:rPr>
+              <w:t xml:space="preserve">مختلف عليه: تباين في التعامل مع الذكاء الاصطناعي؛ نبيل وأحمد ومحمد أعادوا تصميم المهامّ، سميرة تستعمله لنفسها وتمنعه عن الطالب، وخالد يفضّل انتظار تعليمات رسمية.</w:t>
+            </w:r>
+          </w:p>
+          <w:p>
+            <w:pPr>
+              <w:bidi/>
+              <w:spacing w:after="40" w:before="40" w:line="240" w:lineRule="auto"/>
+              <w:jc w:val="right"/>
+            </w:pPr>
+            <w:r>
+              <w:rPr>
+                <w:rFonts w:ascii="Simplified Arabic" w:cs="Simplified Arabic" w:eastAsia="Simplified Arabic" w:hAnsi="Simplified Arabic"/>
+                <w:b w:val="false"/>
+                <w:sz w:val="20"/>
+                <w:szCs w:val="20"/>
+                <w:rtl/>
+              </w:rPr>
+              <w:t xml:space="preserve">إجابة متميزة: تفرّد نبيل بتحويل المهمّة من منتج مكتوب إلى تبرير شفوي، وتفرّدت سميرة بالجمع بين الاستعمال الشخصي والمنع عن الطالب.</w:t>
+            </w:r>
+          </w:p>
+        </w:tc>
+        <w:tc>
+          <w:tcPr>
+            <w:tcW w:type="dxa" w:w="2572"/>
+          </w:tcPr>
+          <w:p>
+            <w:pPr>
+              <w:bidi/>
+              <w:spacing w:after="40" w:before="40" w:line="240" w:lineRule="auto"/>
+              <w:jc w:val="right"/>
+            </w:pPr>
+            <w:r>
+              <w:rPr>
+                <w:rFonts w:ascii="Simplified Arabic" w:cs="Simplified Arabic" w:eastAsia="Simplified Arabic" w:hAnsi="Simplified Arabic"/>
+                <w:b w:val="false"/>
+                <w:sz w:val="20"/>
+                <w:szCs w:val="20"/>
+                <w:rtl/>
+              </w:rPr>
+              <w:t xml:space="preserve">• محمد: «مش المشكلة إنّي ما بعرف. المشكلة إنّه الشبكة بتفصل بنصّ الحصة وأنا واقف قدّام أربعين ولد».</w:t>
+            </w:r>
+          </w:p>
+          <w:p>
+            <w:pPr>
+              <w:bidi/>
+              <w:spacing w:after="40" w:before="40" w:line="240" w:lineRule="auto"/>
+              <w:jc w:val="right"/>
+            </w:pPr>
+            <w:r>
+              <w:rPr>
+                <w:rFonts w:ascii="Simplified Arabic" w:cs="Simplified Arabic" w:eastAsia="Simplified Arabic" w:hAnsi="Simplified Arabic"/>
+                <w:b w:val="false"/>
+                <w:sz w:val="20"/>
+                <w:szCs w:val="20"/>
+                <w:rtl/>
+              </w:rPr>
+              <w:t xml:space="preserve">• هدى: «بدّي أحضّر درس تفاعلي منيح؟ بدّه ساعتين.. الوقت مش موجود».</w:t>
+            </w:r>
+          </w:p>
+          <w:p>
+            <w:pPr>
+              <w:bidi/>
+              <w:spacing w:after="40" w:before="40" w:line="240" w:lineRule="auto"/>
+              <w:jc w:val="right"/>
+            </w:pPr>
+            <w:r>
+              <w:rPr>
+                <w:rFonts w:ascii="Simplified Arabic" w:cs="Simplified Arabic" w:eastAsia="Simplified Arabic" w:hAnsi="Simplified Arabic"/>
+                <w:b w:val="false"/>
+                <w:sz w:val="20"/>
+                <w:szCs w:val="20"/>
+                <w:rtl/>
+              </w:rPr>
+              <w:t xml:space="preserve">• نبيل: «بيجيبولنا حلقة استكمال ثلاث ساعات بآخر السنة.. أنا بدّي واحد بيفوت معي على الصفّ مرّة بالشهر».</w:t>
+            </w:r>
+          </w:p>
+          <w:p>
+            <w:pPr>
+              <w:bidi/>
+              <w:spacing w:after="40" w:before="40" w:line="240" w:lineRule="auto"/>
+              <w:jc w:val="right"/>
+            </w:pPr>
+            <w:r>
+              <w:rPr>
+                <w:rFonts w:ascii="Simplified Arabic" w:cs="Simplified Arabic" w:eastAsia="Simplified Arabic" w:hAnsi="Simplified Arabic"/>
+                <w:b w:val="false"/>
+                <w:sz w:val="20"/>
+                <w:szCs w:val="20"/>
+                <w:rtl/>
+              </w:rPr>
+              <w:t xml:space="preserve">• ريم: «بعرف إنّه نصّ الوظايف مكتوبة بالذكاء الاصطناعي. وبعرف إنّي ما بقدر أثبت. وما حدا بالمدرسة قال لنا شو المفروض نعمل».</w:t>
+            </w:r>
+          </w:p>
+          <w:p>
+            <w:pPr>
+              <w:bidi/>
+              <w:spacing w:after="40" w:before="40" w:line="240" w:lineRule="auto"/>
+              <w:jc w:val="right"/>
+            </w:pPr>
+            <w:r>
+              <w:rPr>
+                <w:rFonts w:ascii="Simplified Arabic" w:cs="Simplified Arabic" w:eastAsia="Simplified Arabic" w:hAnsi="Simplified Arabic"/>
+                <w:b w:val="false"/>
+                <w:sz w:val="20"/>
+                <w:szCs w:val="20"/>
+                <w:rtl/>
+              </w:rPr>
+              <w:t xml:space="preserve">• نبيل: «بطّلت أعطي وظيفة بيتية بترجع مكتوبة. صرت أعطي وظيفة بترجع محكية».</w:t>
+            </w:r>
+          </w:p>
+          <w:p>
+            <w:pPr>
+              <w:bidi/>
+              <w:spacing w:after="40" w:before="40" w:line="240" w:lineRule="auto"/>
+              <w:jc w:val="right"/>
+            </w:pPr>
+            <w:r>
+              <w:rPr>
+                <w:rFonts w:ascii="Simplified Arabic" w:cs="Simplified Arabic" w:eastAsia="Simplified Arabic" w:hAnsi="Simplified Arabic"/>
+                <w:b w:val="false"/>
+                <w:sz w:val="20"/>
+                <w:szCs w:val="20"/>
+                <w:rtl/>
+              </w:rPr>
+              <w:t xml:space="preserve">• سميرة: «أنا بستعمله أنا.. بس بمنعه عن الطالب لحدّ ما يتعلّم يكتب لحاله».</w:t>
+            </w:r>
+          </w:p>
+          <w:p>
+            <w:pPr>
+              <w:bidi/>
+              <w:spacing w:after="40" w:before="40" w:line="240" w:lineRule="auto"/>
+              <w:jc w:val="right"/>
+            </w:pPr>
+            <w:r>
+              <w:rPr>
+                <w:rFonts w:ascii="Simplified Arabic" w:cs="Simplified Arabic" w:eastAsia="Simplified Arabic" w:hAnsi="Simplified Arabic"/>
+                <w:b w:val="false"/>
+                <w:sz w:val="20"/>
+                <w:szCs w:val="20"/>
+                <w:rtl/>
+              </w:rPr>
+              <w:t xml:space="preserve">• خالد: «أنا ما بدّي أتسرّع. لما تنزل تعليمات واضحة من الوزارة بمشي فيها».</w:t>
+            </w:r>
+          </w:p>
+        </w:tc>
+      </w:tr>
+    </w:tbl>
+    <w:p>
+      <w:pPr>
+        <w:bidi/>
+        <w:spacing w:after="120" w:line="360" w:lineRule="auto"/>
+      </w:pPr>
     </w:p>
     <w:sectPr>
       <w:pgSz w:w="11906" w:h="16838" w:orient="portrait"/>

</xml_diff>

<commit_message>
Set Al-Qasemi branding on the technology seminar title page
Co-Authored-By: Claude Fable 5 <noreply@anthropic.com>
Claude-Session: https://claude.ai/code/session_01SLEdWJeTzqGJbSWTzfumWY
</commit_message>
<xml_diff>
--- a/seminar/سمينار - دور التكنولوجيا في تطوير أساليب التدريس.docx
+++ b/seminar/سمينار - دور التكنولوجيا في تطوير أساليب التدريس.docx
@@ -10,7 +10,7 @@
       <w:r>
         <w:drawing>
           <wp:inline distT="0" distB="0" distL="0" distR="0">
-            <wp:extent cx="1238250" cy="1238250"/>
+            <wp:extent cx="1285875" cy="1285875"/>
             <wp:effectExtent t="0" r="0" b="0" l="0"/>
             <wp:docPr id="1" name="" descr="" title=""/>
             <wp:cNvGraphicFramePr>
@@ -35,7 +35,7 @@
                   <pic:spPr bwMode="auto">
                     <a:xfrm>
                       <a:off x="0" y="0"/>
-                      <a:ext cx="1238250" cy="1238250"/>
+                      <a:ext cx="1285875" cy="1285875"/>
                     </a:xfrm>
                     <a:prstGeom prst="rect">
                       <a:avLst/>
@@ -59,11 +59,28 @@
           <w:rFonts w:ascii="Simplified Arabic" w:cs="Simplified Arabic" w:eastAsia="Simplified Arabic" w:hAnsi="Simplified Arabic"/>
           <w:b/>
           <w:bCs/>
-          <w:sz w:val="30"/>
-          <w:szCs w:val="30"/>
-          <w:rtl/>
-        </w:rPr>
-        <w:t xml:space="preserve">كلية تلبيوت الأكاديمية للتربية، حولون</w:t>
+          <w:sz w:val="32"/>
+          <w:szCs w:val="32"/>
+          <w:rtl/>
+        </w:rPr>
+        <w:t xml:space="preserve">أكاديمية القاسمي</w:t>
+      </w:r>
+    </w:p>
+    <w:p>
+      <w:pPr>
+        <w:bidi/>
+        <w:spacing w:after="120" w:line="360" w:lineRule="auto"/>
+        <w:jc w:val="center"/>
+      </w:pPr>
+      <w:r>
+        <w:rPr>
+          <w:rFonts w:ascii="Simplified Arabic" w:cs="Simplified Arabic" w:eastAsia="Simplified Arabic" w:hAnsi="Simplified Arabic"/>
+          <w:b w:val="false"/>
+          <w:sz w:val="28"/>
+          <w:szCs w:val="28"/>
+          <w:rtl/>
+        </w:rPr>
+        <w:t xml:space="preserve">كلية أكاديمية للتربية، باقة الغربية</w:t>
       </w:r>
     </w:p>
     <w:p>
@@ -5962,7 +5979,7 @@
           <w:szCs w:val="28"/>
           <w:rtl/>
         </w:rPr>
-        <w:t xml:space="preserve">حمدالله، ر. (2026). منهجية البحث الكيفي [شرائح محاضرة]. مساق سيمينار في التربية، كلية تلبيوت الأكاديمية للتربية.</w:t>
+        <w:t xml:space="preserve">حمدالله، ر. (2026). منهجية البحث الكيفي [شرائح محاضرة]. مساق سيمينار في التربية، أكاديمية القاسمي.</w:t>
       </w:r>
     </w:p>
     <w:p>

</xml_diff>